<commit_message>
publish source packages without oversized M4 data
</commit_message>
<xml_diff>
--- a/M2/M2_ready/Manuscript-CG_updated.docx
+++ b/M2/M2_ready/Manuscript-CG_updated.docx
@@ -1,6 +1,6 @@
 
 <file path=word/document.xml><?xml version="1.0" encoding="utf-8"?>
-<w:document xmlns:wpc="http://schemas.microsoft.com/office/word/2010/wordprocessingCanvas" xmlns:cx="http://schemas.microsoft.com/office/drawing/2014/chartex" xmlns:cx1="http://schemas.microsoft.com/office/drawing/2015/9/8/chartex" xmlns:cx2="http://schemas.microsoft.com/office/drawing/2015/10/21/chartex" xmlns:cx3="http://schemas.microsoft.com/office/drawing/2016/5/9/chartex" xmlns:cx4="http://schemas.microsoft.com/office/drawing/2016/5/10/chartex" xmlns:cx5="http://schemas.microsoft.com/office/drawing/2016/5/11/chartex" xmlns:cx6="http://schemas.microsoft.com/office/drawing/2016/5/12/chartex" xmlns:cx7="http://schemas.microsoft.com/office/drawing/2016/5/13/chartex" xmlns:cx8="http://schemas.microsoft.com/office/drawing/2016/5/14/chartex" xmlns:mc="http://schemas.openxmlformats.org/markup-compatibility/2006" xmlns:aink="http://schemas.microsoft.com/office/drawing/2016/ink" xmlns:am3d="http://schemas.microsoft.com/office/drawing/2017/model3d" xmlns:o="urn:schemas-microsoft-com:office:office" xmlns:oel="http://schemas.microsoft.com/office/2019/extlst" xmlns:r="http://schemas.openxmlformats.org/officeDocument/2006/relationships" xmlns:m="http://schemas.openxmlformats.org/officeDocument/2006/math" xmlns:v="urn:schemas-microsoft-com:vml" xmlns:wp14="http://schemas.microsoft.com/office/word/2010/wordprocessingDrawing" xmlns:wp="http://schemas.openxmlformats.org/drawingml/2006/wordprocessingDrawing" xmlns:w10="urn:schemas-microsoft-com:office:word" xmlns:w="http://schemas.openxmlformats.org/wordprocessingml/2006/main" xmlns:w14="http://schemas.microsoft.com/office/word/2010/wordml" xmlns:w15="http://schemas.microsoft.com/office/word/2012/wordml" xmlns:w16cex="http://schemas.microsoft.com/office/word/2018/wordml/cex" xmlns:w16cid="http://schemas.microsoft.com/office/word/2016/wordml/cid" xmlns:w16="http://schemas.microsoft.com/office/word/2018/wordml" xmlns:w16du="http://schemas.microsoft.com/office/word/2023/wordml/word16du" xmlns:w16sdtdh="http://schemas.microsoft.com/office/word/2020/wordml/sdtdatahash" xmlns:w16sdtfl="http://schemas.microsoft.com/office/word/2024/wordml/sdtformatlock" xmlns:w16se="http://schemas.microsoft.com/office/word/2015/wordml/symex" xmlns:wpg="http://schemas.microsoft.com/office/word/2010/wordprocessingGroup" xmlns:wpi="http://schemas.microsoft.com/office/word/2010/wordprocessingInk" xmlns:wne="http://schemas.microsoft.com/office/word/2006/wordml" xmlns:wps="http://schemas.microsoft.com/office/word/2010/wordprocessingShape" mc:Ignorable="w14 w15 w16se w16cid w16 w16cex w16sdtdh w16sdtfl w16du wp14">
+<w:document xmlns:wpc="http://schemas.microsoft.com/office/word/2010/wordprocessingCanvas" xmlns:cx="http://schemas.microsoft.com/office/drawing/2014/chartex" xmlns:cx1="http://schemas.microsoft.com/office/drawing/2015/9/8/chartex" xmlns:cx2="http://schemas.microsoft.com/office/drawing/2015/10/21/chartex" xmlns:cx3="http://schemas.microsoft.com/office/drawing/2016/5/9/chartex" xmlns:cx4="http://schemas.microsoft.com/office/drawing/2016/5/10/chartex" xmlns:cx5="http://schemas.microsoft.com/office/drawing/2016/5/11/chartex" xmlns:cx6="http://schemas.microsoft.com/office/drawing/2016/5/12/chartex" xmlns:cx7="http://schemas.microsoft.com/office/drawing/2016/5/13/chartex" xmlns:cx8="http://schemas.microsoft.com/office/drawing/2016/5/14/chartex" xmlns:mc="http://schemas.openxmlformats.org/markup-compatibility/2006" xmlns:aink="http://schemas.microsoft.com/office/drawing/2016/ink" xmlns:am3d="http://schemas.microsoft.com/office/drawing/2017/model3d" xmlns:o="urn:schemas-microsoft-com:office:office" xmlns:oel="http://schemas.microsoft.com/office/2019/extlst" xmlns:r="http://schemas.openxmlformats.org/officeDocument/2006/relationships" xmlns:m="http://schemas.openxmlformats.org/officeDocument/2006/math" xmlns:v="urn:schemas-microsoft-com:vml" xmlns:wp14="http://schemas.microsoft.com/office/word/2010/wordprocessingDrawing" xmlns:wp="http://schemas.openxmlformats.org/drawingml/2006/wordprocessingDrawing" xmlns:w10="urn:schemas-microsoft-com:office:word" xmlns:w="http://schemas.openxmlformats.org/wordprocessingml/2006/main" xmlns:w14="http://schemas.microsoft.com/office/word/2010/wordml" xmlns:w15="http://schemas.microsoft.com/office/word/2012/wordml" xmlns:w16cei="http://schemas.microsoft.com/office/word/2026/wordml/cei" xmlns:w16cex="http://schemas.microsoft.com/office/word/2018/wordml/cex" xmlns:w16cid="http://schemas.microsoft.com/office/word/2016/wordml/cid" xmlns:w16="http://schemas.microsoft.com/office/word/2018/wordml" xmlns:w16du="http://schemas.microsoft.com/office/word/2023/wordml/word16du" xmlns:w16sdtdh="http://schemas.microsoft.com/office/word/2020/wordml/sdtdatahash" xmlns:w16sdtfl="http://schemas.microsoft.com/office/word/2024/wordml/sdtformatlock" xmlns:w16se="http://schemas.microsoft.com/office/word/2015/wordml/symex" xmlns:wpg="http://schemas.microsoft.com/office/word/2010/wordprocessingGroup" xmlns:wpi="http://schemas.microsoft.com/office/word/2010/wordprocessingInk" xmlns:wne="http://schemas.microsoft.com/office/word/2006/wordml" xmlns:wps="http://schemas.microsoft.com/office/word/2010/wordprocessingShape" mc:Ignorable="w14 w15 w16se w16cid w16 w16cex w16sdtdh w16sdtfl w16du wp14">
   <w:body>
     <w:p>
       <w:pPr>
@@ -93,6 +93,7 @@
         <w:t xml:space="preserve">Ebenezer Aquisman </w:t>
       </w:r>
       <w:proofErr w:type="spellStart"/>
+      <w:proofErr w:type="gramStart"/>
       <w:r>
         <w:t>Asare</w:t>
       </w:r>
@@ -119,7 +120,11 @@
         <w:t xml:space="preserve"> </w:t>
       </w:r>
       <w:r>
-        <w:t>Dickson Adomako</w:t>
+        <w:t>Dickson</w:t>
+      </w:r>
+      <w:proofErr w:type="gramEnd"/>
+      <w:r>
+        <w:t xml:space="preserve"> Adomako</w:t>
       </w:r>
       <w:r>
         <w:rPr>
@@ -153,6 +158,7 @@
         <w:t xml:space="preserve">, Samuel </w:t>
       </w:r>
       <w:proofErr w:type="spellStart"/>
+      <w:proofErr w:type="gramStart"/>
       <w:r>
         <w:t>Ganyaglo</w:t>
       </w:r>
@@ -163,6 +169,7 @@
         <w:t>a,d</w:t>
       </w:r>
       <w:proofErr w:type="spellEnd"/>
+      <w:proofErr w:type="gramEnd"/>
       <w:r>
         <w:t xml:space="preserve">,  </w:t>
       </w:r>
@@ -452,7 +459,39 @@
     </w:p>
     <w:p>
       <w:r>
-        <w:t>Groundwater quality in data-limited aquifers is governed by the interplay of residence time, flow-path connectivity, and geochemical reactions, yet existing tools address these dimensions separately. This study introduces Hydrosheaf, a Python-based framework that couples residence-time inversion, directed graph-topology inference and sparse inverse hydrogeochemical modelling in one workflow. Sheaf-style consistency refinement scores candidate edges against hydraulic, isotopic and chemical evidence; network-enhanced Bayesian inference propagates graph constraints into age uncertainty; and L1-regularised reaction fitting uses PHREEQC-compatible logic gates to rank chemically feasible solutions. Across 100 locked synthetic realisations, median transport-parameter absolute error was 0.056 and median reaction-extent error was 0.050 mmol/L; active-reaction recovery in the refreshed figure was R2 = 0.57 (MAE = 0.33 mmol/L), with 32.7% of inactive terms exceeding the 0.05 mmol/L leakage threshold. No-prior topology recovery against MODPATH gave F1 = 0.618 (precision 0.487, recall 0.845), whereas the prior-assisted mode reproduced the reference edges exactly, as expected for a conditioning-prior test. Synthetic network-age recovery gave log-space R2 = 0.98 and MAE = 183.3 years. The independent public-age comparison was screening-level parity with reported USGS model outputs (n = 1,249 finite log errors; R2 = 0.71; median absolute log10 error = 0.17; 61.4% within a factor of two), not true-age validation. A deterministic PHREEQC-compatible mass-balance proxy marked 89.1% of edges thermodynamically feasible; live PHREEQC execution remains pending. The Northern Ghana demonstration generated 208 edges with overall chemistry R2 = 0.711 (Lower Anayari median 0.60; Talensi median 0.77) but no independent process-truth labels. Hydrosheaf therefore provides an auditable, evidence-tiered workflow for process diagnosis where calibrated numerical models are unavailable, while retaining explicit identifiability and transferability limits.</w:t>
+        <w:t xml:space="preserve">Groundwater quality in data-limited aquifers is governed by the interplay of residence time, flow-path connectivity, and geochemical reactions, yet existing tools address these dimensions separately. This study introduces </w:t>
+      </w:r>
+      <w:proofErr w:type="spellStart"/>
+      <w:r>
+        <w:t>Hydrosheaf</w:t>
+      </w:r>
+      <w:proofErr w:type="spellEnd"/>
+      <w:r>
+        <w:t xml:space="preserve">, a Python-based framework that </w:t>
+      </w:r>
+      <w:proofErr w:type="gramStart"/>
+      <w:r>
+        <w:t>couples</w:t>
+      </w:r>
+      <w:proofErr w:type="gramEnd"/>
+      <w:r>
+        <w:t xml:space="preserve"> residence-time inversion, directed graph-topology inference and sparse inverse hydrogeochemical modelling in one workflow. Sheaf-style consistency refinement scores candidate edges against hydraulic, isotopic and chemical evidence; network-enhanced Bayesian inference propagates graph constraints into age uncertainty; and L1-regularised reaction fitting uses PHREEQC-compatible logic gates to rank chemically feasible solutions. Across 100 locked synthetic realisations, median transport-parameter absolute error was 0.056 and median reaction-extent error was 0.050 mmol/L; active-reaction recovery in the refreshed figure was R2 = 0.57 (MAE = 0.33 mmol/L), with 32.7% of inactive terms exceeding the 0.05 mmol/L leakage threshold. No-prior topology recovery against MODPATH gave F1 = 0.618 (precision 0.487, recall 0.845), whereas the prior-assisted mode reproduced the reference edges exactly, as expected for a conditioning-prior test. Synthetic network-age recovery gave log-space R2 = 0.98 and MAE = 183.3 years. The independent public-age comparison was screening-level parity with reported USGS model outputs (n = 1,249 finite log errors; R2 = 0.71; median absolute log10 error = 0.17; 61.4% within a factor of two), not true-age validation. A deterministic PHREEQC-compatible mass-balance proxy marked 89.1% of edges thermodynamically feasible; live PHREEQC execution remains pending. The Northern Ghana demonstration generated 208 edges with overall chemistry R2 = 0.711 (Lower Anayari median 0.60; </w:t>
+      </w:r>
+      <w:proofErr w:type="spellStart"/>
+      <w:r>
+        <w:t>Talensi</w:t>
+      </w:r>
+      <w:proofErr w:type="spellEnd"/>
+      <w:r>
+        <w:t xml:space="preserve"> median 0.77) but no independent process-truth labels. </w:t>
+      </w:r>
+      <w:proofErr w:type="spellStart"/>
+      <w:r>
+        <w:t>Hydrosheaf</w:t>
+      </w:r>
+      <w:proofErr w:type="spellEnd"/>
+      <w:r>
+        <w:t xml:space="preserve"> therefore provides an auditable, evidence-tiered workflow for process diagnosis where calibrated numerical models are unavailable, while retaining explicit identifiability and transferability limits.</w:t>
       </w:r>
     </w:p>
     <w:p/>
@@ -588,7 +627,15 @@
         <w:t>,</w:t>
       </w:r>
       <w:r>
-        <w:t xml:space="preserve"> can produce intermediate chemistry, yielding an apparent LPM age that reflects neither end-member correctly, as documented in the Belgian Neogene aquifer (Casillas-Trasvina et al., 2022), fault-connected Algerian systems (Ghiglieri et al., 202</w:t>
+        <w:t xml:space="preserve"> can produce intermediate chemistry, yielding an apparent LPM age that reflects neither </w:t>
+      </w:r>
+      <w:proofErr w:type="gramStart"/>
+      <w:r>
+        <w:t>end-member</w:t>
+      </w:r>
+      <w:proofErr w:type="gramEnd"/>
+      <w:r>
+        <w:t xml:space="preserve"> correctly, as documented in the Belgian Neogene aquifer (Casillas-Trasvina et al., 2022), fault-connected Algerian systems (Ghiglieri et al., 202</w:t>
       </w:r>
       <w:r>
         <w:t>1</w:t>
@@ -619,7 +666,15 @@
     </w:p>
     <w:p>
       <w:r>
-        <w:t xml:space="preserve">Residence-time estimation by lumped-parameter modelling addresses the temporal dimension but introduces its own interpretive limitations. Single-tracer inversion conflates mean residence time with the shape of the transit-time distribution and tracer input function uncertainty (Ma et al., 2019; Rädle et al., 2022). When multiple tracers disagree, as is common in mixed-age systems, the analyst must choose between competing age models without a formal arbitration framework (Casillas-Trasvina et al., 2022). In heterogeneous hard-rock aquifers, nearby wells can sample entirely different hydraulic domains whose age and chemistry patterns are only interpretable when aquifer architecture is considered (Comte et al., 2018; Cao et al., 2020). </w:t>
+        <w:t xml:space="preserve">Residence-time estimation by lumped-parameter modelling addresses the temporal dimension but introduces its own interpretive limitations. Single-tracer inversion conflates mean residence time with the shape of the transit-time distribution and tracer input function uncertainty (Ma et al., 2019; </w:t>
+      </w:r>
+      <w:proofErr w:type="spellStart"/>
+      <w:r>
+        <w:t>Rädle</w:t>
+      </w:r>
+      <w:proofErr w:type="spellEnd"/>
+      <w:r>
+        <w:t xml:space="preserve"> et al., 2022). When multiple tracers disagree, as is common in mixed-age systems, the analyst must choose between competing age models without a formal arbitration framework (Casillas-Trasvina et al., 2022). In heterogeneous hard-rock aquifers, nearby wells can sample entirely different hydraulic domains whose age and chemistry patterns are only interpretable when aquifer architecture is considered (Comte et al., 2018; Cao et al., 2020). </w:t>
       </w:r>
       <w:r>
         <w:lastRenderedPageBreak/>
@@ -660,7 +715,15 @@
         <w:t xml:space="preserve"> </w:t>
       </w:r>
       <w:r>
-        <w:t>The same Ca-HCO₃ water type, for instance, may be produced by carbonate dissolution, silicate weathering with CO₂ uptake, mixing with Ca-rich end-members, ion exchange, or combinations of these processes (Roy et al., 2020; Li et al., 2018)</w:t>
+        <w:t xml:space="preserve">The same Ca-HCO₃ water type, for instance, may be produced by carbonate dissolution, silicate weathering with CO₂ uptake, mixing with Ca-rich </w:t>
+      </w:r>
+      <w:proofErr w:type="gramStart"/>
+      <w:r>
+        <w:t>end-members</w:t>
+      </w:r>
+      <w:proofErr w:type="gramEnd"/>
+      <w:r>
+        <w:t>, ion exchange, or combinations of these processes (Roy et al., 2020; Li et al., 2018)</w:t>
       </w:r>
       <w:r>
         <w:t>. Dissolution, precipitation, and exchange reactions can offset each other</w:t>
@@ -718,13 +781,21 @@
     </w:p>
     <w:p>
       <w:r>
-        <w:t>The problem is compounded by uncertainty in the flow-path assumption itself. If the analyst incorrectly pairs wells that are not hydraulically connected, the inferred reaction extents are artefacts rather than records of genuine geochemical evolution (Manu et al., 2023; Teeple et al., 2021). Seltzer et al. (2021) further showed that anthropogenic carbonate inputs can distort ¹⁴C-based age estimates by thousands of years, illustrating how geochemical-model uncertainty propagates directly into age estimates and thence into assessments of groundwater renewability. In sparse field campaigns typical of data-limited regions</w:t>
+        <w:t xml:space="preserve">The problem is compounded by uncertainty in the flow-path assumption itself. If the analyst incorrectly pairs wells that are not hydraulically connected, the inferred reaction extents are artefacts rather than records of genuine geochemical evolution (Manu et al., 2023; Teeple et al., 2021). Seltzer et al. (2021) further showed that anthropogenic carbonate inputs can distort ¹⁴C-based age estimates by thousands of years, illustrating how geochemical-model uncertainty propagates directly into age estimates and thence into assessments of groundwater renewability. In sparse field campaigns typical of data-limited </w:t>
+      </w:r>
+      <w:proofErr w:type="gramStart"/>
+      <w:r>
+        <w:t>regions</w:t>
       </w:r>
       <w:r>
         <w:t xml:space="preserve">, </w:t>
       </w:r>
       <w:r>
-        <w:t xml:space="preserve"> incomplete monitoring networks, partial ion records, rare tracer data</w:t>
+        <w:t xml:space="preserve"> incomplete</w:t>
+      </w:r>
+      <w:proofErr w:type="gramEnd"/>
+      <w:r>
+        <w:t xml:space="preserve"> monitoring networks, partial ion records, rare tracer data</w:t>
       </w:r>
       <w:r>
         <w:t>,</w:t>
@@ -870,78 +941,6 @@
       <w:r>
         <w:t>Four methodological contributions are advanced. First, sheaf-style consistency refinement combines hydraulic, isotopic and chemical evidence to score directed-edge plausibility. Second, network-enhanced Bayesian age inference uses graph structure to narrow posterior uncertainty and evaluate age-order consistency; the resulting uncertainty reduction is a model property and should not be interpreted as a universal improvement in reference-age accuracy. Third, sparse L1-regularised reaction fitting with thermodynamic logic gates and geological-bias penalties ranks parsimonious candidate process classes while retaining non-uniqueness where the ion data are insufficient. Fourth, a process-stability index (PSI) quantifies how often reaction terms recur across Monte Carlo perturbations, distinguishing stable signals from data-contingent attributions.</w:t>
       </w:r>
-      <m:oMath>
-        <m:r>
-          <w:rPr>
-            <w:rFonts w:ascii="Cambria Math" w:hAnsi="Cambria Math"/>
-          </w:rPr>
-          <m:t>1</m:t>
-        </m:r>
-        <m:r>
-          <m:rPr>
-            <m:lit/>
-          </m:rPr>
-          <w:rPr>
-            <w:rFonts w:ascii="Cambria Math" w:hAnsi="Cambria Math"/>
-          </w:rPr>
-          <m:t>/</m:t>
-        </m:r>
-        <m:rad>
-          <m:radPr>
-            <m:degHide m:val="1"/>
-            <m:ctrlPr>
-              <w:rPr>
-                <w:rFonts w:ascii="Cambria Math" w:hAnsi="Cambria Math"/>
-              </w:rPr>
-            </m:ctrlPr>
-          </m:radPr>
-          <m:deg>
-            <m:ctrlPr>
-              <w:rPr>
-                <w:rFonts w:ascii="Cambria Math" w:hAnsi="Cambria Math"/>
-                <w:i/>
-              </w:rPr>
-            </m:ctrlPr>
-          </m:deg>
-          <m:e>
-            <m:sSub>
-              <m:sSubPr>
-                <m:ctrlPr>
-                  <w:rPr>
-                    <w:rFonts w:ascii="Cambria Math" w:hAnsi="Cambria Math"/>
-                    <w:i/>
-                  </w:rPr>
-                </m:ctrlPr>
-              </m:sSubPr>
-              <m:e>
-                <m:r>
-                  <w:rPr>
-                    <w:rFonts w:ascii="Cambria Math" w:hAnsi="Cambria Math"/>
-                  </w:rPr>
-                  <m:t>n</m:t>
-                </m:r>
-              </m:e>
-              <m:sub>
-                <m:r>
-                  <m:rPr>
-                    <m:nor/>
-                  </m:rPr>
-                  <w:rPr>
-                    <w:rFonts w:ascii="Cambria Math" w:hAnsi="Cambria Math"/>
-                  </w:rPr>
-                  <m:t>in</m:t>
-                </m:r>
-              </m:sub>
-            </m:sSub>
-            <m:r>
-              <w:rPr>
-                <w:rFonts w:ascii="Cambria Math" w:hAnsi="Cambria Math"/>
-              </w:rPr>
-              <m:t>+1</m:t>
-            </m:r>
-          </m:e>
-        </m:rad>
-      </m:oMath>
     </w:p>
     <w:p>
       <w:r>
@@ -1962,13 +1961,21 @@
         <w:t xml:space="preserve">that </w:t>
       </w:r>
       <w:r>
-        <w:t>inspects the sample set at run-time and disables modules whose minimum field requirements are unmet</w:t>
+        <w:t xml:space="preserve">inspects the sample set at run-time and disables modules whose minimum field requirements are </w:t>
+      </w:r>
+      <w:proofErr w:type="gramStart"/>
+      <w:r>
+        <w:t>unmet</w:t>
       </w:r>
       <w:r>
         <w:t xml:space="preserve">, </w:t>
       </w:r>
       <w:r>
-        <w:t xml:space="preserve"> for example, deactivating the nuclear tracer module when neither ³H nor ¹⁴C values are present in any sample. This automatic graceful degradation is essential for African basement and semi-arid aquifer datasets where isotope or tracer records are frequently sparse or absent, and it ensures that partial datasets do not halt execution or produce spurious outputs arising from imputed tracer values.</w:t>
+        <w:t xml:space="preserve"> for</w:t>
+      </w:r>
+      <w:proofErr w:type="gramEnd"/>
+      <w:r>
+        <w:t xml:space="preserve"> example, deactivating the nuclear tracer module when neither ³H nor ¹⁴C values are present in any sample. This automatic graceful degradation is essential for African basement and semi-arid aquifer datasets where isotope or tracer records are frequently sparse or absent, and it ensures that partial datasets do not halt execution or produce spurious outputs arising from imputed tracer values.</w:t>
       </w:r>
     </w:p>
     <w:p>
@@ -4503,7 +4510,15 @@
         </m:r>
       </m:oMath>
       <w:r>
-        <w:t>), 0.40 to sodium, 0.15 to bicarbonate, and 0.01–0.02 to all other ions, reflecting the relative conservativeness of these species in crystalline and alluvial aquifer settings where chloride is the most reliable mixing tracer in the absence of halite dissolution (Hydrosheaf config.py, conservative_weights). Ion-balance constraints are enforced implicitly through charge-balance screening and through the non-negativity constraint on reaction extents, which prevents the generation of physically unrealistic negative dissolution rates except where bidirectional reactions are explicitly enabled.</w:t>
+        <w:t>), 0.40 to sodium, 0.15 to bicarbonate, and 0.01–0.02 to all other ions, reflecting the relative conservativeness of these species in crystalline and alluvial aquifer settings where chloride is the most reliable mixing tracer in the absence of halite dissolution (Hydrosheaf config.py, conservative_weights). Ion-balance constraints are enforced implicitly through charge-balance screening and through the non-negativity constraint on reaction extents, which prevents the generation of physically unrealistic neg</w:t>
+      </w:r>
+      <w:proofErr w:type="spellStart"/>
+      <w:r>
+        <w:t>ative</w:t>
+      </w:r>
+      <w:proofErr w:type="spellEnd"/>
+      <w:r>
+        <w:t xml:space="preserve"> dissolution rates except where bidirectional reactions are explicitly enabled.</w:t>
       </w:r>
     </w:p>
     <w:p>
@@ -6183,7 +6198,15 @@
         </m:r>
       </m:oMath>
       <w:r>
-        <w:t xml:space="preserve">), reflecting that supersaturated minerals are unlikely to dissolve and their inclusion would generate spurious positive extents. Concentration logic gates impose additional geochemical constraints: pyrite and gypsum are suppressed when SO₄ &lt; 0.208 mmol/L (20 mg/L); halite and sylvite when Cl &lt; 0.564 mmol/L (20 mg/L); and fluorite when F &lt; 0.026 mmol/L (0.5 mg/L) (Table S2). In the crystalline geologic-bias mode, the gypsum penalty is escalated to effectively exclude it when SO₄ &gt; 0.52 mmol/L, enforcing attribution of sulphate to pyrite oxidation in basement aquifer contexts. PHREEQC is interfaced via the </w:t>
+        <w:t>), reflecting that supersaturated minerals are unlikely to dissolve and their inclusion would generate spurious positive extents. Concentration logic gates impose additional geochemical constraints: pyrite and gypsum are suppressed when SO₄ &lt; 0.208 mmol/L (20 mg/L); halite and sylvite when Cl &lt; 0.564 mmol/L (20 mg/L); and fluorite when F &lt; 0.026 mmol/L (0.5 mg/L) (Table S2). In the crystalline geologic-bias mode, the gypsum penalty is escalated to effectively exclude it when SO₄ &gt; 0.52 mmol/L, enforcing att</w:t>
+      </w:r>
+      <w:proofErr w:type="spellStart"/>
+      <w:r>
+        <w:t>ribution</w:t>
+      </w:r>
+      <w:proofErr w:type="spellEnd"/>
+      <w:r>
+        <w:t xml:space="preserve"> of sulphate to pyrite oxidation in basement aquifer contexts. PHREEQC is interfaced via the </w:t>
       </w:r>
       <w:proofErr w:type="spellStart"/>
       <w:r>
@@ -6792,53 +6815,17 @@
     </w:p>
     <w:p>
       <w:r>
-        <w:t>A controlled synthetic benchmark evaluated recovery of known transport parameters and reaction extents from noisy chemistry data. The benchmark used a ground-truth YAML configuration specifying source chemistry, stable-isotope values, a directed generation network, and true evaporation, mixing and reaction parameters. Sequentially generated downstream vectors were perturbed with multiplicative Gaussian noise. One hundred stochastic realisations were generated per experiment, with complete-ion, ion-incomplete and head-absent scenarios and full, sparse and heuristic-only topologies. Performance was quantified using the displayed transport and reaction recovery diagnostics, chemistry R2, absolute error and noise-aware isotope metrics (Figure 3; Table 2).</w:t>
-      </w:r>
-      <m:oMath>
-        <m:sSub>
-          <m:sSubPr>
-            <m:ctrlPr>
-              <w:rPr>
-                <w:rFonts w:ascii="Cambria Math" w:hAnsi="Cambria Math"/>
-                <w:i/>
-              </w:rPr>
-            </m:ctrlPr>
-          </m:sSubPr>
-          <m:e>
-            <m:r>
-              <m:rPr>
-                <m:sty m:val="p"/>
-              </m:rPr>
-              <w:rPr>
-                <w:rFonts w:ascii="Cambria Math" w:hAnsi="Cambria Math"/>
-              </w:rPr>
-              <m:t>σ</m:t>
-            </m:r>
-            <m:ctrlPr>
-              <w:rPr>
-                <w:rFonts w:ascii="Cambria Math" w:hAnsi="Cambria Math"/>
-              </w:rPr>
-            </m:ctrlPr>
-          </m:e>
-          <m:sub>
-            <m:r>
-              <m:rPr>
-                <m:nor/>
-              </m:rPr>
-              <w:rPr>
-                <w:rFonts w:ascii="Cambria Math" w:hAnsi="Cambria Math"/>
-              </w:rPr>
-              <m:t>rel</m:t>
-            </m:r>
-          </m:sub>
-        </m:sSub>
-        <m:r>
-          <w:rPr>
-            <w:rFonts w:ascii="Cambria Math" w:hAnsi="Cambria Math"/>
-          </w:rPr>
-          <m:t>=5</m:t>
-        </m:r>
-      </m:oMath>
+        <w:t>A controlled synthetic benchmark evaluated recovery of known transport parameters and reaction extents from noisy chemistry data. The benchmark used a ground-truth YAML configuration specifying source chemistry, stable-isotope values, a directed generation network, and true evaporation, mixing and reaction parameters. Sequentially generated downstream vectors were perturbed with multiplicative Gaussian noise. One hundred stochastic realisations were generated per experiment, with complete-ion, ion-incomplete and head-absent scenarios and full, sparse and heuristic-only topologies. Performance was quantified using the displayed transport and reaction recovery diagnostics, chemistry R</w:t>
+      </w:r>
+      <w:r>
+        <w:rPr>
+          <w:vertAlign w:val="superscript"/>
+        </w:rPr>
+        <w:t>2</w:t>
+      </w:r>
+      <w:r>
+        <w:t>, absolute error and noise-aware isotope metrics (Figure 3; Table 2).</w:t>
+      </w:r>
     </w:p>
     <w:p>
       <w:pPr>
@@ -6857,7 +6844,23 @@
     </w:p>
     <w:p>
       <w:r>
-        <w:t>The topology-validation benchmark evaluated Hydrosheaf against directed connectivity extracted from MODPATH particle endpoints and pathlines. Three operational modes were separated: prior-assisted conditioning, no-prior inference from spatial/elevational/head-proxy evidence, and threshold sensitivity. True-positive, false-positive and false-negative edges were tabulated to compute precision, recall and F1. This separation prevents circular interpretation of MODPATH priors as independent evidence and restricts the claim to topology conversion and recovery.</w:t>
+        <w:t xml:space="preserve">The topology-validation benchmark evaluated </w:t>
+      </w:r>
+      <w:proofErr w:type="spellStart"/>
+      <w:r>
+        <w:t>Hydrosheaf</w:t>
+      </w:r>
+      <w:proofErr w:type="spellEnd"/>
+      <w:r>
+        <w:t xml:space="preserve"> against directed connectivity extracted from MODPATH particle endpoints and </w:t>
+      </w:r>
+      <w:proofErr w:type="spellStart"/>
+      <w:r>
+        <w:t>pathlines</w:t>
+      </w:r>
+      <w:proofErr w:type="spellEnd"/>
+      <w:r>
+        <w:t>. Three operational modes were separated: prior-assisted conditioning, no-prior inference from spatial/elevational/head-proxy evidence, and threshold sensitivity. True-positive, false-positive and false-negative edges were tabulated to compute precision, recall and F1. This separation prevents circular interpretation of MODPATH priors as independent evidence and restricts the claim to topology conversion and recovery.</w:t>
       </w:r>
     </w:p>
     <w:p>
@@ -7431,7 +7434,21 @@
           <w:color w:val="EE0000"/>
         </w:rPr>
         <w:lastRenderedPageBreak/>
-        <w:t>A complementary metric suite was used across the five evidence tiers. Precision, recall and F1 quantified topology; chemistry R2, RMSE and NSE quantified synthetic and forward-proxy fit; AICc assessed regularisation parsimony; Kendall tau assessed downstream age ordering; and PSI quantified process recurrence across Monte Carlo perturbations. Public-age parity was reported in log10-error and within-factor metrics because the USGS targets are model-derived ages and age fractions rather than direct true ages.</w:t>
+        <w:t xml:space="preserve">A complementary metric suite was used across the five evidence tiers. Precision, recall and F1 quantified topology; chemistry R2, RMSE and NSE quantified synthetic and forward-proxy fit; </w:t>
+      </w:r>
+      <w:proofErr w:type="spellStart"/>
+      <w:r>
+        <w:rPr>
+          <w:color w:val="EE0000"/>
+        </w:rPr>
+        <w:t>AICc</w:t>
+      </w:r>
+      <w:proofErr w:type="spellEnd"/>
+      <w:r>
+        <w:rPr>
+          <w:color w:val="EE0000"/>
+        </w:rPr>
+        <w:t xml:space="preserve"> assessed regularisation parsimony; Kendall tau assessed downstream age ordering; and PSI quantified process recurrence across Monte Carlo perturbations. Public-age parity was reported in log10-error and within-factor metrics because the USGS targets are model-derived ages and age fractions rather than direct true ages.</w:t>
       </w:r>
     </w:p>
     <w:p>
@@ -8079,7 +8096,15 @@
         </m:d>
       </m:oMath>
       <w:r>
-        <w:t xml:space="preserve"> across Monte Carlo realisations (Figure 7; Table 6). These metrics collectively cover connectivity accuracy (F1), chemical mass-balance accuracy (R², RMSE, NSE), model parsimony (AICc), temporal-order consistency (Kendall </w:t>
+        <w:t xml:space="preserve"> across Monte Carlo realisations (Figure 7; Table 6). These metrics collectively cover connectivity accuracy (F1), chemical mass-balance accuracy (R², RMSE, NSE), model parsimony (</w:t>
+      </w:r>
+      <w:proofErr w:type="spellStart"/>
+      <w:r>
+        <w:t>AICc</w:t>
+      </w:r>
+      <w:proofErr w:type="spellEnd"/>
+      <w:r>
+        <w:t xml:space="preserve">), temporal-order consistency (Kendall </w:t>
       </w:r>
       <m:oMath>
         <m:r>
@@ -8291,149 +8316,6 @@
       <w:r>
         <w:t>The nuclear-tracer module produced single-node MRT estimates for benchmark nodes with tracer data and network-enhanced Bayesian MRTs for nodes with non-zero in-degree. Network posterior interval widths were 52% narrower than the single-node intervals in this benchmark, by construction of the conjugate-updating model; this is an uncertainty-partitioning result, not an independent demonstration of lower reference-age error.</w:t>
       </w:r>
-      <m:oMath>
-        <m:sSub>
-          <m:sSubPr>
-            <m:ctrlPr>
-              <w:rPr>
-                <w:rFonts w:ascii="Cambria Math" w:hAnsi="Cambria Math"/>
-                <w:i/>
-              </w:rPr>
-            </m:ctrlPr>
-          </m:sSubPr>
-          <m:e>
-            <m:r>
-              <m:rPr>
-                <m:sty m:val="p"/>
-              </m:rPr>
-              <w:rPr>
-                <w:rFonts w:ascii="Cambria Math" w:hAnsi="Cambria Math"/>
-              </w:rPr>
-              <m:t>σ</m:t>
-            </m:r>
-            <m:ctrlPr>
-              <w:rPr>
-                <w:rFonts w:ascii="Cambria Math" w:hAnsi="Cambria Math"/>
-              </w:rPr>
-            </m:ctrlPr>
-          </m:e>
-          <m:sub>
-            <m:r>
-              <m:rPr>
-                <m:nor/>
-              </m:rPr>
-              <w:rPr>
-                <w:rFonts w:ascii="Cambria Math" w:hAnsi="Cambria Math"/>
-              </w:rPr>
-              <m:t>net</m:t>
-            </m:r>
-          </m:sub>
-        </m:sSub>
-        <m:sSub>
-          <m:sSubPr>
-            <m:ctrlPr>
-              <w:rPr>
-                <w:rFonts w:ascii="Cambria Math" w:hAnsi="Cambria Math"/>
-                <w:i/>
-              </w:rPr>
-            </m:ctrlPr>
-          </m:sSubPr>
-          <m:e>
-            <m:r>
-              <m:rPr>
-                <m:sty m:val="p"/>
-              </m:rPr>
-              <w:rPr>
-                <w:rFonts w:ascii="Cambria Math" w:hAnsi="Cambria Math"/>
-              </w:rPr>
-              <m:t>σ</m:t>
-            </m:r>
-            <m:ctrlPr>
-              <w:rPr>
-                <w:rFonts w:ascii="Cambria Math" w:hAnsi="Cambria Math"/>
-              </w:rPr>
-            </m:ctrlPr>
-          </m:e>
-          <m:sub>
-            <m:r>
-              <w:rPr>
-                <w:rFonts w:ascii="Cambria Math" w:hAnsi="Cambria Math"/>
-              </w:rPr>
-              <m:t>0</m:t>
-            </m:r>
-          </m:sub>
-        </m:sSub>
-        <m:r>
-          <w:rPr>
-            <w:rFonts w:ascii="Cambria Math" w:hAnsi="Cambria Math"/>
-          </w:rPr>
-          <m:t>=0.351</m:t>
-        </m:r>
-        <m:r>
-          <m:rPr>
-            <m:lit/>
-          </m:rPr>
-          <w:rPr>
-            <w:rFonts w:ascii="Cambria Math" w:hAnsi="Cambria Math"/>
-          </w:rPr>
-          <m:t>/</m:t>
-        </m:r>
-        <m:rad>
-          <m:radPr>
-            <m:degHide m:val="1"/>
-            <m:ctrlPr>
-              <w:rPr>
-                <w:rFonts w:ascii="Cambria Math" w:hAnsi="Cambria Math"/>
-              </w:rPr>
-            </m:ctrlPr>
-          </m:radPr>
-          <m:deg>
-            <m:ctrlPr>
-              <w:rPr>
-                <w:rFonts w:ascii="Cambria Math" w:hAnsi="Cambria Math"/>
-                <w:i/>
-              </w:rPr>
-            </m:ctrlPr>
-          </m:deg>
-          <m:e>
-            <m:sSub>
-              <m:sSubPr>
-                <m:ctrlPr>
-                  <w:rPr>
-                    <w:rFonts w:ascii="Cambria Math" w:hAnsi="Cambria Math"/>
-                    <w:i/>
-                  </w:rPr>
-                </m:ctrlPr>
-              </m:sSubPr>
-              <m:e>
-                <m:r>
-                  <w:rPr>
-                    <w:rFonts w:ascii="Cambria Math" w:hAnsi="Cambria Math"/>
-                  </w:rPr>
-                  <m:t>n</m:t>
-                </m:r>
-              </m:e>
-              <m:sub>
-                <m:r>
-                  <m:rPr>
-                    <m:nor/>
-                  </m:rPr>
-                  <w:rPr>
-                    <w:rFonts w:ascii="Cambria Math" w:hAnsi="Cambria Math"/>
-                  </w:rPr>
-                  <m:t>in</m:t>
-                </m:r>
-              </m:sub>
-            </m:sSub>
-            <m:r>
-              <w:rPr>
-                <w:rFonts w:ascii="Cambria Math" w:hAnsi="Cambria Math"/>
-              </w:rPr>
-              <m:t>+1</m:t>
-            </m:r>
-          </m:e>
-        </m:rad>
-      </m:oMath>
     </w:p>
     <w:p>
       <w:r>
@@ -8534,7 +8416,15 @@
       </w:r>
       <w:r>
         <w:lastRenderedPageBreak/>
-        <w:t>exceeded 0.05 mmol/L. The leakage was concentrated in chemically compensating terms, especially inactive albite and CaNa-exchange terms, and therefore represents sparse-recovery ambiguity rather than confident mineral identification. Reaction extents should consequently be reported as identifiability classes or ranked candidate processes, not unique phase histories.</w:t>
+        <w:t xml:space="preserve">exceeded 0.05 mmol/L. The leakage was concentrated in chemically compensating terms, especially inactive albite and </w:t>
+      </w:r>
+      <w:proofErr w:type="spellStart"/>
+      <w:r>
+        <w:t>CaNa</w:t>
+      </w:r>
+      <w:proofErr w:type="spellEnd"/>
+      <w:r>
+        <w:t>-exchange terms, and therefore represents sparse-recovery ambiguity rather than confident mineral identification. Reaction extents should consequently be reported as identifiability classes or ranked candidate processes, not unique phase histories.</w:t>
       </w:r>
       <m:oMath>
         <m:sSup>
@@ -9198,7 +9088,23 @@
     </w:p>
     <w:p>
       <w:r>
-        <w:t>The regularisation path showed that the AICc minimum occurred at lambda = 0.0483 for both Lower Anayari and Talensi (Figure 6). The selected value is a site-specific balance between residual norm and model complexity; it should not be presented as a universal optimum.</w:t>
+        <w:t xml:space="preserve">The regularisation path showed that the </w:t>
+      </w:r>
+      <w:proofErr w:type="spellStart"/>
+      <w:r>
+        <w:t>AICc</w:t>
+      </w:r>
+      <w:proofErr w:type="spellEnd"/>
+      <w:r>
+        <w:t xml:space="preserve"> minimum occurred at lambda = 0.0483 for both Lower Anayari and </w:t>
+      </w:r>
+      <w:proofErr w:type="spellStart"/>
+      <w:r>
+        <w:t>Talensi</w:t>
+      </w:r>
+      <w:proofErr w:type="spellEnd"/>
+      <w:r>
+        <w:t xml:space="preserve"> (Figure 6). The selected value is a site-specific balance between residual norm and model complexity; it should not be presented as a universal optimum.</w:t>
       </w:r>
       <m:oMath>
         <m:sSub>
@@ -9307,7 +9213,23 @@
     </w:p>
     <w:p>
       <w:r>
-        <w:t>At lambda = 0.0483, residual norms remained substantially below the over-regularised solutions while AICc favoured a parsimonious model. This supports using AICc as a transparent selection rule for the analysed sites, while retaining the possibility that different aquifers, ion panels or reaction dictionaries will require different regularisation strengths.</w:t>
+        <w:t xml:space="preserve">At lambda = 0.0483, residual norms remained substantially below the over-regularised solutions while </w:t>
+      </w:r>
+      <w:proofErr w:type="spellStart"/>
+      <w:r>
+        <w:t>AICc</w:t>
+      </w:r>
+      <w:proofErr w:type="spellEnd"/>
+      <w:r>
+        <w:t xml:space="preserve"> favoured a parsimonious model. This supports using </w:t>
+      </w:r>
+      <w:proofErr w:type="spellStart"/>
+      <w:r>
+        <w:t>AICc</w:t>
+      </w:r>
+      <w:proofErr w:type="spellEnd"/>
+      <w:r>
+        <w:t xml:space="preserve"> as a transparent selection rule for the analysed sites, while retaining the possibility that different aquifers, ion panels or reaction dictionaries will require different regularisation strengths.</w:t>
       </w:r>
       <m:oMath>
         <m:sSup>
@@ -9456,17 +9378,33 @@
     <w:p>
       <w:r>
         <w:lastRenderedPageBreak/>
-        <w:t>The framework was deployed on two contrasting Northern Ghana datasets: Lower Anayari, a crystalline-basement system, and Talensi, influenced by artisanal mining and agricultural nitrogen inputs. The datasets had sparse monitoring, no nuclear-tracer records and no calibrated regional flow model. The missing-data handler therefore configured a chemistry-and-coordinate workflow with optional tracer and thermodynamic modules inactive.</w:t>
-      </w:r>
-    </w:p>
-    <w:p>
+        <w:t xml:space="preserve">The framework was deployed on two contrasting Northern Ghana datasets: Lower Anayari, a crystalline-basement system, and </w:t>
+      </w:r>
       <w:proofErr w:type="spellStart"/>
       <w:r>
+        <w:t>Talensi</w:t>
+      </w:r>
+      <w:proofErr w:type="spellEnd"/>
+      <w:r>
+        <w:t>, influenced by artisanal mining and agricultural nitrogen inputs. The datasets had sparse monitoring, no nuclear-tracer records and no calibrated regional flow model. The missing-data handler therefore configured a chemistry-and-coordinate workflow with optional tracer and thermodynamic modules inactive.</w:t>
+      </w:r>
+    </w:p>
+    <w:p>
+      <w:proofErr w:type="spellStart"/>
+      <w:r>
         <w:t>Hydrosheaf</w:t>
       </w:r>
       <w:proofErr w:type="spellEnd"/>
       <w:r>
-        <w:t xml:space="preserve"> generated process-discovery networks for both sites (Figure 4). Lower Anayari contained 82 generated edges, of which 66 selected mixing and 16 selected evaporation; </w:t>
+        <w:t xml:space="preserve"> generated process-discovery networks for both sites (Figure 4). Lower Anayari contained 82 generated edges, of which 66 selected mixing and 16 selected </w:t>
+      </w:r>
+      <w:proofErr w:type="gramStart"/>
+      <w:r>
+        <w:t>evaporation</w:t>
+      </w:r>
+      <w:proofErr w:type="gramEnd"/>
+      <w:r>
+        <w:t xml:space="preserve">; </w:t>
       </w:r>
       <w:proofErr w:type="spellStart"/>
       <w:r>
@@ -9474,7 +9412,15 @@
       </w:r>
       <w:proofErr w:type="spellEnd"/>
       <w:r>
-        <w:t xml:space="preserve"> contained 126 edges, of which 96 selected mixing and 30 selected evaporation. Median chemistry R2 was 0.60 for Lower Anayari, 0.77 for </w:t>
+        <w:t xml:space="preserve"> contained 126 edges, of which 96 selected mixing and 30 selected </w:t>
+      </w:r>
+      <w:proofErr w:type="gramStart"/>
+      <w:r>
+        <w:t>evaporation</w:t>
+      </w:r>
+      <w:proofErr w:type="gramEnd"/>
+      <w:r>
+        <w:t xml:space="preserve">. Median chemistry R2 was 0.60 for Lower Anayari, 0.77 for </w:t>
       </w:r>
       <w:proofErr w:type="spellStart"/>
       <w:r>
@@ -9487,7 +9433,15 @@
     </w:p>
     <w:p>
       <w:r>
-        <w:t>High-confidence pathways were associated with cation exchange, nitrate cycling and lithology-dependent dissolution terms, but the relative ranking varied by edge. Lower Anayari showed frequent exchange and denitrification terms, whereas Talensi showed stronger nitrate-source and redox-related signatures. The process labels are therefore best treated as screening-level hypotheses to be corroborated with tracer, mineralogical and field-redox evidence.</w:t>
+        <w:t xml:space="preserve">High-confidence pathways were associated with cation exchange, nitrate cycling and lithology-dependent dissolution terms, but the relative ranking varied by edge. Lower Anayari showed frequent exchange and denitrification terms, whereas </w:t>
+      </w:r>
+      <w:proofErr w:type="spellStart"/>
+      <w:r>
+        <w:t>Talensi</w:t>
+      </w:r>
+      <w:proofErr w:type="spellEnd"/>
+      <w:r>
+        <w:t xml:space="preserve"> showed stronger nitrate-source and redox-related signatures. The process labels are therefore best treated as screening-level hypotheses to be corroborated with tracer, mineralogical and field-redox evidence.</w:t>
       </w:r>
       <m:oMath>
         <m:sSup>
@@ -9617,7 +9571,15 @@
     </w:p>
     <w:p>
       <w:r>
-        <w:t>Field chemistry-fit distributions were heterogeneous, with median R2 = 0.60 for Lower Anayari and 0.77 for Talensi. Lower-fit edges occurred near the confidence boundary or where charge-balance and missing-indicator limitations reduced identifiability. The residual distribution is consequently a diagnostic for prioritising field verification, not a measure of independent process accuracy.</w:t>
+        <w:t xml:space="preserve">Field chemistry-fit distributions were heterogeneous, with median R2 = 0.60 for Lower Anayari and 0.77 for </w:t>
+      </w:r>
+      <w:proofErr w:type="spellStart"/>
+      <w:r>
+        <w:t>Talensi</w:t>
+      </w:r>
+      <w:proofErr w:type="spellEnd"/>
+      <w:r>
+        <w:t>. Lower-fit edges occurred near the confidence boundary or where charge-balance and missing-indicator limitations reduced identifiability. The residual distribution is consequently a diagnostic for prioritising field verification, not a measure of independent process accuracy.</w:t>
       </w:r>
       <m:oMath>
         <m:sSup>
@@ -9718,7 +9680,23 @@
     <w:p>
       <w:r>
         <w:lastRenderedPageBreak/>
-        <w:t>Aerobic pyrite oxidation recurred in Talensi (PSI = 0.49) but was absent in Lower Anayari (PSI = 0.00), while gypsum dissolution was absent in Talensi (PSI = 0.00). These contrasts are consistent with the proposed mining/agriculture versus basement-weathering distinction, but they remain stability patterns under the analysed perturbations rather than guarantees of unique mineral sources.</w:t>
+        <w:t xml:space="preserve">Aerobic pyrite oxidation recurred in </w:t>
+      </w:r>
+      <w:proofErr w:type="spellStart"/>
+      <w:r>
+        <w:t>Talensi</w:t>
+      </w:r>
+      <w:proofErr w:type="spellEnd"/>
+      <w:r>
+        <w:t xml:space="preserve"> (PSI = 0.49) but was absent in Lower Anayari (PSI = 0.00), while gypsum dissolution was absent in </w:t>
+      </w:r>
+      <w:proofErr w:type="spellStart"/>
+      <w:r>
+        <w:t>Talensi</w:t>
+      </w:r>
+      <w:proofErr w:type="spellEnd"/>
+      <w:r>
+        <w:t xml:space="preserve"> (PSI = 0.00). These contrasts are consistent with the proposed mining/agriculture versus basement-weathering distinction, but they remain stability patterns under the analysed perturbations rather than guarantees of unique mineral sources.</w:t>
       </w:r>
     </w:p>
     <w:p/>
@@ -9763,7 +9741,31 @@
     </w:p>
     <w:p>
       <w:r>
-        <w:t>The central methodological contribution of Hydrosheaf is the integration of three normally isolated interpretive dimensions within a single computationally consistent workflow. Conventional approaches treat these separately: hydrogeochemists apply PHREEQC or NETPATH along user-specified paths (Parkhurst &amp; Appelo, 2013; Roy et al., 2020); isotope hydrologists fit LPM models independently to individual samples (Ma et al., 2019; Casillas-Trasvina et al., 2022); and numerical modellers run MODFLOW/MODPATH to generate flow topology as a post-hoc interpretation layer (Juckem &amp; Starn, 2021; Meyer et al., 2018). Hydrosheaf addresses this separation by making topology, residence-time uncertainty and reaction non-uniqueness visible in the same edge-level record. The integration constrains candidate interpretations and improves auditability, but it does not remove equifinality or replace calibrated numerical and geochemical models where those are available.</w:t>
+        <w:t xml:space="preserve">The central methodological contribution of </w:t>
+      </w:r>
+      <w:proofErr w:type="spellStart"/>
+      <w:r>
+        <w:t>Hydrosheaf</w:t>
+      </w:r>
+      <w:proofErr w:type="spellEnd"/>
+      <w:r>
+        <w:t xml:space="preserve"> is the integration of three normally isolated interpretive dimensions within a single computationally consistent workflow. Conventional approaches treat these separately: </w:t>
+      </w:r>
+      <w:proofErr w:type="spellStart"/>
+      <w:r>
+        <w:t>hydrogeochemists</w:t>
+      </w:r>
+      <w:proofErr w:type="spellEnd"/>
+      <w:r>
+        <w:t xml:space="preserve"> apply PHREEQC or NETPATH along user-specified paths (Parkhurst &amp; Appelo, 2013; Roy et al., 2020); isotope hydrologists fit LPM models independently to individual samples (Ma et al., 2019; Casillas-Trasvina et al., 2022); and numerical modellers run MODFLOW/MODPATH to generate flow topology as a post-hoc interpretation layer (Juckem &amp; Starn, 2021; Meyer et al., 2018). </w:t>
+      </w:r>
+      <w:proofErr w:type="spellStart"/>
+      <w:r>
+        <w:t>Hydrosheaf</w:t>
+      </w:r>
+      <w:proofErr w:type="spellEnd"/>
+      <w:r>
+        <w:t xml:space="preserve"> addresses this separation by making topology, residence-time uncertainty and reaction non-uniqueness visible in the same edge-level record. The integration constrains candidate interpretations and improves auditability, but it does not remove equifinality or replace calibrated numerical and geochemical models where those are available.</w:t>
       </w:r>
     </w:p>
     <w:p>
@@ -9978,7 +9980,23 @@
     </w:p>
     <w:p>
       <w:r>
-        <w:t>MODFLOW/MODPATH provides physically rigorous particle-tracking topology, and its outputs can serve as validation references or optional priors in Hydrosheaf. In the Savage benchmark, the prior-assisted mode reproduced the supplied edge set exactly, whereas the independent no-prior mode achieved F1 = 0.618 (recall 0.845, precision 0.487). The latter demonstrates high recall with substantial overconnection for this case and supports screening-level use where a calibrated model is unavailable; it does not establish generalisation to heterogeneous three-dimensional field systems.</w:t>
+        <w:t xml:space="preserve">MODFLOW/MODPATH provides physically rigorous particle-tracking topology, and its outputs can serve as validation references or optional priors in </w:t>
+      </w:r>
+      <w:proofErr w:type="spellStart"/>
+      <w:r>
+        <w:t>Hydrosheaf</w:t>
+      </w:r>
+      <w:proofErr w:type="spellEnd"/>
+      <w:r>
+        <w:t xml:space="preserve">. In the Savage benchmark, the prior-assisted mode reproduced the supplied edge set exactly, whereas the independent no-prior mode achieved F1 = 0.618 (recall 0.845, precision 0.487). The latter demonstrates high recall with substantial </w:t>
+      </w:r>
+      <w:proofErr w:type="spellStart"/>
+      <w:r>
+        <w:t>overconnection</w:t>
+      </w:r>
+      <w:proofErr w:type="spellEnd"/>
+      <w:r>
+        <w:t xml:space="preserve"> for this case and supports screening-level use where a calibrated model is unavailable; it does not establish generalisation to heterogeneous three-dimensional field systems.</w:t>
       </w:r>
     </w:p>
     <w:p>
@@ -10174,7 +10192,15 @@
     </w:p>
     <w:p>
       <w:r>
-        <w:t>Synthetic network-age recovery (log-space R2 = 0.98; MAE = 183.3 years) demonstrates consistency with the locked age design, while the 52% narrower posterior intervals are imposed by the network-updating model. The public USGS comparison is weaker but more independent: R2 = 0.71, median absolute log10 error = 0.17 and 61.4% within a factor of two. Because the public targets are reported model ages and fractions, this tier supports screening-level parity rather than true-age accuracy or full TracerLPM equivalence.</w:t>
+        <w:t xml:space="preserve">Synthetic network-age recovery (log-space R2 = 0.98; MAE = 183.3 years) demonstrates consistency with the locked age design, while the 52% narrower posterior intervals are imposed by the network-updating model. The public USGS comparison is weaker but more independent: R2 = 0.71, median absolute log10 error = 0.17 and 61.4% within a factor of two. Because the public targets are reported model ages and fractions, this tier supports screening-level parity rather than true-age accuracy or full </w:t>
+      </w:r>
+      <w:proofErr w:type="spellStart"/>
+      <w:r>
+        <w:t>TracerLPM</w:t>
+      </w:r>
+      <w:proofErr w:type="spellEnd"/>
+      <w:r>
+        <w:t xml:space="preserve"> equivalence.</w:t>
       </w:r>
       <m:oMath>
         <m:sSup>
@@ -10200,7 +10226,15 @@
     </w:p>
     <w:p>
       <w:r>
-        <w:t>The F1-score of 1.00 under prior-assisted conditions confirms the fidelity of MODPATH-prior ingestion but is not independent inference. The no-prior F1-score of 0.618 (recall 0.845, precision 0.487) demonstrates high-recall heuristic recovery with substantial overconnection in the tested benchmark. These results support transparent prior/no-prior separation and edge-level corroboration before geochemical interpretation.</w:t>
+        <w:t xml:space="preserve">The F1-score of 1.00 under prior-assisted conditions confirms the fidelity of MODPATH-prior ingestion but is not independent inference. The no-prior F1-score of 0.618 (recall 0.845, precision 0.487) demonstrates high-recall heuristic recovery with substantial </w:t>
+      </w:r>
+      <w:proofErr w:type="spellStart"/>
+      <w:r>
+        <w:t>overconnection</w:t>
+      </w:r>
+      <w:proofErr w:type="spellEnd"/>
+      <w:r>
+        <w:t xml:space="preserve"> in the tested benchmark. These results support transparent prior/no-prior separation and edge-level corroboration before geochemical interpretation.</w:t>
       </w:r>
     </w:p>
     <w:p>
@@ -10236,7 +10270,15 @@
     </w:p>
     <w:p>
       <w:r>
-        <w:t xml:space="preserve">The network-enhanced Bayesian age module generates a quantitative basis for isotope sampling prioritisation: nodes with high single-node uncertainty and low in-degree are those for which additional ³H, ¹⁴C, or noble-gas measurements most effectively reduce age uncertainty (Rädle et al., 2022; Casillas-Trasvina et al., 2022). Nodes at high-in-degree convergence points already achieve low uncertainty from network constraints. This diagnostic could substantially improve the cost-efficiency of isotope programmes in data-limited settings </w:t>
+        <w:t>The network-enhanced Bayesian age module generates a quantitative basis for isotope sampling prioritisation: nodes with high single-node uncertainty and low in-degree are those for which additional ³H, ¹⁴C, or noble-gas measurements most effectively reduce age uncertainty (</w:t>
+      </w:r>
+      <w:proofErr w:type="spellStart"/>
+      <w:r>
+        <w:t>Rädle</w:t>
+      </w:r>
+      <w:proofErr w:type="spellEnd"/>
+      <w:r>
+        <w:t xml:space="preserve"> et al., 2022; Casillas-Trasvina et al., 2022). Nodes at high-in-degree convergence points already achieve low uncertainty from network constraints. This diagnostic could substantially improve the cost-efficiency of isotope programmes in data-limited settings </w:t>
       </w:r>
       <w:r>
         <w:lastRenderedPageBreak/>
@@ -10252,8 +10294,13 @@
       </w:r>
     </w:p>
     <w:p>
-      <w:r>
-        <w:t>Talensi showed a recurring pyrite-oxidation signal (PSI = 0.49) and nitrate cycling, while Lower Anayari showed stronger exchange signatures and no pyrite oxidation. These patterns are useful hypotheses for water-quality risk assessment and sampling design, but the PSI values express recurrence under the analysed perturbations, not the prevalence or uniqueness of the underlying mineral source.</w:t>
+      <w:proofErr w:type="spellStart"/>
+      <w:r>
+        <w:t>Talensi</w:t>
+      </w:r>
+      <w:proofErr w:type="spellEnd"/>
+      <w:r>
+        <w:t xml:space="preserve"> showed a recurring pyrite-oxidation signal (PSI = 0.49) and nitrate cycling, while Lower Anayari showed stronger exchange signatures and no pyrite oxidation. These patterns are useful hypotheses for water-quality risk assessment and sampling design, but the PSI values express recurrence under the analysed perturbations, not the prevalence or uniqueness of the underlying mineral source.</w:t>
       </w:r>
     </w:p>
     <w:p/>
@@ -10360,7 +10407,15 @@
       </w:r>
       <w:proofErr w:type="spellEnd"/>
       <w:r>
-        <w:t xml:space="preserve"> et al., 2022; Rädle et al., 2022). Integration with IAEA GNIG and USGS databases would enable systematic benchmarking against a larger, geographically diverse reference age dataset (Casillas-Trasvina et al., 2022; </w:t>
+        <w:t xml:space="preserve"> et al., 2022; </w:t>
+      </w:r>
+      <w:proofErr w:type="spellStart"/>
+      <w:r>
+        <w:t>Rädle</w:t>
+      </w:r>
+      <w:proofErr w:type="spellEnd"/>
+      <w:r>
+        <w:t xml:space="preserve"> et al., 2022). Integration with IAEA GNIG and USGS databases would enable systematic benchmarking against a larger, geographically diverse reference age dataset (Casillas-Trasvina et al., 2022; </w:t>
       </w:r>
       <w:proofErr w:type="spellStart"/>
       <w:r>
@@ -10433,12 +10488,36 @@
     </w:p>
     <w:p>
       <w:r>
-        <w:t>The Ghana demonstration generated 208 process-discovery edges from sparse chemistry and coordinate/head-proxy inputs. Median chemistry R2 was 0.60 for Lower Anayari and 0.77 for Talensi. Exchange and nitrate-cycling terms were common at both sites, while pyrite oxidation recurred in Talensi and was absent in Lower Anayari. These distinctions are useful for hypothesis generation, but the absence of an independent field process-truth graph means that they require tracer, mineralogical and redox corroboration.</w:t>
-      </w:r>
-    </w:p>
-    <w:p>
-      <w:r>
-        <w:t>Overall, Hydrosheaf provides an open and reproducible framework for evidence-tiered groundwater process diagnosis in sub-Saharan Africa and other data-limited regions. Its contribution is strongest as an auditable integration and prioritisation layer that makes topology, residence-time uncertainty and geochemical non-uniqueness explicit.</w:t>
+        <w:t xml:space="preserve">The Ghana demonstration generated 208 process-discovery edges from sparse chemistry and coordinate/head-proxy inputs. Median chemistry R2 was 0.60 for Lower Anayari and 0.77 for </w:t>
+      </w:r>
+      <w:proofErr w:type="spellStart"/>
+      <w:r>
+        <w:t>Talensi</w:t>
+      </w:r>
+      <w:proofErr w:type="spellEnd"/>
+      <w:r>
+        <w:t xml:space="preserve">. Exchange and nitrate-cycling terms were common at both sites, while pyrite oxidation recurred in </w:t>
+      </w:r>
+      <w:proofErr w:type="spellStart"/>
+      <w:r>
+        <w:t>Talensi</w:t>
+      </w:r>
+      <w:proofErr w:type="spellEnd"/>
+      <w:r>
+        <w:t xml:space="preserve"> and was absent in Lower Anayari. These distinctions are useful for hypothesis generation, but the absence of an independent field process-truth graph means that they require tracer, mineralogical and redox corroboration.</w:t>
+      </w:r>
+    </w:p>
+    <w:p>
+      <w:r>
+        <w:t xml:space="preserve">Overall, </w:t>
+      </w:r>
+      <w:proofErr w:type="spellStart"/>
+      <w:r>
+        <w:t>Hydrosheaf</w:t>
+      </w:r>
+      <w:proofErr w:type="spellEnd"/>
+      <w:r>
+        <w:t xml:space="preserve"> provides an open and reproducible framework for evidence-tiered groundwater process diagnosis in sub-Saharan Africa and other data-limited regions. Its contribution is strongest as an auditable integration and prioritisation layer that makes topology, residence-time uncertainty and geochemical non-uniqueness explicit.</w:t>
       </w:r>
     </w:p>
     <w:p/>
@@ -10511,7 +10590,15 @@
         <w:spacing w:after="0"/>
       </w:pPr>
       <w:r>
-        <w:t>The lead author acknowledges the GetFund Scholarship secretariat</w:t>
+        <w:t xml:space="preserve">The lead author acknowledges the </w:t>
+      </w:r>
+      <w:proofErr w:type="spellStart"/>
+      <w:r>
+        <w:t>GetFund</w:t>
+      </w:r>
+      <w:proofErr w:type="spellEnd"/>
+      <w:r>
+        <w:t xml:space="preserve"> Scholarship secretariat</w:t>
       </w:r>
       <w:r>
         <w:rPr>
@@ -10594,8 +10681,13 @@
       <w:r>
         <w:t>Graph Topology)</w:t>
       </w:r>
-      <w:r>
-        <w:t xml:space="preserve">, , </w:t>
+      <w:proofErr w:type="gramStart"/>
+      <w:r>
+        <w:t>, ,</w:t>
+      </w:r>
+      <w:proofErr w:type="gramEnd"/>
+      <w:r>
+        <w:t xml:space="preserve"> </w:t>
       </w:r>
       <w:r>
         <w:rPr>
@@ -10806,15 +10898,28 @@
         </w:rPr>
         <w:t xml:space="preserve">Groundwater, 63(6), 861–873. </w:t>
       </w:r>
-      <w:hyperlink r:id="rId15" w:history="1">
-        <w:r>
-          <w:rPr>
-            <w:rStyle w:val="Hyperlink"/>
-            <w:lang w:val="it-IT"/>
-          </w:rPr>
-          <w:t>https://doi.org/10.1111/gwat.70024</w:t>
-        </w:r>
-      </w:hyperlink>
+      <w:r>
+        <w:fldChar w:fldCharType="begin"/>
+      </w:r>
+      <w:r>
+        <w:rPr>
+          <w:lang w:val="it-IT"/>
+        </w:rPr>
+        <w:instrText>HYPERLINK "https://doi.org/10.1111/gwat.70024"</w:instrText>
+      </w:r>
+      <w:r>
+        <w:fldChar w:fldCharType="separate"/>
+      </w:r>
+      <w:r>
+        <w:rPr>
+          <w:rStyle w:val="Hyperlink"/>
+          <w:lang w:val="it-IT"/>
+        </w:rPr>
+        <w:t>https://doi.org/10.1111/gwat.70024</w:t>
+      </w:r>
+      <w:r>
+        <w:fldChar w:fldCharType="end"/>
+      </w:r>
       <w:r>
         <w:rPr>
           <w:lang w:val="it-IT"/>
@@ -10846,7 +10951,7 @@
       <w:r>
         <w:t xml:space="preserve">(11), 2063–2081. </w:t>
       </w:r>
-      <w:hyperlink r:id="rId16" w:history="1">
+      <w:hyperlink r:id="rId15" w:history="1">
         <w:r>
           <w:rPr>
             <w:rStyle w:val="Hyperlink"/>
@@ -10888,9 +10993,17 @@
       </w:r>
       <w:proofErr w:type="spellEnd"/>
       <w:r>
-        <w:t xml:space="preserve">, H. (2017). Geochemical investigation of groundwater dynamics and flow paths in a karst aquifer (Lez spring, southern France). Journal of Hydrology, 554, 789–805. </w:t>
-      </w:r>
-      <w:hyperlink r:id="rId17" w:history="1">
+        <w:t>, H. (2017). Geochemical investigation of groundwater dynamics and flow paths in a karst aquifer (</w:t>
+      </w:r>
+      <w:proofErr w:type="gramStart"/>
+      <w:r>
+        <w:t>Lez spring</w:t>
+      </w:r>
+      <w:proofErr w:type="gramEnd"/>
+      <w:r>
+        <w:t xml:space="preserve">, southern France). Journal of Hydrology, 554, 789–805. </w:t>
+      </w:r>
+      <w:hyperlink r:id="rId16" w:history="1">
         <w:r>
           <w:rPr>
             <w:rStyle w:val="Hyperlink"/>
@@ -10942,7 +11055,7 @@
       <w:r>
         <w:t xml:space="preserve"> and inputs from stable water isotopes. Journal of Hydrology, 544, 278–289. </w:t>
       </w:r>
-      <w:hyperlink r:id="rId18" w:history="1">
+      <w:hyperlink r:id="rId17" w:history="1">
         <w:r>
           <w:rPr>
             <w:rStyle w:val="Hyperlink"/>
@@ -10975,7 +11088,7 @@
       <w:r>
         <w:t xml:space="preserve"> groundwater resources in data-scarce regions for sustainable management: Methodologies and limits. Hydrology, 12, 11. </w:t>
       </w:r>
-      <w:hyperlink r:id="rId19" w:history="1">
+      <w:hyperlink r:id="rId18" w:history="1">
         <w:r>
           <w:rPr>
             <w:rStyle w:val="Hyperlink"/>
@@ -11001,17 +11114,25 @@
       </w:r>
       <w:proofErr w:type="spellEnd"/>
       <w:r>
-        <w:t xml:space="preserve">, J., Vergnaud-Ayraud, V., Devau, N., </w:t>
+        <w:t xml:space="preserve">, J., </w:t>
       </w:r>
       <w:proofErr w:type="spellStart"/>
       <w:r>
+        <w:t>Vergnaud</w:t>
+      </w:r>
+      <w:proofErr w:type="spellEnd"/>
+      <w:r>
+        <w:t xml:space="preserve">-Ayraud, V., Devau, N., </w:t>
+      </w:r>
+      <w:proofErr w:type="spellStart"/>
+      <w:r>
         <w:t>Labasque</w:t>
       </w:r>
       <w:proofErr w:type="spellEnd"/>
       <w:r>
         <w:t xml:space="preserve">, T., Guillou, A., Guillaneuf, A., Hubert, J., Aquilina, L., &amp; Ollivier, P. (2020). Heterogeneous behaviour of unconfined chalk aquifers inferred from combination of groundwater residence time, hydrochemistry and hydrodynamic tools. Journal of Hydrology, 581, 124433. </w:t>
       </w:r>
-      <w:hyperlink r:id="rId20" w:history="1">
+      <w:hyperlink r:id="rId19" w:history="1">
         <w:r>
           <w:rPr>
             <w:rStyle w:val="Hyperlink"/>
@@ -11048,15 +11169,28 @@
         </w:rPr>
         <w:t xml:space="preserve">Journal of Hydrology, 555, 797–811. </w:t>
       </w:r>
-      <w:hyperlink r:id="rId21" w:history="1">
-        <w:r>
-          <w:rPr>
-            <w:rStyle w:val="Hyperlink"/>
-            <w:lang w:val="it-IT"/>
-          </w:rPr>
-          <w:t>https://doi.org/10.1016/j.jhydrol.2017.10.053</w:t>
-        </w:r>
-      </w:hyperlink>
+      <w:r>
+        <w:fldChar w:fldCharType="begin"/>
+      </w:r>
+      <w:r>
+        <w:rPr>
+          <w:lang w:val="it-IT"/>
+        </w:rPr>
+        <w:instrText>HYPERLINK "https://doi.org/10.1016/j.jhydrol.2017.10.053"</w:instrText>
+      </w:r>
+      <w:r>
+        <w:fldChar w:fldCharType="separate"/>
+      </w:r>
+      <w:r>
+        <w:rPr>
+          <w:rStyle w:val="Hyperlink"/>
+          <w:lang w:val="it-IT"/>
+        </w:rPr>
+        <w:t>https://doi.org/10.1016/j.jhydrol.2017.10.053</w:t>
+      </w:r>
+      <w:r>
+        <w:fldChar w:fldCharType="end"/>
+      </w:r>
       <w:r>
         <w:rPr>
           <w:lang w:val="it-IT"/>
@@ -11078,7 +11212,7 @@
       <w:r>
         <w:t xml:space="preserve">Estimating groundwater residence time and recharge patterns in a saline coastal aquifer. Hydrological Processes, 30, 4202–4213. </w:t>
       </w:r>
-      <w:hyperlink r:id="rId22" w:history="1">
+      <w:hyperlink r:id="rId20" w:history="1">
         <w:r>
           <w:rPr>
             <w:rStyle w:val="Hyperlink"/>
@@ -11118,7 +11252,7 @@
         <w:lastRenderedPageBreak/>
         <w:t xml:space="preserve">groundwater age distribution: The case of the Neogene aquifer, Belgium. Journal of Hydrology X, 16, 100132. </w:t>
       </w:r>
-      <w:hyperlink r:id="rId23" w:history="1">
+      <w:hyperlink r:id="rId21" w:history="1">
         <w:r>
           <w:rPr>
             <w:rStyle w:val="Hyperlink"/>
@@ -11146,7 +11280,7 @@
       <w:r>
         <w:t xml:space="preserve"> Coal Mining Area, Huaibei Coalfield, China. International Journal of Environmental Research and Public Health, 19, 14434. </w:t>
       </w:r>
-      <w:hyperlink r:id="rId24" w:history="1">
+      <w:hyperlink r:id="rId22" w:history="1">
         <w:r>
           <w:rPr>
             <w:rStyle w:val="Hyperlink"/>
@@ -11172,7 +11306,7 @@
       <w:r>
         <w:t xml:space="preserve">Stochastic particle tracking application in different urban areas in Central Europe: The Milano (IT) and Jaworzno (PL) case study to secure the drinking water resources. Sustainability, 13(18), 10291. </w:t>
       </w:r>
-      <w:hyperlink r:id="rId25" w:history="1">
+      <w:hyperlink r:id="rId23" w:history="1">
         <w:r>
           <w:rPr>
             <w:rStyle w:val="Hyperlink"/>
@@ -11200,7 +11334,7 @@
       <w:r>
         <w:t xml:space="preserve">, U., Flynn, R., &amp; Allen, A. R. (2018). Catchment-scale residence-time structure in weathered/fractured hard-rock aquifers. Water Resources Research, 54, 8966–8987. </w:t>
       </w:r>
-      <w:hyperlink r:id="rId26" w:history="1">
+      <w:hyperlink r:id="rId24" w:history="1">
         <w:r>
           <w:rPr>
             <w:rStyle w:val="Hyperlink"/>
@@ -11223,7 +11357,7 @@
       <w:r>
         <w:t xml:space="preserve">Groundwater flow and residence time in a karst aquifer using ion and isotope characterization. International Journal of Environmental Science and Technology, 13, 2579–2596. </w:t>
       </w:r>
-      <w:hyperlink r:id="rId27" w:history="1">
+      <w:hyperlink r:id="rId25" w:history="1">
         <w:r>
           <w:rPr>
             <w:rStyle w:val="Hyperlink"/>
@@ -11259,38 +11393,15 @@
         <w:t xml:space="preserve">Hydrogeology Journal, 30, 927–946. </w:t>
       </w:r>
       <w:r>
+        <w:fldChar w:fldCharType="begin"/>
+      </w:r>
+      <w:r>
         <w:rPr>
           <w:lang w:val="it-IT"/>
         </w:rPr>
-        <w:fldChar w:fldCharType="begin"/>
-      </w:r>
-      <w:r>
-        <w:rPr>
-          <w:lang w:val="it-IT"/>
-        </w:rPr>
-        <w:instrText>HYPERLINK "</w:instrText>
-      </w:r>
-      <w:r>
-        <w:rPr>
-          <w:lang w:val="it-IT"/>
-        </w:rPr>
-        <w:instrText>https://doi.org/10.1007/s10040-022-02464-x</w:instrText>
-      </w:r>
-      <w:r>
-        <w:rPr>
-          <w:lang w:val="it-IT"/>
-        </w:rPr>
-        <w:instrText>"</w:instrText>
-      </w:r>
-      <w:r>
-        <w:rPr>
-          <w:lang w:val="it-IT"/>
-        </w:rPr>
-      </w:r>
-      <w:r>
-        <w:rPr>
-          <w:lang w:val="it-IT"/>
-        </w:rPr>
+        <w:instrText>HYPERLINK "https://doi.org/10.1007/s10040-022-02464-x"</w:instrText>
+      </w:r>
+      <w:r>
         <w:fldChar w:fldCharType="separate"/>
       </w:r>
       <w:r>
@@ -11301,9 +11412,6 @@
         <w:t>https://doi.org/10.1007/s10040-022-02464-x</w:t>
       </w:r>
       <w:r>
-        <w:rPr>
-          <w:lang w:val="it-IT"/>
-        </w:rPr>
         <w:fldChar w:fldCharType="end"/>
       </w:r>
       <w:r>
@@ -11343,7 +11451,7 @@
       <w:r>
         <w:t xml:space="preserve"> regions (NE Algeria). Science of the Total Environment, 757, 143797. </w:t>
       </w:r>
-      <w:hyperlink r:id="rId28" w:history="1">
+      <w:hyperlink r:id="rId26" w:history="1">
         <w:r>
           <w:rPr>
             <w:rStyle w:val="Hyperlink"/>
@@ -11371,7 +11479,7 @@
       <w:r>
         <w:t xml:space="preserve">, D. E., &amp; Gladish, D. W. (2020). Probabilistic groundwater flow, particle tracking and uncertainty analysis for environmental receptor vulnerability assessment of a coal seam gas project. Water, 12(11), 3177. </w:t>
       </w:r>
-      <w:hyperlink r:id="rId29" w:history="1">
+      <w:hyperlink r:id="rId27" w:history="1">
         <w:r>
           <w:rPr>
             <w:rStyle w:val="Hyperlink"/>
@@ -11407,7 +11515,7 @@
       <w:r>
         <w:t xml:space="preserve"> Basin, Northwestern China. Water, 17, 2074. </w:t>
       </w:r>
-      <w:hyperlink r:id="rId30" w:history="1">
+      <w:hyperlink r:id="rId28" w:history="1">
         <w:r>
           <w:rPr>
             <w:rStyle w:val="Hyperlink"/>
@@ -11427,7 +11535,7 @@
       <w:r>
         <w:t xml:space="preserve">Guo, X.-R., Zuo, R., Wang, J., Meng, L., Teng, Y., Shi, R., Gao, X., &amp; Ding, F. (2018). Hydrogeochemical evolution of interaction between surface water and groundwater affected by exploitation. Groundwater, 57. </w:t>
       </w:r>
-      <w:hyperlink r:id="rId31" w:history="1">
+      <w:hyperlink r:id="rId29" w:history="1">
         <w:r>
           <w:rPr>
             <w:rStyle w:val="Hyperlink"/>
@@ -11447,7 +11555,7 @@
       <w:r>
         <w:t xml:space="preserve">Hansen, J., &amp; Ghrist, R. (2019). Toward a spectral theory of cellular sheaves. Journal of Applied and Computational Topology, 3, 315–358. </w:t>
       </w:r>
-      <w:hyperlink r:id="rId32" w:history="1">
+      <w:hyperlink r:id="rId30" w:history="1">
         <w:r>
           <w:rPr>
             <w:rStyle w:val="Hyperlink"/>
@@ -11467,7 +11575,7 @@
       <w:r>
         <w:t xml:space="preserve">He, Z., Han, D., Song, X., Yang, L., Zhang, Y., Ma, Y., Bu, H., Li, B., &amp; Yang, S. (2021). Variations of groundwater dynamics in alluvial aquifers with reclaimed water restoring the overlying river, Beijing, China. Water, 13, 806. </w:t>
       </w:r>
-      <w:hyperlink r:id="rId33" w:history="1">
+      <w:hyperlink r:id="rId31" w:history="1">
         <w:r>
           <w:rPr>
             <w:rStyle w:val="Hyperlink"/>
@@ -11495,7 +11603,7 @@
       <w:r>
         <w:t xml:space="preserve">, and 3H). Journal of Hydrology, 559, 835–847. </w:t>
       </w:r>
-      <w:hyperlink r:id="rId34" w:history="1">
+      <w:hyperlink r:id="rId32" w:history="1">
         <w:r>
           <w:rPr>
             <w:rStyle w:val="Hyperlink"/>
@@ -11515,7 +11623,7 @@
       <w:r>
         <w:t xml:space="preserve">Juckem, P. F., &amp; Starn, J. J. (2021). Re-purposing groundwater flow models for age assessments: Important characteristics. Groundwater, 59(5), 710–727. </w:t>
       </w:r>
-      <w:hyperlink r:id="rId35" w:history="1">
+      <w:hyperlink r:id="rId33" w:history="1">
         <w:r>
           <w:rPr>
             <w:rStyle w:val="Hyperlink"/>
@@ -11549,7 +11657,7 @@
       <w:r>
         <w:t xml:space="preserve">, J., &amp; de Louw, P. G. B. (2021). Time lags of nitrate, chloride, and tritium in streams assessed by dynamic groundwater flow tracking in a lowland landscape. Hydrology and Earth System Sciences, 25, 3691–3711. </w:t>
       </w:r>
-      <w:hyperlink r:id="rId36" w:history="1">
+      <w:hyperlink r:id="rId34" w:history="1">
         <w:r>
           <w:rPr>
             <w:rStyle w:val="Hyperlink"/>
@@ -11585,7 +11693,7 @@
       <w:r>
         <w:t xml:space="preserve"> Catchment, Malawi. African Journal of Environmental Science and Technology, 12(1), 1–14. </w:t>
       </w:r>
-      <w:hyperlink r:id="rId37" w:history="1">
+      <w:hyperlink r:id="rId35" w:history="1">
         <w:r>
           <w:rPr>
             <w:rStyle w:val="Hyperlink"/>
@@ -11613,7 +11721,7 @@
       <w:r>
         <w:t xml:space="preserve"> flow and transport in fracture networks using graphs. Physical Review E, 97, 033304. </w:t>
       </w:r>
-      <w:hyperlink r:id="rId38" w:history="1">
+      <w:hyperlink r:id="rId36" w:history="1">
         <w:r>
           <w:rPr>
             <w:rStyle w:val="Hyperlink"/>
@@ -11633,7 +11741,7 @@
       <w:r>
         <w:t xml:space="preserve">Keegan-Treloar, R., Banks, E. W., Cartwright, I., Irvine, D. J., Webb, J. A., Werner, A. D., &amp; Currell, M. J. (2024). Using major ions and stable isotopes to improve conceptualisation of a spring-aquifer system in the Galilee Basin, Australia. Hydrogeology Journal, 32, 1211–1228. </w:t>
       </w:r>
-      <w:hyperlink r:id="rId39" w:history="1">
+      <w:hyperlink r:id="rId37" w:history="1">
         <w:r>
           <w:rPr>
             <w:rStyle w:val="Hyperlink"/>
@@ -11669,7 +11777,7 @@
       <w:r>
         <w:t xml:space="preserve"> Mining Area, Guanzhong Basin, China. Water, 16, 660. </w:t>
       </w:r>
-      <w:hyperlink r:id="rId40" w:history="1">
+      <w:hyperlink r:id="rId38" w:history="1">
         <w:r>
           <w:rPr>
             <w:rStyle w:val="Hyperlink"/>
@@ -11702,7 +11810,7 @@
       <w:r>
         <w:t xml:space="preserve"> Mesa and vicinity, Nevada National Security Site, USA, from naturally occurring geochemical and isotopic tracers. Hydrogeology Journal, 29, 2725–2749. </w:t>
       </w:r>
-      <w:hyperlink r:id="rId41" w:history="1">
+      <w:hyperlink r:id="rId39" w:history="1">
         <w:r>
           <w:rPr>
             <w:rStyle w:val="Hyperlink"/>
@@ -11722,7 +11830,7 @@
       <w:r>
         <w:t xml:space="preserve">Lapworth, D. J., Krishan, G., MacDonald, A. M., &amp; Rao, M. S. (2017). Groundwater quality in the alluvial aquifer system of northwest India: New evidence of the extent of anthropogenic and geogenic contamination. Science of the Total Environment, 599–600, 1433–1444. </w:t>
       </w:r>
-      <w:hyperlink r:id="rId42" w:history="1">
+      <w:hyperlink r:id="rId40" w:history="1">
         <w:r>
           <w:rPr>
             <w:rStyle w:val="Hyperlink"/>
@@ -11748,7 +11856,7 @@
       <w:r>
         <w:t xml:space="preserve">Hydrochemical evolution of groundwater in a typical semi-arid groundwater storage basin using a zoning model. Water, 11, 1334. </w:t>
       </w:r>
-      <w:hyperlink r:id="rId43" w:history="1">
+      <w:hyperlink r:id="rId41" w:history="1">
         <w:r>
           <w:rPr>
             <w:rStyle w:val="Hyperlink"/>
@@ -11789,7 +11897,7 @@
       <w:r>
         <w:t xml:space="preserve">(3), 338. </w:t>
       </w:r>
-      <w:hyperlink r:id="rId44" w:tgtFrame="_new" w:history="1">
+      <w:hyperlink r:id="rId42" w:tgtFrame="_new" w:history="1">
         <w:r>
           <w:rPr>
             <w:rStyle w:val="Hyperlink"/>
@@ -11817,7 +11925,7 @@
       <w:r>
         <w:t xml:space="preserve"> Loess Basin, Northwest China. Journal of Arid Land, 14, 34–55. </w:t>
       </w:r>
-      <w:hyperlink r:id="rId45" w:history="1">
+      <w:hyperlink r:id="rId43" w:history="1">
         <w:r>
           <w:rPr>
             <w:rStyle w:val="Hyperlink"/>
@@ -11840,7 +11948,7 @@
       <w:r>
         <w:t xml:space="preserve">Application of environmental tracers for investigation of groundwater mean residence time and aquifer recharge in fault-influenced hydraulic drop alluvium aquifers. Hydrology and Earth System Sciences, 23, 427–446. </w:t>
       </w:r>
-      <w:hyperlink r:id="rId46" w:history="1">
+      <w:hyperlink r:id="rId44" w:history="1">
         <w:r>
           <w:rPr>
             <w:rStyle w:val="Hyperlink"/>
@@ -11887,68 +11995,59 @@
       </w:pPr>
       <w:r>
         <w:rPr>
+          <w:lang w:val="en-US"/>
+        </w:rPr>
+        <w:t xml:space="preserve">Malenica, L., Gotovac, H., Kamber, G., Simunovic, S., Allu, S., &amp; </w:t>
+      </w:r>
+      <w:proofErr w:type="spellStart"/>
+      <w:r>
+        <w:rPr>
+          <w:lang w:val="en-US"/>
+        </w:rPr>
+        <w:t>Divic</w:t>
+      </w:r>
+      <w:proofErr w:type="spellEnd"/>
+      <w:r>
+        <w:rPr>
+          <w:lang w:val="en-US"/>
+        </w:rPr>
+        <w:t xml:space="preserve">, V. (2018). </w:t>
+      </w:r>
+      <w:r>
+        <w:t xml:space="preserve">Groundwater flow </w:t>
+      </w:r>
+      <w:proofErr w:type="spellStart"/>
+      <w:r>
+        <w:t>modeling</w:t>
+      </w:r>
+      <w:proofErr w:type="spellEnd"/>
+      <w:r>
+        <w:t xml:space="preserve"> in karst aquifers: Coupling 3D matrix and 1D conduit flow via control volume </w:t>
+      </w:r>
+      <w:proofErr w:type="spellStart"/>
+      <w:r>
+        <w:t>isogeometric</w:t>
+      </w:r>
+      <w:proofErr w:type="spellEnd"/>
+      <w:r>
+        <w:t xml:space="preserve"> analysis—Experimental verification with a 3D physical model. </w:t>
+      </w:r>
+      <w:r>
+        <w:rPr>
           <w:lang w:val="it-IT"/>
         </w:rPr>
-        <w:t xml:space="preserve">Malenica, L., Gotovac, H., Kamber, G., Simunovic, S., Allu, S., &amp; Divic, V. (2018). </w:t>
-      </w:r>
-      <w:r>
-        <w:t xml:space="preserve">Groundwater flow </w:t>
-      </w:r>
-      <w:proofErr w:type="spellStart"/>
-      <w:r>
-        <w:t>modeling</w:t>
-      </w:r>
-      <w:proofErr w:type="spellEnd"/>
-      <w:r>
-        <w:t xml:space="preserve"> in karst aquifers: Coupling 3D matrix and 1D conduit flow via control volume </w:t>
-      </w:r>
-      <w:proofErr w:type="spellStart"/>
-      <w:r>
-        <w:t>isogeometric</w:t>
-      </w:r>
-      <w:proofErr w:type="spellEnd"/>
-      <w:r>
-        <w:t xml:space="preserve"> analysis—Experimental verification with a 3D physical model. </w:t>
+        <w:t xml:space="preserve">Water, 10(12), 1787. </w:t>
+      </w:r>
+      <w:r>
+        <w:fldChar w:fldCharType="begin"/>
       </w:r>
       <w:r>
         <w:rPr>
           <w:lang w:val="it-IT"/>
         </w:rPr>
-        <w:t xml:space="preserve">Water, 10(12), 1787. </w:t>
-      </w:r>
-      <w:r>
-        <w:rPr>
-          <w:lang w:val="it-IT"/>
-        </w:rPr>
-        <w:fldChar w:fldCharType="begin"/>
-      </w:r>
-      <w:r>
-        <w:rPr>
-          <w:lang w:val="it-IT"/>
-        </w:rPr>
-        <w:instrText>HYPERLINK "</w:instrText>
-      </w:r>
-      <w:r>
-        <w:rPr>
-          <w:lang w:val="it-IT"/>
-        </w:rPr>
-        <w:instrText>https://doi.org/10.3390/w10121787</w:instrText>
-      </w:r>
-      <w:r>
-        <w:rPr>
-          <w:lang w:val="it-IT"/>
-        </w:rPr>
-        <w:instrText>"</w:instrText>
-      </w:r>
-      <w:r>
-        <w:rPr>
-          <w:lang w:val="it-IT"/>
-        </w:rPr>
-      </w:r>
-      <w:r>
-        <w:rPr>
-          <w:lang w:val="it-IT"/>
-        </w:rPr>
+        <w:instrText>HYPERLINK "https://doi.org/10.3390/w10121787"</w:instrText>
+      </w:r>
+      <w:r>
         <w:fldChar w:fldCharType="separate"/>
       </w:r>
       <w:r>
@@ -11959,9 +12058,6 @@
         <w:t>https://doi.org/10.3390/w10121787</w:t>
       </w:r>
       <w:r>
-        <w:rPr>
-          <w:lang w:val="it-IT"/>
-        </w:rPr>
         <w:fldChar w:fldCharType="end"/>
       </w:r>
       <w:r>
@@ -11985,7 +12081,7 @@
       <w:r>
         <w:t xml:space="preserve">Water–rock interactions driving groundwater composition in the Pra Basin (Ghana) identified by combinatorial inverse geochemical modelling. Minerals, 13, 899. </w:t>
       </w:r>
-      <w:hyperlink r:id="rId47" w:history="1">
+      <w:hyperlink r:id="rId45" w:history="1">
         <w:r>
           <w:rPr>
             <w:rStyle w:val="Hyperlink"/>
@@ -12004,9 +12100,17 @@
       </w:pPr>
       <w:r>
         <w:lastRenderedPageBreak/>
-        <w:t xml:space="preserve">Meyer, R., Engesgaard, P., Hinsby, K., Piotrowski, J. A., &amp; Sonnenborg, T. O. (2018). Estimation of effective porosity in large-scale groundwater models by combining particle tracking, auto-calibration and 14C dating. Hydrology and Earth System Sciences, 22, 4843–4865. </w:t>
-      </w:r>
-      <w:hyperlink r:id="rId48" w:history="1">
+        <w:t xml:space="preserve">Meyer, R., Engesgaard, P., Hinsby, K., Piotrowski, J. A., &amp; Sonnenborg, T. O. (2018). Estimation of effective porosity in large-scale groundwater models by combining particle tracking, </w:t>
+      </w:r>
+      <w:proofErr w:type="gramStart"/>
+      <w:r>
+        <w:t>auto-calibration</w:t>
+      </w:r>
+      <w:proofErr w:type="gramEnd"/>
+      <w:r>
+        <w:t xml:space="preserve"> and 14C dating. Hydrology and Earth System Sciences, 22, 4843–4865. </w:t>
+      </w:r>
+      <w:hyperlink r:id="rId46" w:history="1">
         <w:r>
           <w:rPr>
             <w:rStyle w:val="Hyperlink"/>
@@ -12039,7 +12143,7 @@
       <w:r>
         <w:t xml:space="preserve">, V. (2016). Groundwater mixing between different aquifer types in a complex structural setting discerned by elemental and stable isotope geochemistry. Hydrological Processes, 30, 410–423. </w:t>
       </w:r>
-      <w:hyperlink r:id="rId49" w:history="1">
+      <w:hyperlink r:id="rId47" w:history="1">
         <w:r>
           <w:rPr>
             <w:rStyle w:val="Hyperlink"/>
@@ -12059,7 +12163,7 @@
       <w:r>
         <w:t xml:space="preserve">Newman, C., Paschke, S., &amp; Keith, G. (2021). Natural and anthropogenic geochemical tracers to investigate residence times and groundwater–surface-water interactions in an urban alluvial aquifer. Water, 13, 871. </w:t>
       </w:r>
-      <w:hyperlink r:id="rId50" w:history="1">
+      <w:hyperlink r:id="rId48" w:history="1">
         <w:r>
           <w:rPr>
             <w:rStyle w:val="Hyperlink"/>
@@ -12079,7 +12183,7 @@
       <w:r>
         <w:t xml:space="preserve">Parkhurst, D. L., &amp; Appelo, C. A. J. (2013). Description of input and examples for PHREEQC version 3: A computer program for speciation, batch-reaction, one-dimensional transport, and inverse geochemical calculations. U.S. Geological Survey Techniques and Methods, 6-A43. </w:t>
       </w:r>
-      <w:hyperlink r:id="rId51" w:history="1">
+      <w:hyperlink r:id="rId49" w:history="1">
         <w:r>
           <w:rPr>
             <w:rStyle w:val="Hyperlink"/>
@@ -12136,7 +12240,7 @@
       <w:r>
         <w:t xml:space="preserve"> hydrogeology. Science of the Total Environment, 159886. </w:t>
       </w:r>
-      <w:hyperlink r:id="rId52" w:history="1">
+      <w:hyperlink r:id="rId50" w:history="1">
         <w:r>
           <w:rPr>
             <w:rStyle w:val="Hyperlink"/>
@@ -12153,11 +12257,16 @@
         <w:spacing w:after="0"/>
         <w:ind w:left="567" w:hanging="567"/>
       </w:pPr>
-      <w:r>
-        <w:t xml:space="preserve">Rädle, V., Kersting, A., Schmidt, M., </w:t>
-      </w:r>
       <w:proofErr w:type="spellStart"/>
       <w:r>
+        <w:t>Rädle</w:t>
+      </w:r>
+      <w:proofErr w:type="spellEnd"/>
+      <w:r>
+        <w:t xml:space="preserve">, V., Kersting, A., Schmidt, M., </w:t>
+      </w:r>
+      <w:proofErr w:type="spellStart"/>
+      <w:r>
         <w:t>Ringena</w:t>
       </w:r>
       <w:proofErr w:type="spellEnd"/>
@@ -12196,7 +12305,7 @@
       <w:r>
         <w:t xml:space="preserve">. Water Resources Research, 58. </w:t>
       </w:r>
-      <w:hyperlink r:id="rId53" w:history="1">
+      <w:hyperlink r:id="rId51" w:history="1">
         <w:r>
           <w:rPr>
             <w:rStyle w:val="Hyperlink"/>
@@ -12224,7 +12333,7 @@
       <w:r>
         <w:t xml:space="preserve">, V. J., Ghosh, A., Chakravorty, B., Krause, S., Polya, D., &amp; Gooddy, D. (2022). Environmental tracers and groundwater residence time indicators reveal controls of arsenic accumulation rates beneath a rapidly developing urban area in Patna, India. Journal of Contaminant Hydrology, 249, 104043. </w:t>
       </w:r>
-      <w:hyperlink r:id="rId54" w:history="1">
+      <w:hyperlink r:id="rId52" w:history="1">
         <w:r>
           <w:rPr>
             <w:rStyle w:val="Hyperlink"/>
@@ -12252,7 +12361,7 @@
       <w:r>
         <w:t xml:space="preserve"> spaces. Compositionality, 2. </w:t>
       </w:r>
-      <w:hyperlink r:id="rId55" w:history="1">
+      <w:hyperlink r:id="rId53" w:history="1">
         <w:r>
           <w:rPr>
             <w:rStyle w:val="Hyperlink"/>
@@ -12317,7 +12426,7 @@
       <w:r>
         <w:t xml:space="preserve"> Cretaceous Basin (Southeastern Morocco). Water, 14, 1747. </w:t>
       </w:r>
-      <w:hyperlink r:id="rId56" w:history="1">
+      <w:hyperlink r:id="rId54" w:history="1">
         <w:r>
           <w:rPr>
             <w:rStyle w:val="Hyperlink"/>
@@ -12370,15 +12479,28 @@
         </w:rPr>
         <w:t xml:space="preserve">Hydrological Sciences Journal, 65, 951–968. </w:t>
       </w:r>
-      <w:hyperlink r:id="rId57" w:history="1">
-        <w:r>
-          <w:rPr>
-            <w:rStyle w:val="Hyperlink"/>
-            <w:lang w:val="it-IT"/>
-          </w:rPr>
-          <w:t>https://doi.org/10.1080/02626667.2019.1708914</w:t>
-        </w:r>
-      </w:hyperlink>
+      <w:r>
+        <w:fldChar w:fldCharType="begin"/>
+      </w:r>
+      <w:r>
+        <w:rPr>
+          <w:lang w:val="it-IT"/>
+        </w:rPr>
+        <w:instrText>HYPERLINK "https://doi.org/10.1080/02626667.2019.1708914"</w:instrText>
+      </w:r>
+      <w:r>
+        <w:fldChar w:fldCharType="separate"/>
+      </w:r>
+      <w:r>
+        <w:rPr>
+          <w:rStyle w:val="Hyperlink"/>
+          <w:lang w:val="it-IT"/>
+        </w:rPr>
+        <w:t>https://doi.org/10.1080/02626667.2019.1708914</w:t>
+      </w:r>
+      <w:r>
+        <w:fldChar w:fldCharType="end"/>
+      </w:r>
       <w:r>
         <w:rPr>
           <w:lang w:val="it-IT"/>
@@ -12400,7 +12522,7 @@
       <w:r>
         <w:t xml:space="preserve">Probabilistic identification of preferential groundwater networks. Journal of Hydrology, 610, 127906. </w:t>
       </w:r>
-      <w:hyperlink r:id="rId58" w:history="1">
+      <w:hyperlink r:id="rId55" w:history="1">
         <w:r>
           <w:rPr>
             <w:rStyle w:val="Hyperlink"/>
@@ -12431,7 +12553,7 @@
       <w:r>
         <w:t xml:space="preserve">, C. E., Zappala, J. C., Mueller, P., Jurgens, B. C., &amp; Kulongoski, J. T. (2021). Groundwater residence time estimates obscured by anthropogenic carbonate. Science Advances, 7. </w:t>
       </w:r>
-      <w:hyperlink r:id="rId59" w:history="1">
+      <w:hyperlink r:id="rId56" w:history="1">
         <w:r>
           <w:rPr>
             <w:rStyle w:val="Hyperlink"/>
@@ -12469,7 +12591,7 @@
       <w:r>
         <w:t xml:space="preserve"> of chemical and isotopic data. Hydrology and Earth System Sciences, 21, 1669–1691. </w:t>
       </w:r>
-      <w:hyperlink r:id="rId60" w:history="1">
+      <w:hyperlink r:id="rId57" w:history="1">
         <w:r>
           <w:rPr>
             <w:rStyle w:val="Hyperlink"/>
@@ -12500,38 +12622,15 @@
         <w:t xml:space="preserve">Hydrological Processes, 36(1), e14464. </w:t>
       </w:r>
       <w:r>
+        <w:fldChar w:fldCharType="begin"/>
+      </w:r>
+      <w:r>
         <w:rPr>
           <w:lang w:val="it-IT"/>
         </w:rPr>
-        <w:fldChar w:fldCharType="begin"/>
-      </w:r>
-      <w:r>
-        <w:rPr>
-          <w:lang w:val="it-IT"/>
-        </w:rPr>
-        <w:instrText>HYPERLINK "</w:instrText>
-      </w:r>
-      <w:r>
-        <w:rPr>
-          <w:lang w:val="it-IT"/>
-        </w:rPr>
-        <w:instrText>https://doi.org/10.1002/hyp.14464</w:instrText>
-      </w:r>
-      <w:r>
-        <w:rPr>
-          <w:lang w:val="it-IT"/>
-        </w:rPr>
-        <w:instrText>"</w:instrText>
-      </w:r>
-      <w:r>
-        <w:rPr>
-          <w:lang w:val="it-IT"/>
-        </w:rPr>
-      </w:r>
-      <w:r>
-        <w:rPr>
-          <w:lang w:val="it-IT"/>
-        </w:rPr>
+        <w:instrText>HYPERLINK "https://doi.org/10.1002/hyp.14464"</w:instrText>
+      </w:r>
+      <w:r>
         <w:fldChar w:fldCharType="separate"/>
       </w:r>
       <w:r>
@@ -12542,9 +12641,6 @@
         <w:t>https://doi.org/10.1002/hyp.14464</w:t>
       </w:r>
       <w:r>
-        <w:rPr>
-          <w:lang w:val="it-IT"/>
-        </w:rPr>
         <w:fldChar w:fldCharType="end"/>
       </w:r>
       <w:r>
@@ -12576,7 +12672,7 @@
       <w:r>
         <w:t xml:space="preserve">, 10. </w:t>
       </w:r>
-      <w:hyperlink r:id="rId61" w:history="1">
+      <w:hyperlink r:id="rId58" w:history="1">
         <w:r>
           <w:rPr>
             <w:rStyle w:val="Hyperlink"/>
@@ -12596,7 +12692,7 @@
       <w:r>
         <w:t xml:space="preserve">Sun, Y., Wang, L., Zhang, Q., &amp; Dong, Y. (2025). Recharge sources and flow pathways of karst groundwater in the Yuquan Mountain Spring catchment area, Beijing: A synthesis based on isotope, tracers, and geophysical evidence. Water, 17, 2292. </w:t>
       </w:r>
-      <w:hyperlink r:id="rId62" w:history="1">
+      <w:hyperlink r:id="rId59" w:history="1">
         <w:r>
           <w:rPr>
             <w:rStyle w:val="Hyperlink"/>
@@ -12629,7 +12725,7 @@
       <w:r>
         <w:t xml:space="preserve">, P. (2024). Spatial-temporal graph neural networks for groundwater data. Scientific Reports, 14. </w:t>
       </w:r>
-      <w:hyperlink r:id="rId63" w:history="1">
+      <w:hyperlink r:id="rId60" w:history="1">
         <w:r>
           <w:rPr>
             <w:rStyle w:val="Hyperlink"/>
@@ -12649,7 +12745,7 @@
       <w:r>
         <w:t xml:space="preserve">Teeple, A. P., Ging, P. B., Thomas, J. V., Wallace, D. S., &amp; Payne, J. D. (2021). Hydrogeologic framework, geochemistry, groundwater-flow system, and aquifer hydraulic properties used in the development of a conceptual model of the Ogallala, Edwards-Trinity (High Plains), and Dockum aquifers in and near Gaines, Terry, and Yoakum Counties, Texas. U.S. Geological Survey Scientific Investigations Report. </w:t>
       </w:r>
-      <w:hyperlink r:id="rId64" w:history="1">
+      <w:hyperlink r:id="rId61" w:history="1">
         <w:r>
           <w:rPr>
             <w:rStyle w:val="Hyperlink"/>
@@ -12682,7 +12778,7 @@
       <w:r>
         <w:t xml:space="preserve">-Woodburn, E. R., Dennedy-Frank, P. J., Williams, K. H., &amp; Gardner, W. P. (2023). Constraining bedrock groundwater residence times in a mountain system with environmental tracer observations and Bayesian uncertainty quantification. Water Resources Research, 59, e2022WR033282. </w:t>
       </w:r>
-      <w:hyperlink r:id="rId65" w:history="1">
+      <w:hyperlink r:id="rId62" w:history="1">
         <w:r>
           <w:rPr>
             <w:rStyle w:val="Hyperlink"/>
@@ -12702,7 +12798,7 @@
       <w:r>
         <w:t xml:space="preserve">Villegas, P., Paredes, V., Betancur, T., Taupin, J., &amp; Toro, L. E. (2018). Groundwater evolution and mean water age inferred from hydrochemical and isotopic tracers in a tropical confined aquifer. Hydrological Processes, 32, 2158–2175. </w:t>
       </w:r>
-      <w:hyperlink r:id="rId66" w:history="1">
+      <w:hyperlink r:id="rId63" w:history="1">
         <w:r>
           <w:rPr>
             <w:rStyle w:val="Hyperlink"/>
@@ -12722,7 +12818,7 @@
       <w:r>
         <w:t xml:space="preserve">Viswanathan, H. S., Hyman, J. D., Karra, S., O’Malley, D., Srinivasan, S., Hagberg, A., &amp; Srinivasan, G. (2018). Advancing graph-based algorithms for predicting flow and transport in fractured rock. Water Resources Research, 54(9), 6085–6099. </w:t>
       </w:r>
-      <w:hyperlink r:id="rId67" w:history="1">
+      <w:hyperlink r:id="rId64" w:history="1">
         <w:r>
           <w:rPr>
             <w:rStyle w:val="Hyperlink"/>
@@ -12742,7 +12838,7 @@
       <w:r>
         <w:t xml:space="preserve">Wang, M., Fang, J., Feng, F., Yao, T., Shan, Y., &amp; Su, W. (2025). Geological and anthropogenic factors jointly influence hydrochemical interactions between groundwater and surface water in the middle and lower Yellow River. ACS Omega, 10, 48034–48050. </w:t>
       </w:r>
-      <w:hyperlink r:id="rId68" w:history="1">
+      <w:hyperlink r:id="rId65" w:history="1">
         <w:r>
           <w:rPr>
             <w:rStyle w:val="Hyperlink"/>
@@ -12770,7 +12866,7 @@
       <w:r>
         <w:t xml:space="preserve"> Basin, northwestern China. Hydrology and Earth System Sciences, 22, 4381–4400. </w:t>
       </w:r>
-      <w:hyperlink r:id="rId69" w:history="1">
+      <w:hyperlink r:id="rId66" w:history="1">
         <w:r>
           <w:rPr>
             <w:rStyle w:val="Hyperlink"/>
@@ -12798,7 +12894,7 @@
       <w:r>
         <w:t xml:space="preserve">, Northwestern China. Water, 10, 1667. </w:t>
       </w:r>
-      <w:hyperlink r:id="rId70" w:history="1">
+      <w:hyperlink r:id="rId67" w:history="1">
         <w:r>
           <w:rPr>
             <w:rStyle w:val="Hyperlink"/>
@@ -12818,7 +12914,7 @@
       <w:r>
         <w:t xml:space="preserve">Zhang, X., Zhu, Y., Wang, J., Ju, L., Qian, Y., Ye, M., &amp; Yang, J. (2022). GW-PINN: A deep learning algorithm for solving groundwater flow equations. Advances in Water Resources, 165, 104243. </w:t>
       </w:r>
-      <w:hyperlink r:id="rId71" w:history="1">
+      <w:hyperlink r:id="rId68" w:history="1">
         <w:r>
           <w:rPr>
             <w:rStyle w:val="Hyperlink"/>
@@ -12837,7 +12933,7 @@
           <w:bCs/>
         </w:rPr>
         <w:sectPr>
-          <w:footerReference w:type="default" r:id="rId72"/>
+          <w:footerReference w:type="default" r:id="rId69"/>
           <w:pgSz w:w="11906" w:h="16838"/>
           <w:pgMar w:top="1440" w:right="1440" w:bottom="1440" w:left="1440" w:header="708" w:footer="708" w:gutter="0"/>
           <w:lnNumType w:countBy="1" w:restart="continuous"/>
@@ -17022,6 +17118,15 @@
       </w:tr>
     </w:tbl>
     <w:p/>
+    <w:p>
+      <w:pPr>
+        <w:spacing w:after="0"/>
+        <w:jc w:val="left"/>
+      </w:pPr>
+      <w:r>
+        <w:br w:type="page"/>
+      </w:r>
+    </w:p>
     <w:p/>
     <w:p>
       <w:r>
@@ -17036,28 +17141,38 @@
     </w:p>
     <w:tbl>
       <w:tblPr>
-        <w:tblStyle w:val="Style1"/>
+        <w:tblStyle w:val="Manu"/>
         <w:tblW w:w="0" w:type="auto"/>
         <w:tblLook w:val="04A0" w:firstRow="1" w:lastRow="0" w:firstColumn="1" w:lastColumn="0" w:noHBand="0" w:noVBand="1"/>
       </w:tblPr>
       <w:tblGrid>
-        <w:gridCol w:w="1603"/>
-        <w:gridCol w:w="2630"/>
+        <w:gridCol w:w="1590"/>
+        <w:gridCol w:w="2710"/>
         <w:gridCol w:w="1922"/>
         <w:gridCol w:w="2009"/>
-        <w:gridCol w:w="1745"/>
+        <w:gridCol w:w="1705"/>
       </w:tblGrid>
       <w:tr>
         <w:trPr>
           <w:cnfStyle w:val="100000000000" w:firstRow="1" w:lastRow="0" w:firstColumn="0" w:lastColumn="0" w:oddVBand="0" w:evenVBand="0" w:oddHBand="0" w:evenHBand="0" w:firstRowFirstColumn="0" w:firstRowLastColumn="0" w:lastRowFirstColumn="0" w:lastRowLastColumn="0"/>
-          <w:tblHeader/>
         </w:trPr>
         <w:tc>
           <w:tcPr>
             <w:tcW w:w="1401" w:type="dxa"/>
           </w:tcPr>
           <w:p>
-            <w:r>
+            <w:pPr>
+              <w:spacing w:after="0"/>
+              <w:rPr>
+                <w:i w:val="0"/>
+                <w:iCs/>
+              </w:rPr>
+            </w:pPr>
+            <w:r>
+              <w:rPr>
+                <w:i w:val="0"/>
+                <w:iCs/>
+              </w:rPr>
               <w:t>Validation tier</w:t>
             </w:r>
           </w:p>
@@ -17067,7 +17182,18 @@
             <w:tcW w:w="2086" w:type="dxa"/>
           </w:tcPr>
           <w:p>
-            <w:r>
+            <w:pPr>
+              <w:spacing w:after="0"/>
+              <w:rPr>
+                <w:i w:val="0"/>
+                <w:iCs/>
+              </w:rPr>
+            </w:pPr>
+            <w:r>
+              <w:rPr>
+                <w:i w:val="0"/>
+                <w:iCs/>
+              </w:rPr>
               <w:t>Dataset/source</w:t>
             </w:r>
           </w:p>
@@ -17077,7 +17203,18 @@
             <w:tcW w:w="1922" w:type="dxa"/>
           </w:tcPr>
           <w:p>
-            <w:r>
+            <w:pPr>
+              <w:spacing w:after="0"/>
+              <w:rPr>
+                <w:i w:val="0"/>
+                <w:iCs/>
+              </w:rPr>
+            </w:pPr>
+            <w:r>
+              <w:rPr>
+                <w:i w:val="0"/>
+                <w:iCs/>
+              </w:rPr>
               <w:t>What is tested</w:t>
             </w:r>
           </w:p>
@@ -17087,7 +17224,18 @@
             <w:tcW w:w="2009" w:type="dxa"/>
           </w:tcPr>
           <w:p>
-            <w:r>
+            <w:pPr>
+              <w:spacing w:after="0"/>
+              <w:rPr>
+                <w:i w:val="0"/>
+                <w:iCs/>
+              </w:rPr>
+            </w:pPr>
+            <w:r>
+              <w:rPr>
+                <w:i w:val="0"/>
+                <w:iCs/>
+              </w:rPr>
               <w:t>Reference/target</w:t>
             </w:r>
           </w:p>
@@ -17097,7 +17245,18 @@
             <w:tcW w:w="1387" w:type="dxa"/>
           </w:tcPr>
           <w:p>
-            <w:r>
+            <w:pPr>
+              <w:spacing w:after="0"/>
+              <w:rPr>
+                <w:i w:val="0"/>
+                <w:iCs/>
+              </w:rPr>
+            </w:pPr>
+            <w:r>
+              <w:rPr>
+                <w:i w:val="0"/>
+                <w:iCs/>
+              </w:rPr>
               <w:t>Main metric</w:t>
             </w:r>
           </w:p>
@@ -17109,7 +17268,18 @@
             <w:tcW w:w="1401" w:type="dxa"/>
           </w:tcPr>
           <w:p>
-            <w:r>
+            <w:pPr>
+              <w:spacing w:after="0"/>
+              <w:rPr>
+                <w:i w:val="0"/>
+                <w:iCs/>
+              </w:rPr>
+            </w:pPr>
+            <w:r>
+              <w:rPr>
+                <w:i w:val="0"/>
+                <w:iCs/>
+              </w:rPr>
               <w:t>Synthetic benchmark</w:t>
             </w:r>
           </w:p>
@@ -17119,9 +17289,29 @@
             <w:tcW w:w="2086" w:type="dxa"/>
           </w:tcPr>
           <w:p>
-            <w:r>
-              <w:t>100 locked realisations</w:t>
-            </w:r>
+            <w:pPr>
+              <w:spacing w:after="0"/>
+              <w:rPr>
+                <w:i w:val="0"/>
+                <w:iCs/>
+              </w:rPr>
+            </w:pPr>
+            <w:r>
+              <w:rPr>
+                <w:i w:val="0"/>
+                <w:iCs/>
+              </w:rPr>
+              <w:t xml:space="preserve">100 locked </w:t>
+            </w:r>
+            <w:proofErr w:type="spellStart"/>
+            <w:r>
+              <w:rPr>
+                <w:i w:val="0"/>
+                <w:iCs/>
+              </w:rPr>
+              <w:t>realisations</w:t>
+            </w:r>
+            <w:proofErr w:type="spellEnd"/>
           </w:p>
         </w:tc>
         <w:tc>
@@ -17129,7 +17319,18 @@
             <w:tcW w:w="1922" w:type="dxa"/>
           </w:tcPr>
           <w:p>
-            <w:r>
+            <w:pPr>
+              <w:spacing w:after="0"/>
+              <w:rPr>
+                <w:i w:val="0"/>
+                <w:iCs/>
+              </w:rPr>
+            </w:pPr>
+            <w:r>
+              <w:rPr>
+                <w:i w:val="0"/>
+                <w:iCs/>
+              </w:rPr>
               <w:t>transport, reaction and chemistry recovery</w:t>
             </w:r>
           </w:p>
@@ -17139,7 +17340,18 @@
             <w:tcW w:w="2009" w:type="dxa"/>
           </w:tcPr>
           <w:p>
-            <w:r>
+            <w:pPr>
+              <w:spacing w:after="0"/>
+              <w:rPr>
+                <w:i w:val="0"/>
+                <w:iCs/>
+              </w:rPr>
+            </w:pPr>
+            <w:r>
+              <w:rPr>
+                <w:i w:val="0"/>
+                <w:iCs/>
+              </w:rPr>
               <w:t>known truth</w:t>
             </w:r>
           </w:p>
@@ -17149,7 +17361,18 @@
             <w:tcW w:w="1387" w:type="dxa"/>
           </w:tcPr>
           <w:p>
-            <w:r>
+            <w:pPr>
+              <w:spacing w:after="0"/>
+              <w:rPr>
+                <w:i w:val="0"/>
+                <w:iCs/>
+              </w:rPr>
+            </w:pPr>
+            <w:r>
+              <w:rPr>
+                <w:i w:val="0"/>
+                <w:iCs/>
+              </w:rPr>
               <w:t>chemistry R2=0.955; transport median AE=0.056; reaction median AE=0.050</w:t>
             </w:r>
           </w:p>
@@ -17161,7 +17384,18 @@
             <w:tcW w:w="1401" w:type="dxa"/>
           </w:tcPr>
           <w:p>
-            <w:r>
+            <w:pPr>
+              <w:spacing w:after="0"/>
+              <w:rPr>
+                <w:i w:val="0"/>
+                <w:iCs/>
+              </w:rPr>
+            </w:pPr>
+            <w:r>
+              <w:rPr>
+                <w:i w:val="0"/>
+                <w:iCs/>
+              </w:rPr>
               <w:t>Public-age parity</w:t>
             </w:r>
           </w:p>
@@ -17171,7 +17405,18 @@
             <w:tcW w:w="2086" w:type="dxa"/>
           </w:tcPr>
           <w:p>
-            <w:r>
+            <w:pPr>
+              <w:spacing w:after="0"/>
+              <w:rPr>
+                <w:i w:val="0"/>
+                <w:iCs/>
+              </w:rPr>
+            </w:pPr>
+            <w:r>
+              <w:rPr>
+                <w:i w:val="0"/>
+                <w:iCs/>
+              </w:rPr>
               <w:t>USGS public-supply age release; M3 age-fraction parity</w:t>
             </w:r>
           </w:p>
@@ -17181,7 +17426,18 @@
             <w:tcW w:w="1922" w:type="dxa"/>
           </w:tcPr>
           <w:p>
-            <w:r>
+            <w:pPr>
+              <w:spacing w:after="0"/>
+              <w:rPr>
+                <w:i w:val="0"/>
+                <w:iCs/>
+              </w:rPr>
+            </w:pPr>
+            <w:r>
+              <w:rPr>
+                <w:i w:val="0"/>
+                <w:iCs/>
+              </w:rPr>
               <w:t>reported age and age-fraction agreement</w:t>
             </w:r>
           </w:p>
@@ -17191,7 +17447,18 @@
             <w:tcW w:w="2009" w:type="dxa"/>
           </w:tcPr>
           <w:p>
-            <w:r>
+            <w:pPr>
+              <w:spacing w:after="0"/>
+              <w:rPr>
+                <w:i w:val="0"/>
+                <w:iCs/>
+              </w:rPr>
+            </w:pPr>
+            <w:r>
+              <w:rPr>
+                <w:i w:val="0"/>
+                <w:iCs/>
+              </w:rPr>
               <w:t>USGS reported model outputs</w:t>
             </w:r>
           </w:p>
@@ -17201,7 +17468,18 @@
             <w:tcW w:w="1387" w:type="dxa"/>
           </w:tcPr>
           <w:p>
-            <w:r>
+            <w:pPr>
+              <w:spacing w:after="0"/>
+              <w:rPr>
+                <w:i w:val="0"/>
+                <w:iCs/>
+              </w:rPr>
+            </w:pPr>
+            <w:r>
+              <w:rPr>
+                <w:i w:val="0"/>
+                <w:iCs/>
+              </w:rPr>
               <w:t>n=1272; R2=0.71; median |log10 error|=0.17; factor 2=61.4%</w:t>
             </w:r>
           </w:p>
@@ -17213,7 +17491,18 @@
             <w:tcW w:w="1401" w:type="dxa"/>
           </w:tcPr>
           <w:p>
-            <w:r>
+            <w:pPr>
+              <w:spacing w:after="0"/>
+              <w:rPr>
+                <w:i w:val="0"/>
+                <w:iCs/>
+              </w:rPr>
+            </w:pPr>
+            <w:r>
+              <w:rPr>
+                <w:i w:val="0"/>
+                <w:iCs/>
+              </w:rPr>
               <w:t>MODPATH topology</w:t>
             </w:r>
           </w:p>
@@ -17223,7 +17512,18 @@
             <w:tcW w:w="2086" w:type="dxa"/>
           </w:tcPr>
           <w:p>
-            <w:r>
+            <w:pPr>
+              <w:spacing w:after="0"/>
+              <w:rPr>
+                <w:i w:val="0"/>
+                <w:iCs/>
+              </w:rPr>
+            </w:pPr>
+            <w:r>
+              <w:rPr>
+                <w:i w:val="0"/>
+                <w:iCs/>
+              </w:rPr>
               <w:t>USGS Savage MODFLOW/MODPATH archive</w:t>
             </w:r>
           </w:p>
@@ -17233,7 +17533,18 @@
             <w:tcW w:w="1922" w:type="dxa"/>
           </w:tcPr>
           <w:p>
-            <w:r>
+            <w:pPr>
+              <w:spacing w:after="0"/>
+              <w:rPr>
+                <w:i w:val="0"/>
+                <w:iCs/>
+              </w:rPr>
+            </w:pPr>
+            <w:r>
+              <w:rPr>
+                <w:i w:val="0"/>
+                <w:iCs/>
+              </w:rPr>
               <w:t>directed-edge recovery</w:t>
             </w:r>
           </w:p>
@@ -17243,7 +17554,18 @@
             <w:tcW w:w="2009" w:type="dxa"/>
           </w:tcPr>
           <w:p>
-            <w:r>
+            <w:pPr>
+              <w:spacing w:after="0"/>
+              <w:rPr>
+                <w:i w:val="0"/>
+                <w:iCs/>
+              </w:rPr>
+            </w:pPr>
+            <w:r>
+              <w:rPr>
+                <w:i w:val="0"/>
+                <w:iCs/>
+              </w:rPr>
               <w:t>MODPATH edges</w:t>
             </w:r>
           </w:p>
@@ -17253,7 +17575,18 @@
             <w:tcW w:w="1387" w:type="dxa"/>
           </w:tcPr>
           <w:p>
-            <w:r>
+            <w:pPr>
+              <w:spacing w:after="0"/>
+              <w:rPr>
+                <w:i w:val="0"/>
+                <w:iCs/>
+              </w:rPr>
+            </w:pPr>
+            <w:r>
+              <w:rPr>
+                <w:i w:val="0"/>
+                <w:iCs/>
+              </w:rPr>
               <w:t>prior-assisted F1=1.00; no-prior F1=0.618 (P=0.487, R=0.845)</w:t>
             </w:r>
           </w:p>
@@ -17265,8 +17598,18 @@
             <w:tcW w:w="1401" w:type="dxa"/>
           </w:tcPr>
           <w:p>
-            <w:r>
-              <w:lastRenderedPageBreak/>
+            <w:pPr>
+              <w:spacing w:after="0"/>
+              <w:rPr>
+                <w:i w:val="0"/>
+                <w:iCs/>
+              </w:rPr>
+            </w:pPr>
+            <w:r>
+              <w:rPr>
+                <w:i w:val="0"/>
+                <w:iCs/>
+              </w:rPr>
               <w:t>PHREEQC-compatible proxy</w:t>
             </w:r>
           </w:p>
@@ -17276,7 +17619,18 @@
             <w:tcW w:w="2086" w:type="dxa"/>
           </w:tcPr>
           <w:p>
-            <w:r>
+            <w:pPr>
+              <w:spacing w:after="0"/>
+              <w:rPr>
+                <w:i w:val="0"/>
+                <w:iCs/>
+              </w:rPr>
+            </w:pPr>
+            <w:r>
+              <w:rPr>
+                <w:i w:val="0"/>
+                <w:iCs/>
+              </w:rPr>
               <w:t>locked saturation fields</w:t>
             </w:r>
           </w:p>
@@ -17286,7 +17640,18 @@
             <w:tcW w:w="1922" w:type="dxa"/>
           </w:tcPr>
           <w:p>
-            <w:r>
+            <w:pPr>
+              <w:spacing w:after="0"/>
+              <w:rPr>
+                <w:i w:val="0"/>
+                <w:iCs/>
+              </w:rPr>
+            </w:pPr>
+            <w:r>
+              <w:rPr>
+                <w:i w:val="0"/>
+                <w:iCs/>
+              </w:rPr>
               <w:t>forward feasibility</w:t>
             </w:r>
           </w:p>
@@ -17296,7 +17661,18 @@
             <w:tcW w:w="2009" w:type="dxa"/>
           </w:tcPr>
           <w:p>
-            <w:r>
+            <w:pPr>
+              <w:spacing w:after="0"/>
+              <w:rPr>
+                <w:i w:val="0"/>
+                <w:iCs/>
+              </w:rPr>
+            </w:pPr>
+            <w:r>
+              <w:rPr>
+                <w:i w:val="0"/>
+                <w:iCs/>
+              </w:rPr>
               <w:t>mass-balance proxy</w:t>
             </w:r>
           </w:p>
@@ -17306,7 +17682,18 @@
             <w:tcW w:w="1387" w:type="dxa"/>
           </w:tcPr>
           <w:p>
-            <w:r>
+            <w:pPr>
+              <w:spacing w:after="0"/>
+              <w:rPr>
+                <w:i w:val="0"/>
+                <w:iCs/>
+              </w:rPr>
+            </w:pPr>
+            <w:r>
+              <w:rPr>
+                <w:i w:val="0"/>
+                <w:iCs/>
+              </w:rPr>
               <w:t>feasible=0.891; median RMSE=0.062 mmol/L; median NSE=0.999; live PHREEQC pending</w:t>
             </w:r>
           </w:p>
@@ -17318,7 +17705,18 @@
             <w:tcW w:w="1401" w:type="dxa"/>
           </w:tcPr>
           <w:p>
-            <w:r>
+            <w:pPr>
+              <w:spacing w:after="0"/>
+              <w:rPr>
+                <w:i w:val="0"/>
+                <w:iCs/>
+              </w:rPr>
+            </w:pPr>
+            <w:r>
+              <w:rPr>
+                <w:i w:val="0"/>
+                <w:iCs/>
+              </w:rPr>
               <w:t>Ghana field demonstration</w:t>
             </w:r>
           </w:p>
@@ -17328,9 +17726,29 @@
             <w:tcW w:w="2086" w:type="dxa"/>
           </w:tcPr>
           <w:p>
-            <w:r>
-              <w:t>Lower Anayari/Talensi</w:t>
-            </w:r>
+            <w:pPr>
+              <w:spacing w:after="0"/>
+              <w:rPr>
+                <w:i w:val="0"/>
+                <w:iCs/>
+              </w:rPr>
+            </w:pPr>
+            <w:r>
+              <w:rPr>
+                <w:i w:val="0"/>
+                <w:iCs/>
+              </w:rPr>
+              <w:t>Lower Anayari/</w:t>
+            </w:r>
+            <w:proofErr w:type="spellStart"/>
+            <w:r>
+              <w:rPr>
+                <w:i w:val="0"/>
+                <w:iCs/>
+              </w:rPr>
+              <w:t>Talensi</w:t>
+            </w:r>
+            <w:proofErr w:type="spellEnd"/>
           </w:p>
         </w:tc>
         <w:tc>
@@ -17338,7 +17756,18 @@
             <w:tcW w:w="1922" w:type="dxa"/>
           </w:tcPr>
           <w:p>
-            <w:r>
+            <w:pPr>
+              <w:spacing w:after="0"/>
+              <w:rPr>
+                <w:i w:val="0"/>
+                <w:iCs/>
+              </w:rPr>
+            </w:pPr>
+            <w:r>
+              <w:rPr>
+                <w:i w:val="0"/>
+                <w:iCs/>
+              </w:rPr>
               <w:t>generated-graph process discovery</w:t>
             </w:r>
           </w:p>
@@ -17348,7 +17777,18 @@
             <w:tcW w:w="2009" w:type="dxa"/>
           </w:tcPr>
           <w:p>
-            <w:r>
+            <w:pPr>
+              <w:spacing w:after="0"/>
+              <w:rPr>
+                <w:i w:val="0"/>
+                <w:iCs/>
+              </w:rPr>
+            </w:pPr>
+            <w:r>
+              <w:rPr>
+                <w:i w:val="0"/>
+                <w:iCs/>
+              </w:rPr>
               <w:t>hydrochemical consistency only</w:t>
             </w:r>
           </w:p>
@@ -17358,7 +17798,18 @@
             <w:tcW w:w="1387" w:type="dxa"/>
           </w:tcPr>
           <w:p>
-            <w:r>
+            <w:pPr>
+              <w:spacing w:after="0"/>
+              <w:rPr>
+                <w:i w:val="0"/>
+                <w:iCs/>
+              </w:rPr>
+            </w:pPr>
+            <w:r>
+              <w:rPr>
+                <w:i w:val="0"/>
+                <w:iCs/>
+              </w:rPr>
               <w:t>208 edges; overall median R2=0.711; no independent process truth</w:t>
             </w:r>
           </w:p>
@@ -17370,6 +17821,15 @@
     <w:p/>
     <w:p/>
     <w:p/>
+    <w:p>
+      <w:pPr>
+        <w:spacing w:after="0"/>
+        <w:jc w:val="left"/>
+      </w:pPr>
+      <w:r>
+        <w:br w:type="page"/>
+      </w:r>
+    </w:p>
     <w:p/>
     <w:p>
       <w:r>
@@ -18400,13 +18860,13 @@
         <w:tblLook w:val="04A0" w:firstRow="1" w:lastRow="0" w:firstColumn="1" w:lastColumn="0" w:noHBand="0" w:noVBand="1"/>
       </w:tblPr>
       <w:tblGrid>
-        <w:gridCol w:w="1821"/>
-        <w:gridCol w:w="1509"/>
-        <w:gridCol w:w="1732"/>
-        <w:gridCol w:w="843"/>
+        <w:gridCol w:w="1843"/>
+        <w:gridCol w:w="1510"/>
+        <w:gridCol w:w="1730"/>
+        <w:gridCol w:w="829"/>
         <w:gridCol w:w="923"/>
-        <w:gridCol w:w="1543"/>
-        <w:gridCol w:w="2095"/>
+        <w:gridCol w:w="1545"/>
+        <w:gridCol w:w="2086"/>
       </w:tblGrid>
       <w:tr>
         <w:trPr>
@@ -18419,8 +18879,18 @@
             <w:tcW w:w="0" w:type="auto"/>
           </w:tcPr>
           <w:p>
-            <w:r>
-              <w:lastRenderedPageBreak/>
+            <w:pPr>
+              <w:spacing w:after="0"/>
+              <w:rPr>
+                <w:i w:val="0"/>
+                <w:iCs/>
+              </w:rPr>
+            </w:pPr>
+            <w:r>
+              <w:rPr>
+                <w:i w:val="0"/>
+                <w:iCs/>
+              </w:rPr>
               <w:t>Validation group</w:t>
             </w:r>
           </w:p>
@@ -18430,7 +18900,18 @@
             <w:tcW w:w="0" w:type="auto"/>
           </w:tcPr>
           <w:p>
-            <w:r>
+            <w:pPr>
+              <w:spacing w:after="0"/>
+              <w:rPr>
+                <w:i w:val="0"/>
+                <w:iCs/>
+              </w:rPr>
+            </w:pPr>
+            <w:r>
+              <w:rPr>
+                <w:i w:val="0"/>
+                <w:iCs/>
+              </w:rPr>
               <w:t>Reference age range (y)</w:t>
             </w:r>
           </w:p>
@@ -18440,8 +18921,28 @@
             <w:tcW w:w="0" w:type="auto"/>
           </w:tcPr>
           <w:p>
-            <w:r>
-              <w:t>Hydrosheaf inferred range (y)</w:t>
+            <w:pPr>
+              <w:spacing w:after="0"/>
+              <w:rPr>
+                <w:i w:val="0"/>
+                <w:iCs/>
+              </w:rPr>
+            </w:pPr>
+            <w:proofErr w:type="spellStart"/>
+            <w:r>
+              <w:rPr>
+                <w:i w:val="0"/>
+                <w:iCs/>
+              </w:rPr>
+              <w:t>Hydrosheaf</w:t>
+            </w:r>
+            <w:proofErr w:type="spellEnd"/>
+            <w:r>
+              <w:rPr>
+                <w:i w:val="0"/>
+                <w:iCs/>
+              </w:rPr>
+              <w:t xml:space="preserve"> inferred range (y)</w:t>
             </w:r>
           </w:p>
         </w:tc>
@@ -18450,8 +18951,27 @@
             <w:tcW w:w="0" w:type="auto"/>
           </w:tcPr>
           <w:p>
-            <w:r>
-              <w:t>R2</w:t>
+            <w:pPr>
+              <w:spacing w:after="0"/>
+              <w:rPr>
+                <w:i w:val="0"/>
+                <w:iCs/>
+              </w:rPr>
+            </w:pPr>
+            <w:r>
+              <w:rPr>
+                <w:i w:val="0"/>
+                <w:iCs/>
+              </w:rPr>
+              <w:t>R</w:t>
+            </w:r>
+            <w:r>
+              <w:rPr>
+                <w:i w:val="0"/>
+                <w:iCs/>
+                <w:vertAlign w:val="superscript"/>
+              </w:rPr>
+              <w:t>2</w:t>
             </w:r>
           </w:p>
         </w:tc>
@@ -18460,7 +18980,18 @@
             <w:tcW w:w="0" w:type="auto"/>
           </w:tcPr>
           <w:p>
-            <w:r>
+            <w:pPr>
+              <w:spacing w:after="0"/>
+              <w:rPr>
+                <w:i w:val="0"/>
+                <w:iCs/>
+              </w:rPr>
+            </w:pPr>
+            <w:r>
+              <w:rPr>
+                <w:i w:val="0"/>
+                <w:iCs/>
+              </w:rPr>
               <w:t>MAE (y)</w:t>
             </w:r>
           </w:p>
@@ -18470,7 +19001,18 @@
             <w:tcW w:w="0" w:type="auto"/>
           </w:tcPr>
           <w:p>
-            <w:r>
+            <w:pPr>
+              <w:spacing w:after="0"/>
+              <w:rPr>
+                <w:i w:val="0"/>
+                <w:iCs/>
+              </w:rPr>
+            </w:pPr>
+            <w:r>
+              <w:rPr>
+                <w:i w:val="0"/>
+                <w:iCs/>
+              </w:rPr>
               <w:t>Age-order consistency</w:t>
             </w:r>
           </w:p>
@@ -18480,7 +19022,18 @@
             <w:tcW w:w="0" w:type="auto"/>
           </w:tcPr>
           <w:p>
-            <w:r>
+            <w:pPr>
+              <w:spacing w:after="0"/>
+              <w:rPr>
+                <w:i w:val="0"/>
+                <w:iCs/>
+              </w:rPr>
+            </w:pPr>
+            <w:r>
+              <w:rPr>
+                <w:i w:val="0"/>
+                <w:iCs/>
+              </w:rPr>
               <w:t>Interpretation</w:t>
             </w:r>
           </w:p>
@@ -18495,7 +19048,18 @@
             <w:tcW w:w="0" w:type="auto"/>
           </w:tcPr>
           <w:p>
-            <w:r>
+            <w:pPr>
+              <w:spacing w:after="0"/>
+              <w:rPr>
+                <w:i w:val="0"/>
+                <w:iCs/>
+              </w:rPr>
+            </w:pPr>
+            <w:r>
+              <w:rPr>
+                <w:i w:val="0"/>
+                <w:iCs/>
+              </w:rPr>
               <w:t>Young/Recharge</w:t>
             </w:r>
           </w:p>
@@ -18505,7 +19069,18 @@
             <w:tcW w:w="0" w:type="auto"/>
           </w:tcPr>
           <w:p>
-            <w:r>
+            <w:pPr>
+              <w:spacing w:after="0"/>
+              <w:rPr>
+                <w:i w:val="0"/>
+                <w:iCs/>
+              </w:rPr>
+            </w:pPr>
+            <w:r>
+              <w:rPr>
+                <w:i w:val="0"/>
+                <w:iCs/>
+              </w:rPr>
               <w:t>5–25</w:t>
             </w:r>
           </w:p>
@@ -18515,7 +19090,18 @@
             <w:tcW w:w="0" w:type="auto"/>
           </w:tcPr>
           <w:p>
-            <w:r>
+            <w:pPr>
+              <w:spacing w:after="0"/>
+              <w:rPr>
+                <w:i w:val="0"/>
+                <w:iCs/>
+              </w:rPr>
+            </w:pPr>
+            <w:r>
+              <w:rPr>
+                <w:i w:val="0"/>
+                <w:iCs/>
+              </w:rPr>
               <w:t>3.7–34.4</w:t>
             </w:r>
           </w:p>
@@ -18525,7 +19111,18 @@
             <w:tcW w:w="0" w:type="auto"/>
           </w:tcPr>
           <w:p>
-            <w:r>
+            <w:pPr>
+              <w:spacing w:after="0"/>
+              <w:rPr>
+                <w:i w:val="0"/>
+                <w:iCs/>
+              </w:rPr>
+            </w:pPr>
+            <w:r>
+              <w:rPr>
+                <w:i w:val="0"/>
+                <w:iCs/>
+              </w:rPr>
               <w:t>0.97</w:t>
             </w:r>
           </w:p>
@@ -18535,7 +19132,18 @@
             <w:tcW w:w="0" w:type="auto"/>
           </w:tcPr>
           <w:p>
-            <w:r>
+            <w:pPr>
+              <w:spacing w:after="0"/>
+              <w:rPr>
+                <w:i w:val="0"/>
+                <w:iCs/>
+              </w:rPr>
+            </w:pPr>
+            <w:r>
+              <w:rPr>
+                <w:i w:val="0"/>
+                <w:iCs/>
+              </w:rPr>
               <w:t>0.81</w:t>
             </w:r>
           </w:p>
@@ -18545,7 +19153,18 @@
             <w:tcW w:w="0" w:type="auto"/>
           </w:tcPr>
           <w:p>
-            <w:r>
+            <w:pPr>
+              <w:spacing w:after="0"/>
+              <w:rPr>
+                <w:i w:val="0"/>
+                <w:iCs/>
+              </w:rPr>
+            </w:pPr>
+            <w:r>
+              <w:rPr>
+                <w:i w:val="0"/>
+                <w:iCs/>
+              </w:rPr>
               <w:t>0.85</w:t>
             </w:r>
           </w:p>
@@ -18555,7 +19174,18 @@
             <w:tcW w:w="0" w:type="auto"/>
           </w:tcPr>
           <w:p>
-            <w:r>
+            <w:pPr>
+              <w:spacing w:after="0"/>
+              <w:rPr>
+                <w:i w:val="0"/>
+                <w:iCs/>
+              </w:rPr>
+            </w:pPr>
+            <w:r>
+              <w:rPr>
+                <w:i w:val="0"/>
+                <w:iCs/>
+              </w:rPr>
               <w:t>synthetic age-class recovery</w:t>
             </w:r>
           </w:p>
@@ -18570,7 +19200,18 @@
             <w:tcW w:w="0" w:type="auto"/>
           </w:tcPr>
           <w:p>
-            <w:r>
+            <w:pPr>
+              <w:spacing w:after="0"/>
+              <w:rPr>
+                <w:i w:val="0"/>
+                <w:iCs/>
+              </w:rPr>
+            </w:pPr>
+            <w:r>
+              <w:rPr>
+                <w:i w:val="0"/>
+                <w:iCs/>
+              </w:rPr>
               <w:t>Intermediate</w:t>
             </w:r>
           </w:p>
@@ -18580,7 +19221,18 @@
             <w:tcW w:w="0" w:type="auto"/>
           </w:tcPr>
           <w:p>
-            <w:r>
+            <w:pPr>
+              <w:spacing w:after="0"/>
+              <w:rPr>
+                <w:i w:val="0"/>
+                <w:iCs/>
+              </w:rPr>
+            </w:pPr>
+            <w:r>
+              <w:rPr>
+                <w:i w:val="0"/>
+                <w:iCs/>
+              </w:rPr>
               <w:t>60–260</w:t>
             </w:r>
           </w:p>
@@ -18590,7 +19242,18 @@
             <w:tcW w:w="0" w:type="auto"/>
           </w:tcPr>
           <w:p>
-            <w:r>
+            <w:pPr>
+              <w:spacing w:after="0"/>
+              <w:rPr>
+                <w:i w:val="0"/>
+                <w:iCs/>
+              </w:rPr>
+            </w:pPr>
+            <w:r>
+              <w:rPr>
+                <w:i w:val="0"/>
+                <w:iCs/>
+              </w:rPr>
               <w:t>38.5–433.3</w:t>
             </w:r>
           </w:p>
@@ -18600,7 +19263,18 @@
             <w:tcW w:w="0" w:type="auto"/>
           </w:tcPr>
           <w:p>
-            <w:r>
+            <w:pPr>
+              <w:spacing w:after="0"/>
+              <w:rPr>
+                <w:i w:val="0"/>
+                <w:iCs/>
+              </w:rPr>
+            </w:pPr>
+            <w:r>
+              <w:rPr>
+                <w:i w:val="0"/>
+                <w:iCs/>
+              </w:rPr>
               <w:t>0.85</w:t>
             </w:r>
           </w:p>
@@ -18610,7 +19284,18 @@
             <w:tcW w:w="0" w:type="auto"/>
           </w:tcPr>
           <w:p>
-            <w:r>
+            <w:pPr>
+              <w:spacing w:after="0"/>
+              <w:rPr>
+                <w:i w:val="0"/>
+                <w:iCs/>
+              </w:rPr>
+            </w:pPr>
+            <w:r>
+              <w:rPr>
+                <w:i w:val="0"/>
+                <w:iCs/>
+              </w:rPr>
               <w:t>15.75</w:t>
             </w:r>
           </w:p>
@@ -18620,7 +19305,18 @@
             <w:tcW w:w="0" w:type="auto"/>
           </w:tcPr>
           <w:p>
-            <w:r>
+            <w:pPr>
+              <w:spacing w:after="0"/>
+              <w:rPr>
+                <w:i w:val="0"/>
+                <w:iCs/>
+              </w:rPr>
+            </w:pPr>
+            <w:r>
+              <w:rPr>
+                <w:i w:val="0"/>
+                <w:iCs/>
+              </w:rPr>
               <w:t>0.85</w:t>
             </w:r>
           </w:p>
@@ -18630,7 +19326,18 @@
             <w:tcW w:w="0" w:type="auto"/>
           </w:tcPr>
           <w:p>
-            <w:r>
+            <w:pPr>
+              <w:spacing w:after="0"/>
+              <w:rPr>
+                <w:i w:val="0"/>
+                <w:iCs/>
+              </w:rPr>
+            </w:pPr>
+            <w:r>
+              <w:rPr>
+                <w:i w:val="0"/>
+                <w:iCs/>
+              </w:rPr>
               <w:t>synthetic age-class recovery</w:t>
             </w:r>
           </w:p>
@@ -18645,7 +19352,18 @@
             <w:tcW w:w="0" w:type="auto"/>
           </w:tcPr>
           <w:p>
-            <w:r>
+            <w:pPr>
+              <w:spacing w:after="0"/>
+              <w:rPr>
+                <w:i w:val="0"/>
+                <w:iCs/>
+              </w:rPr>
+            </w:pPr>
+            <w:r>
+              <w:rPr>
+                <w:i w:val="0"/>
+                <w:iCs/>
+              </w:rPr>
               <w:t>Old/Deep</w:t>
             </w:r>
           </w:p>
@@ -18655,7 +19373,18 @@
             <w:tcW w:w="0" w:type="auto"/>
           </w:tcPr>
           <w:p>
-            <w:r>
+            <w:pPr>
+              <w:spacing w:after="0"/>
+              <w:rPr>
+                <w:i w:val="0"/>
+                <w:iCs/>
+              </w:rPr>
+            </w:pPr>
+            <w:r>
+              <w:rPr>
+                <w:i w:val="0"/>
+                <w:iCs/>
+              </w:rPr>
               <w:t>520–2500</w:t>
             </w:r>
           </w:p>
@@ -18665,7 +19394,18 @@
             <w:tcW w:w="0" w:type="auto"/>
           </w:tcPr>
           <w:p>
-            <w:r>
+            <w:pPr>
+              <w:spacing w:after="0"/>
+              <w:rPr>
+                <w:i w:val="0"/>
+                <w:iCs/>
+              </w:rPr>
+            </w:pPr>
+            <w:r>
+              <w:rPr>
+                <w:i w:val="0"/>
+                <w:iCs/>
+              </w:rPr>
               <w:t>305.6–7370.6</w:t>
             </w:r>
           </w:p>
@@ -18675,7 +19415,18 @@
             <w:tcW w:w="0" w:type="auto"/>
           </w:tcPr>
           <w:p>
-            <w:r>
+            <w:pPr>
+              <w:spacing w:after="0"/>
+              <w:rPr>
+                <w:i w:val="0"/>
+                <w:iCs/>
+              </w:rPr>
+            </w:pPr>
+            <w:r>
+              <w:rPr>
+                <w:i w:val="0"/>
+                <w:iCs/>
+              </w:rPr>
               <w:t>0.82</w:t>
             </w:r>
           </w:p>
@@ -18685,7 +19436,18 @@
             <w:tcW w:w="0" w:type="auto"/>
           </w:tcPr>
           <w:p>
-            <w:r>
+            <w:pPr>
+              <w:spacing w:after="0"/>
+              <w:rPr>
+                <w:i w:val="0"/>
+                <w:iCs/>
+              </w:rPr>
+            </w:pPr>
+            <w:r>
+              <w:rPr>
+                <w:i w:val="0"/>
+                <w:iCs/>
+              </w:rPr>
               <w:t>188.49</w:t>
             </w:r>
           </w:p>
@@ -18695,7 +19457,18 @@
             <w:tcW w:w="0" w:type="auto"/>
           </w:tcPr>
           <w:p>
-            <w:r>
+            <w:pPr>
+              <w:spacing w:after="0"/>
+              <w:rPr>
+                <w:i w:val="0"/>
+                <w:iCs/>
+              </w:rPr>
+            </w:pPr>
+            <w:r>
+              <w:rPr>
+                <w:i w:val="0"/>
+                <w:iCs/>
+              </w:rPr>
               <w:t>0.85</w:t>
             </w:r>
           </w:p>
@@ -18705,7 +19478,18 @@
             <w:tcW w:w="0" w:type="auto"/>
           </w:tcPr>
           <w:p>
-            <w:r>
+            <w:pPr>
+              <w:spacing w:after="0"/>
+              <w:rPr>
+                <w:i w:val="0"/>
+                <w:iCs/>
+              </w:rPr>
+            </w:pPr>
+            <w:r>
+              <w:rPr>
+                <w:i w:val="0"/>
+                <w:iCs/>
+              </w:rPr>
               <w:t>synthetic age-class recovery</w:t>
             </w:r>
           </w:p>
@@ -18720,7 +19504,18 @@
             <w:tcW w:w="0" w:type="auto"/>
           </w:tcPr>
           <w:p>
-            <w:r>
+            <w:pPr>
+              <w:spacing w:after="0"/>
+              <w:rPr>
+                <w:i w:val="0"/>
+                <w:iCs/>
+              </w:rPr>
+            </w:pPr>
+            <w:r>
+              <w:rPr>
+                <w:i w:val="0"/>
+                <w:iCs/>
+              </w:rPr>
               <w:t>Overall synthetic</w:t>
             </w:r>
           </w:p>
@@ -18730,7 +19525,18 @@
             <w:tcW w:w="0" w:type="auto"/>
           </w:tcPr>
           <w:p>
-            <w:r>
+            <w:pPr>
+              <w:spacing w:after="0"/>
+              <w:rPr>
+                <w:i w:val="0"/>
+                <w:iCs/>
+              </w:rPr>
+            </w:pPr>
+            <w:r>
+              <w:rPr>
+                <w:i w:val="0"/>
+                <w:iCs/>
+              </w:rPr>
               <w:t>5–4500</w:t>
             </w:r>
           </w:p>
@@ -18740,7 +19546,18 @@
             <w:tcW w:w="0" w:type="auto"/>
           </w:tcPr>
           <w:p>
-            <w:r>
+            <w:pPr>
+              <w:spacing w:after="0"/>
+              <w:rPr>
+                <w:i w:val="0"/>
+                <w:iCs/>
+              </w:rPr>
+            </w:pPr>
+            <w:r>
+              <w:rPr>
+                <w:i w:val="0"/>
+                <w:iCs/>
+              </w:rPr>
               <w:t>3.7–9949.8</w:t>
             </w:r>
           </w:p>
@@ -18750,7 +19567,18 @@
             <w:tcW w:w="0" w:type="auto"/>
           </w:tcPr>
           <w:p>
-            <w:r>
+            <w:pPr>
+              <w:spacing w:after="0"/>
+              <w:rPr>
+                <w:i w:val="0"/>
+                <w:iCs/>
+              </w:rPr>
+            </w:pPr>
+            <w:r>
+              <w:rPr>
+                <w:i w:val="0"/>
+                <w:iCs/>
+              </w:rPr>
               <w:t>0.98 (log-space)</w:t>
             </w:r>
           </w:p>
@@ -18760,7 +19588,18 @@
             <w:tcW w:w="0" w:type="auto"/>
           </w:tcPr>
           <w:p>
-            <w:r>
+            <w:pPr>
+              <w:spacing w:after="0"/>
+              <w:rPr>
+                <w:i w:val="0"/>
+                <w:iCs/>
+              </w:rPr>
+            </w:pPr>
+            <w:r>
+              <w:rPr>
+                <w:i w:val="0"/>
+                <w:iCs/>
+              </w:rPr>
               <w:t>183.3</w:t>
             </w:r>
           </w:p>
@@ -18770,7 +19609,18 @@
             <w:tcW w:w="0" w:type="auto"/>
           </w:tcPr>
           <w:p>
-            <w:r>
+            <w:pPr>
+              <w:spacing w:after="0"/>
+              <w:rPr>
+                <w:i w:val="0"/>
+                <w:iCs/>
+              </w:rPr>
+            </w:pPr>
+            <w:r>
+              <w:rPr>
+                <w:i w:val="0"/>
+                <w:iCs/>
+              </w:rPr>
               <w:t>0.85</w:t>
             </w:r>
           </w:p>
@@ -18780,7 +19630,18 @@
             <w:tcW w:w="0" w:type="auto"/>
           </w:tcPr>
           <w:p>
-            <w:r>
+            <w:pPr>
+              <w:spacing w:after="0"/>
+              <w:rPr>
+                <w:i w:val="0"/>
+                <w:iCs/>
+              </w:rPr>
+            </w:pPr>
+            <w:r>
+              <w:rPr>
+                <w:i w:val="0"/>
+                <w:iCs/>
+              </w:rPr>
               <w:t>network Bayesian recovery</w:t>
             </w:r>
           </w:p>
@@ -18792,7 +19653,18 @@
             <w:tcW w:w="1823" w:type="dxa"/>
           </w:tcPr>
           <w:p>
-            <w:r>
+            <w:pPr>
+              <w:spacing w:after="0"/>
+              <w:rPr>
+                <w:i w:val="0"/>
+                <w:iCs/>
+              </w:rPr>
+            </w:pPr>
+            <w:r>
+              <w:rPr>
+                <w:i w:val="0"/>
+                <w:iCs/>
+              </w:rPr>
               <w:t>Public USGS parity</w:t>
             </w:r>
           </w:p>
@@ -18802,7 +19674,18 @@
             <w:tcW w:w="1581" w:type="dxa"/>
           </w:tcPr>
           <w:p>
-            <w:r>
+            <w:pPr>
+              <w:spacing w:after="0"/>
+              <w:rPr>
+                <w:i w:val="0"/>
+                <w:iCs/>
+              </w:rPr>
+            </w:pPr>
+            <w:r>
+              <w:rPr>
+                <w:i w:val="0"/>
+                <w:iCs/>
+              </w:rPr>
               <w:t>1–741000</w:t>
             </w:r>
           </w:p>
@@ -18812,7 +19695,18 @@
             <w:tcW w:w="1818" w:type="dxa"/>
           </w:tcPr>
           <w:p>
-            <w:r>
+            <w:pPr>
+              <w:spacing w:after="0"/>
+              <w:rPr>
+                <w:i w:val="0"/>
+                <w:iCs/>
+              </w:rPr>
+            </w:pPr>
+            <w:r>
+              <w:rPr>
+                <w:i w:val="0"/>
+                <w:iCs/>
+              </w:rPr>
               <w:t>0–50000</w:t>
             </w:r>
           </w:p>
@@ -18822,7 +19716,18 @@
             <w:tcW w:w="601" w:type="dxa"/>
           </w:tcPr>
           <w:p>
-            <w:r>
+            <w:pPr>
+              <w:spacing w:after="0"/>
+              <w:rPr>
+                <w:i w:val="0"/>
+                <w:iCs/>
+              </w:rPr>
+            </w:pPr>
+            <w:r>
+              <w:rPr>
+                <w:i w:val="0"/>
+                <w:iCs/>
+              </w:rPr>
               <w:t>0.71 (log-space)</w:t>
             </w:r>
           </w:p>
@@ -18832,7 +19737,18 @@
             <w:tcW w:w="841" w:type="dxa"/>
           </w:tcPr>
           <w:p>
-            <w:r>
+            <w:pPr>
+              <w:spacing w:after="0"/>
+              <w:rPr>
+                <w:i w:val="0"/>
+                <w:iCs/>
+              </w:rPr>
+            </w:pPr>
+            <w:r>
+              <w:rPr>
+                <w:i w:val="0"/>
+                <w:iCs/>
+              </w:rPr>
               <w:t>median |log10| = 0.17</w:t>
             </w:r>
           </w:p>
@@ -18842,7 +19758,18 @@
             <w:tcW w:w="1591" w:type="dxa"/>
           </w:tcPr>
           <w:p>
-            <w:r>
+            <w:pPr>
+              <w:spacing w:after="0"/>
+              <w:rPr>
+                <w:i w:val="0"/>
+                <w:iCs/>
+              </w:rPr>
+            </w:pPr>
+            <w:r>
+              <w:rPr>
+                <w:i w:val="0"/>
+                <w:iCs/>
+              </w:rPr>
               <w:t>not applicable</w:t>
             </w:r>
           </w:p>
@@ -18852,13 +19779,34 @@
             <w:tcW w:w="2211" w:type="dxa"/>
           </w:tcPr>
           <w:p>
-            <w:r>
+            <w:pPr>
+              <w:spacing w:after="0"/>
+              <w:rPr>
+                <w:i w:val="0"/>
+                <w:iCs/>
+              </w:rPr>
+            </w:pPr>
+            <w:r>
+              <w:rPr>
+                <w:i w:val="0"/>
+                <w:iCs/>
+              </w:rPr>
               <w:t>screening-level parity to reported model outputs</w:t>
             </w:r>
           </w:p>
         </w:tc>
       </w:tr>
     </w:tbl>
+    <w:p/>
+    <w:p>
+      <w:pPr>
+        <w:spacing w:after="0"/>
+        <w:jc w:val="left"/>
+      </w:pPr>
+      <w:r>
+        <w:br w:type="page"/>
+      </w:r>
+    </w:p>
     <w:p/>
     <w:p>
       <w:r>
@@ -19999,26 +20947,35 @@
         <w:tblLook w:val="04A0" w:firstRow="1" w:lastRow="0" w:firstColumn="1" w:lastColumn="0" w:noHBand="0" w:noVBand="1"/>
       </w:tblPr>
       <w:tblGrid>
-        <w:gridCol w:w="1047"/>
+        <w:gridCol w:w="1046"/>
         <w:gridCol w:w="1643"/>
         <w:gridCol w:w="1270"/>
-        <w:gridCol w:w="1403"/>
-        <w:gridCol w:w="1016"/>
-        <w:gridCol w:w="1237"/>
-        <w:gridCol w:w="994"/>
-        <w:gridCol w:w="1856"/>
+        <w:gridCol w:w="1410"/>
+        <w:gridCol w:w="1029"/>
+        <w:gridCol w:w="1238"/>
+        <w:gridCol w:w="989"/>
+        <w:gridCol w:w="1841"/>
       </w:tblGrid>
       <w:tr>
         <w:trPr>
           <w:cnfStyle w:val="100000000000" w:firstRow="1" w:lastRow="0" w:firstColumn="0" w:lastColumn="0" w:oddVBand="0" w:evenVBand="0" w:oddHBand="0" w:evenHBand="0" w:firstRowFirstColumn="0" w:firstRowLastColumn="0" w:lastRowFirstColumn="0" w:lastRowLastColumn="0"/>
-          <w:tblHeader/>
         </w:trPr>
         <w:tc>
           <w:tcPr>
             <w:tcW w:w="1069" w:type="dxa"/>
           </w:tcPr>
           <w:p>
-            <w:r>
+            <w:pPr>
+              <w:rPr>
+                <w:i w:val="0"/>
+                <w:iCs/>
+              </w:rPr>
+            </w:pPr>
+            <w:r>
+              <w:rPr>
+                <w:i w:val="0"/>
+                <w:iCs/>
+              </w:rPr>
               <w:t>Site</w:t>
             </w:r>
           </w:p>
@@ -20028,7 +20985,17 @@
             <w:tcW w:w="1454" w:type="dxa"/>
           </w:tcPr>
           <w:p>
-            <w:r>
+            <w:pPr>
+              <w:rPr>
+                <w:i w:val="0"/>
+                <w:iCs/>
+              </w:rPr>
+            </w:pPr>
+            <w:r>
+              <w:rPr>
+                <w:i w:val="0"/>
+                <w:iCs/>
+              </w:rPr>
               <w:t>Flow path/edge</w:t>
             </w:r>
           </w:p>
@@ -20038,7 +21005,17 @@
             <w:tcW w:w="1187" w:type="dxa"/>
           </w:tcPr>
           <w:p>
-            <w:r>
+            <w:pPr>
+              <w:rPr>
+                <w:i w:val="0"/>
+                <w:iCs/>
+              </w:rPr>
+            </w:pPr>
+            <w:r>
+              <w:rPr>
+                <w:i w:val="0"/>
+                <w:iCs/>
+              </w:rPr>
               <w:t>Dominant process</w:t>
             </w:r>
           </w:p>
@@ -20048,7 +21025,17 @@
             <w:tcW w:w="1512" w:type="dxa"/>
           </w:tcPr>
           <w:p>
-            <w:r>
+            <w:pPr>
+              <w:rPr>
+                <w:i w:val="0"/>
+                <w:iCs/>
+              </w:rPr>
+            </w:pPr>
+            <w:r>
+              <w:rPr>
+                <w:i w:val="0"/>
+                <w:iCs/>
+              </w:rPr>
               <w:t>Extent (mmol/L)</w:t>
             </w:r>
           </w:p>
@@ -20058,7 +21045,17 @@
             <w:tcW w:w="856" w:type="dxa"/>
           </w:tcPr>
           <w:p>
-            <w:r>
+            <w:pPr>
+              <w:rPr>
+                <w:i w:val="0"/>
+                <w:iCs/>
+              </w:rPr>
+            </w:pPr>
+            <w:r>
+              <w:rPr>
+                <w:i w:val="0"/>
+                <w:iCs/>
+              </w:rPr>
               <w:t>Selected lambda</w:t>
             </w:r>
           </w:p>
@@ -20068,7 +21065,17 @@
             <w:tcW w:w="1294" w:type="dxa"/>
           </w:tcPr>
           <w:p>
-            <w:r>
+            <w:pPr>
+              <w:rPr>
+                <w:i w:val="0"/>
+                <w:iCs/>
+              </w:rPr>
+            </w:pPr>
+            <w:r>
+              <w:rPr>
+                <w:i w:val="0"/>
+                <w:iCs/>
+              </w:rPr>
               <w:t>Fit metric</w:t>
             </w:r>
           </w:p>
@@ -20078,7 +21085,17 @@
             <w:tcW w:w="1128" w:type="dxa"/>
           </w:tcPr>
           <w:p>
-            <w:r>
+            <w:pPr>
+              <w:rPr>
+                <w:i w:val="0"/>
+                <w:iCs/>
+              </w:rPr>
+            </w:pPr>
+            <w:r>
+              <w:rPr>
+                <w:i w:val="0"/>
+                <w:iCs/>
+              </w:rPr>
               <w:t>PSI</w:t>
             </w:r>
           </w:p>
@@ -20088,7 +21105,17 @@
             <w:tcW w:w="1966" w:type="dxa"/>
           </w:tcPr>
           <w:p>
-            <w:r>
+            <w:pPr>
+              <w:rPr>
+                <w:i w:val="0"/>
+                <w:iCs/>
+              </w:rPr>
+            </w:pPr>
+            <w:r>
+              <w:rPr>
+                <w:i w:val="0"/>
+                <w:iCs/>
+              </w:rPr>
               <w:t>Interpretation</w:t>
             </w:r>
           </w:p>
@@ -20100,9 +21127,21 @@
             <w:tcW w:w="1069" w:type="dxa"/>
           </w:tcPr>
           <w:p>
-            <w:r>
+            <w:pPr>
+              <w:rPr>
+                <w:i w:val="0"/>
+                <w:iCs/>
+              </w:rPr>
+            </w:pPr>
+            <w:proofErr w:type="spellStart"/>
+            <w:r>
+              <w:rPr>
+                <w:i w:val="0"/>
+                <w:iCs/>
+              </w:rPr>
               <w:t>Talensi</w:t>
             </w:r>
+            <w:proofErr w:type="spellEnd"/>
           </w:p>
         </w:tc>
         <w:tc>
@@ -20110,7 +21149,17 @@
             <w:tcW w:w="1454" w:type="dxa"/>
           </w:tcPr>
           <w:p>
-            <w:r>
+            <w:pPr>
+              <w:rPr>
+                <w:i w:val="0"/>
+                <w:iCs/>
+              </w:rPr>
+            </w:pPr>
+            <w:r>
+              <w:rPr>
+                <w:i w:val="0"/>
+                <w:iCs/>
+              </w:rPr>
               <w:t>Talensi_48_61</w:t>
             </w:r>
           </w:p>
@@ -20120,7 +21169,17 @@
             <w:tcW w:w="1187" w:type="dxa"/>
           </w:tcPr>
           <w:p>
-            <w:r>
+            <w:pPr>
+              <w:rPr>
+                <w:i w:val="0"/>
+                <w:iCs/>
+              </w:rPr>
+            </w:pPr>
+            <w:r>
+              <w:rPr>
+                <w:i w:val="0"/>
+                <w:iCs/>
+              </w:rPr>
               <w:t>carbonate dissolution</w:t>
             </w:r>
           </w:p>
@@ -20130,7 +21189,17 @@
             <w:tcW w:w="1512" w:type="dxa"/>
           </w:tcPr>
           <w:p>
-            <w:r>
+            <w:pPr>
+              <w:rPr>
+                <w:i w:val="0"/>
+                <w:iCs/>
+              </w:rPr>
+            </w:pPr>
+            <w:r>
+              <w:rPr>
+                <w:i w:val="0"/>
+                <w:iCs/>
+              </w:rPr>
               <w:t>1.23</w:t>
             </w:r>
           </w:p>
@@ -20140,7 +21209,17 @@
             <w:tcW w:w="856" w:type="dxa"/>
           </w:tcPr>
           <w:p>
-            <w:r>
+            <w:pPr>
+              <w:rPr>
+                <w:i w:val="0"/>
+                <w:iCs/>
+              </w:rPr>
+            </w:pPr>
+            <w:r>
+              <w:rPr>
+                <w:i w:val="0"/>
+                <w:iCs/>
+              </w:rPr>
               <w:t>0.0483</w:t>
             </w:r>
           </w:p>
@@ -20150,7 +21229,17 @@
             <w:tcW w:w="1294" w:type="dxa"/>
           </w:tcPr>
           <w:p>
-            <w:r>
+            <w:pPr>
+              <w:rPr>
+                <w:i w:val="0"/>
+                <w:iCs/>
+              </w:rPr>
+            </w:pPr>
+            <w:r>
+              <w:rPr>
+                <w:i w:val="0"/>
+                <w:iCs/>
+              </w:rPr>
               <w:t>objective 0.22 / R2 1.00</w:t>
             </w:r>
           </w:p>
@@ -20160,7 +21249,17 @@
             <w:tcW w:w="1128" w:type="dxa"/>
           </w:tcPr>
           <w:p>
-            <w:r>
+            <w:pPr>
+              <w:rPr>
+                <w:i w:val="0"/>
+                <w:iCs/>
+              </w:rPr>
+            </w:pPr>
+            <w:r>
+              <w:rPr>
+                <w:i w:val="0"/>
+                <w:iCs/>
+              </w:rPr>
               <w:t>1.00</w:t>
             </w:r>
           </w:p>
@@ -20170,7 +21269,17 @@
             <w:tcW w:w="1966" w:type="dxa"/>
           </w:tcPr>
           <w:p>
-            <w:r>
+            <w:pPr>
+              <w:rPr>
+                <w:i w:val="0"/>
+                <w:iCs/>
+              </w:rPr>
+            </w:pPr>
+            <w:r>
+              <w:rPr>
+                <w:i w:val="0"/>
+                <w:iCs/>
+              </w:rPr>
               <w:t>carbonates signal</w:t>
             </w:r>
           </w:p>
@@ -20182,9 +21291,21 @@
             <w:tcW w:w="1069" w:type="dxa"/>
           </w:tcPr>
           <w:p>
-            <w:r>
+            <w:pPr>
+              <w:rPr>
+                <w:i w:val="0"/>
+                <w:iCs/>
+              </w:rPr>
+            </w:pPr>
+            <w:proofErr w:type="spellStart"/>
+            <w:r>
+              <w:rPr>
+                <w:i w:val="0"/>
+                <w:iCs/>
+              </w:rPr>
               <w:t>Talensi</w:t>
             </w:r>
+            <w:proofErr w:type="spellEnd"/>
           </w:p>
         </w:tc>
         <w:tc>
@@ -20192,7 +21313,17 @@
             <w:tcW w:w="1454" w:type="dxa"/>
           </w:tcPr>
           <w:p>
-            <w:r>
+            <w:pPr>
+              <w:rPr>
+                <w:i w:val="0"/>
+                <w:iCs/>
+              </w:rPr>
+            </w:pPr>
+            <w:r>
+              <w:rPr>
+                <w:i w:val="0"/>
+                <w:iCs/>
+              </w:rPr>
               <w:t>Talensi_45_44</w:t>
             </w:r>
           </w:p>
@@ -20202,7 +21333,17 @@
             <w:tcW w:w="1187" w:type="dxa"/>
           </w:tcPr>
           <w:p>
-            <w:r>
+            <w:pPr>
+              <w:rPr>
+                <w:i w:val="0"/>
+                <w:iCs/>
+              </w:rPr>
+            </w:pPr>
+            <w:r>
+              <w:rPr>
+                <w:i w:val="0"/>
+                <w:iCs/>
+              </w:rPr>
               <w:t>nitrate input</w:t>
             </w:r>
           </w:p>
@@ -20212,7 +21353,17 @@
             <w:tcW w:w="1512" w:type="dxa"/>
           </w:tcPr>
           <w:p>
-            <w:r>
+            <w:pPr>
+              <w:rPr>
+                <w:i w:val="0"/>
+                <w:iCs/>
+              </w:rPr>
+            </w:pPr>
+            <w:r>
+              <w:rPr>
+                <w:i w:val="0"/>
+                <w:iCs/>
+              </w:rPr>
               <w:t>2.21</w:t>
             </w:r>
           </w:p>
@@ -20222,7 +21373,17 @@
             <w:tcW w:w="856" w:type="dxa"/>
           </w:tcPr>
           <w:p>
-            <w:r>
+            <w:pPr>
+              <w:rPr>
+                <w:i w:val="0"/>
+                <w:iCs/>
+              </w:rPr>
+            </w:pPr>
+            <w:r>
+              <w:rPr>
+                <w:i w:val="0"/>
+                <w:iCs/>
+              </w:rPr>
               <w:t>0.0483</w:t>
             </w:r>
           </w:p>
@@ -20232,7 +21393,17 @@
             <w:tcW w:w="1294" w:type="dxa"/>
           </w:tcPr>
           <w:p>
-            <w:r>
+            <w:pPr>
+              <w:rPr>
+                <w:i w:val="0"/>
+                <w:iCs/>
+              </w:rPr>
+            </w:pPr>
+            <w:r>
+              <w:rPr>
+                <w:i w:val="0"/>
+                <w:iCs/>
+              </w:rPr>
               <w:t>objective 0.82 / R2 1.00</w:t>
             </w:r>
           </w:p>
@@ -20242,7 +21413,17 @@
             <w:tcW w:w="1128" w:type="dxa"/>
           </w:tcPr>
           <w:p>
-            <w:r>
+            <w:pPr>
+              <w:rPr>
+                <w:i w:val="0"/>
+                <w:iCs/>
+              </w:rPr>
+            </w:pPr>
+            <w:r>
+              <w:rPr>
+                <w:i w:val="0"/>
+                <w:iCs/>
+              </w:rPr>
               <w:t>1.00</w:t>
             </w:r>
           </w:p>
@@ -20252,7 +21433,17 @@
             <w:tcW w:w="1966" w:type="dxa"/>
           </w:tcPr>
           <w:p>
-            <w:r>
+            <w:pPr>
+              <w:rPr>
+                <w:i w:val="0"/>
+                <w:iCs/>
+              </w:rPr>
+            </w:pPr>
+            <w:r>
+              <w:rPr>
+                <w:i w:val="0"/>
+                <w:iCs/>
+              </w:rPr>
               <w:t>nitrate hypothesis</w:t>
             </w:r>
           </w:p>
@@ -20264,9 +21455,21 @@
             <w:tcW w:w="1069" w:type="dxa"/>
           </w:tcPr>
           <w:p>
-            <w:r>
+            <w:pPr>
+              <w:rPr>
+                <w:i w:val="0"/>
+                <w:iCs/>
+              </w:rPr>
+            </w:pPr>
+            <w:proofErr w:type="spellStart"/>
+            <w:r>
+              <w:rPr>
+                <w:i w:val="0"/>
+                <w:iCs/>
+              </w:rPr>
               <w:t>Talensi</w:t>
             </w:r>
+            <w:proofErr w:type="spellEnd"/>
           </w:p>
         </w:tc>
         <w:tc>
@@ -20274,7 +21477,17 @@
             <w:tcW w:w="1454" w:type="dxa"/>
           </w:tcPr>
           <w:p>
-            <w:r>
+            <w:pPr>
+              <w:rPr>
+                <w:i w:val="0"/>
+                <w:iCs/>
+              </w:rPr>
+            </w:pPr>
+            <w:r>
+              <w:rPr>
+                <w:i w:val="0"/>
+                <w:iCs/>
+              </w:rPr>
               <w:t>Talensi_48_42</w:t>
             </w:r>
           </w:p>
@@ -20284,7 +21497,17 @@
             <w:tcW w:w="1187" w:type="dxa"/>
           </w:tcPr>
           <w:p>
-            <w:r>
+            <w:pPr>
+              <w:rPr>
+                <w:i w:val="0"/>
+                <w:iCs/>
+              </w:rPr>
+            </w:pPr>
+            <w:r>
+              <w:rPr>
+                <w:i w:val="0"/>
+                <w:iCs/>
+              </w:rPr>
               <w:t>redox process</w:t>
             </w:r>
           </w:p>
@@ -20294,7 +21517,17 @@
             <w:tcW w:w="1512" w:type="dxa"/>
           </w:tcPr>
           <w:p>
-            <w:r>
+            <w:pPr>
+              <w:rPr>
+                <w:i w:val="0"/>
+                <w:iCs/>
+              </w:rPr>
+            </w:pPr>
+            <w:r>
+              <w:rPr>
+                <w:i w:val="0"/>
+                <w:iCs/>
+              </w:rPr>
               <w:t>4.12</w:t>
             </w:r>
           </w:p>
@@ -20304,7 +21537,17 @@
             <w:tcW w:w="856" w:type="dxa"/>
           </w:tcPr>
           <w:p>
-            <w:r>
+            <w:pPr>
+              <w:rPr>
+                <w:i w:val="0"/>
+                <w:iCs/>
+              </w:rPr>
+            </w:pPr>
+            <w:r>
+              <w:rPr>
+                <w:i w:val="0"/>
+                <w:iCs/>
+              </w:rPr>
               <w:t>0.0483</w:t>
             </w:r>
           </w:p>
@@ -20314,7 +21557,17 @@
             <w:tcW w:w="1294" w:type="dxa"/>
           </w:tcPr>
           <w:p>
-            <w:r>
+            <w:pPr>
+              <w:rPr>
+                <w:i w:val="0"/>
+                <w:iCs/>
+              </w:rPr>
+            </w:pPr>
+            <w:r>
+              <w:rPr>
+                <w:i w:val="0"/>
+                <w:iCs/>
+              </w:rPr>
               <w:t>objective 0.41 / R2 1.00</w:t>
             </w:r>
           </w:p>
@@ -20324,7 +21577,17 @@
             <w:tcW w:w="1128" w:type="dxa"/>
           </w:tcPr>
           <w:p>
-            <w:r>
+            <w:pPr>
+              <w:rPr>
+                <w:i w:val="0"/>
+                <w:iCs/>
+              </w:rPr>
+            </w:pPr>
+            <w:r>
+              <w:rPr>
+                <w:i w:val="0"/>
+                <w:iCs/>
+              </w:rPr>
               <w:t>1.00</w:t>
             </w:r>
           </w:p>
@@ -20334,7 +21597,17 @@
             <w:tcW w:w="1966" w:type="dxa"/>
           </w:tcPr>
           <w:p>
-            <w:r>
+            <w:pPr>
+              <w:rPr>
+                <w:i w:val="0"/>
+                <w:iCs/>
+              </w:rPr>
+            </w:pPr>
+            <w:r>
+              <w:rPr>
+                <w:i w:val="0"/>
+                <w:iCs/>
+              </w:rPr>
               <w:t>redox hypothesis</w:t>
             </w:r>
           </w:p>
@@ -20346,8 +21619,17 @@
             <w:tcW w:w="1069" w:type="dxa"/>
           </w:tcPr>
           <w:p>
-            <w:r>
-              <w:lastRenderedPageBreak/>
+            <w:pPr>
+              <w:rPr>
+                <w:i w:val="0"/>
+                <w:iCs/>
+              </w:rPr>
+            </w:pPr>
+            <w:r>
+              <w:rPr>
+                <w:i w:val="0"/>
+                <w:iCs/>
+              </w:rPr>
               <w:t>Lower Anayari</w:t>
             </w:r>
           </w:p>
@@ -20357,7 +21639,17 @@
             <w:tcW w:w="1454" w:type="dxa"/>
           </w:tcPr>
           <w:p>
-            <w:r>
+            <w:pPr>
+              <w:rPr>
+                <w:i w:val="0"/>
+                <w:iCs/>
+              </w:rPr>
+            </w:pPr>
+            <w:r>
+              <w:rPr>
+                <w:i w:val="0"/>
+                <w:iCs/>
+              </w:rPr>
               <w:t>Manu_30_28</w:t>
             </w:r>
           </w:p>
@@ -20367,7 +21659,17 @@
             <w:tcW w:w="1187" w:type="dxa"/>
           </w:tcPr>
           <w:p>
-            <w:r>
+            <w:pPr>
+              <w:rPr>
+                <w:i w:val="0"/>
+                <w:iCs/>
+              </w:rPr>
+            </w:pPr>
+            <w:r>
+              <w:rPr>
+                <w:i w:val="0"/>
+                <w:iCs/>
+              </w:rPr>
               <w:t>evaporite dissolution</w:t>
             </w:r>
           </w:p>
@@ -20377,7 +21679,17 @@
             <w:tcW w:w="1512" w:type="dxa"/>
           </w:tcPr>
           <w:p>
-            <w:r>
+            <w:pPr>
+              <w:rPr>
+                <w:i w:val="0"/>
+                <w:iCs/>
+              </w:rPr>
+            </w:pPr>
+            <w:r>
+              <w:rPr>
+                <w:i w:val="0"/>
+                <w:iCs/>
+              </w:rPr>
               <w:t>0.33</w:t>
             </w:r>
           </w:p>
@@ -20387,7 +21699,17 @@
             <w:tcW w:w="856" w:type="dxa"/>
           </w:tcPr>
           <w:p>
-            <w:r>
+            <w:pPr>
+              <w:rPr>
+                <w:i w:val="0"/>
+                <w:iCs/>
+              </w:rPr>
+            </w:pPr>
+            <w:r>
+              <w:rPr>
+                <w:i w:val="0"/>
+                <w:iCs/>
+              </w:rPr>
               <w:t>0.0483</w:t>
             </w:r>
           </w:p>
@@ -20397,7 +21719,17 @@
             <w:tcW w:w="1294" w:type="dxa"/>
           </w:tcPr>
           <w:p>
-            <w:r>
+            <w:pPr>
+              <w:rPr>
+                <w:i w:val="0"/>
+                <w:iCs/>
+              </w:rPr>
+            </w:pPr>
+            <w:r>
+              <w:rPr>
+                <w:i w:val="0"/>
+                <w:iCs/>
+              </w:rPr>
               <w:t>objective 0.25 / R2 0.99</w:t>
             </w:r>
           </w:p>
@@ -20407,7 +21739,17 @@
             <w:tcW w:w="1128" w:type="dxa"/>
           </w:tcPr>
           <w:p>
-            <w:r>
+            <w:pPr>
+              <w:rPr>
+                <w:i w:val="0"/>
+                <w:iCs/>
+              </w:rPr>
+            </w:pPr>
+            <w:r>
+              <w:rPr>
+                <w:i w:val="0"/>
+                <w:iCs/>
+              </w:rPr>
               <w:t>1.00</w:t>
             </w:r>
           </w:p>
@@ -20417,7 +21759,17 @@
             <w:tcW w:w="1966" w:type="dxa"/>
           </w:tcPr>
           <w:p>
-            <w:r>
+            <w:pPr>
+              <w:rPr>
+                <w:i w:val="0"/>
+                <w:iCs/>
+              </w:rPr>
+            </w:pPr>
+            <w:r>
+              <w:rPr>
+                <w:i w:val="0"/>
+                <w:iCs/>
+              </w:rPr>
               <w:t>screening-level process label</w:t>
             </w:r>
           </w:p>
@@ -20458,7 +21810,7 @@
                     <pic:cNvPicPr/>
                   </pic:nvPicPr>
                   <pic:blipFill rotWithShape="1">
-                    <a:blip r:embed="rId73" cstate="print">
+                    <a:blip r:embed="rId70" cstate="print">
                       <a:extLst>
                         <a:ext uri="{28A0092B-C50C-407E-A947-70E740481C1C}">
                           <a14:useLocalDpi xmlns:a14="http://schemas.microsoft.com/office/drawing/2010/main" val="0"/>
@@ -20541,7 +21893,7 @@
                     <pic:cNvPicPr/>
                   </pic:nvPicPr>
                   <pic:blipFill>
-                    <a:blip r:embed="rId74" cstate="print">
+                    <a:blip r:embed="rId71" cstate="print">
                       <a:extLst>
                         <a:ext uri="{28A0092B-C50C-407E-A947-70E740481C1C}">
                           <a14:useLocalDpi xmlns:a14="http://schemas.microsoft.com/office/drawing/2010/main" val="0"/>
@@ -20570,7 +21922,15 @@
     </w:p>
     <w:p>
       <w:r>
-        <w:t>Figure 2. Topology-only comparison of Hydrosheaf-inferred directed connectivity against the MODPATH reference simulation. The prior-assisted mode tests faithful physics-prior ingestion; the no-prior mode tests independent heuristic recovery and is the relevant capability metric.</w:t>
+        <w:t xml:space="preserve">Figure 2. Topology-only comparison of </w:t>
+      </w:r>
+      <w:proofErr w:type="spellStart"/>
+      <w:r>
+        <w:t>Hydrosheaf</w:t>
+      </w:r>
+      <w:proofErr w:type="spellEnd"/>
+      <w:r>
+        <w:t>-inferred directed connectivity against the MODPATH reference simulation. The prior-assisted mode tests physics-prior ingestion; the no-prior mode tests independent heuristic recovery and is the relevant capability metric.</w:t>
       </w:r>
     </w:p>
     <w:p/>
@@ -20597,7 +21957,7 @@
                     <pic:cNvPicPr/>
                   </pic:nvPicPr>
                   <pic:blipFill>
-                    <a:blip r:embed="rId75" cstate="print">
+                    <a:blip r:embed="rId72" cstate="print">
                       <a:extLst>
                         <a:ext uri="{28A0092B-C50C-407E-A947-70E740481C1C}">
                           <a14:useLocalDpi xmlns:a14="http://schemas.microsoft.com/office/drawing/2010/main" val="0"/>
@@ -20654,7 +22014,7 @@
                     <pic:cNvPicPr/>
                   </pic:nvPicPr>
                   <pic:blipFill>
-                    <a:blip r:embed="rId76" cstate="print">
+                    <a:blip r:embed="rId73" cstate="print">
                       <a:extLst>
                         <a:ext uri="{28A0092B-C50C-407E-A947-70E740481C1C}">
                           <a14:useLocalDpi xmlns:a14="http://schemas.microsoft.com/office/drawing/2010/main" val="0"/>
@@ -20692,7 +22052,15 @@
         </w:sectPr>
       </w:pPr>
       <w:r>
-        <w:t>Figure 4. Data-limited process-discovery networks for Lower Anayari and Talensi. The graphs are generated from field coordinates and head proxies; edge colours denote inferred process families and edge annotations show PSI for selected links. The figure is a field-hydrochemistry demonstration without an independent process-truth graph, tracer-age validation or MODPATH field benchmark.</w:t>
+        <w:t xml:space="preserve">Figure 4. Data-limited process-discovery networks for Lower Anayari and </w:t>
+      </w:r>
+      <w:proofErr w:type="spellStart"/>
+      <w:r>
+        <w:t>Talensi</w:t>
+      </w:r>
+      <w:proofErr w:type="spellEnd"/>
+      <w:r>
+        <w:t>. The graphs are generated from field coordinates and head proxies; edge colours denote inferred process families and edge annotations show PSI for selected links. The figure is a field-hydrochemistry demonstration without an independent process-truth graph, tracer-age validation or MODPATH field benchmark.</w:t>
       </w:r>
     </w:p>
     <w:p>
@@ -20718,7 +22086,7 @@
                     <pic:cNvPicPr/>
                   </pic:nvPicPr>
                   <pic:blipFill>
-                    <a:blip r:embed="rId77" cstate="print">
+                    <a:blip r:embed="rId74" cstate="print">
                       <a:extLst>
                         <a:ext uri="{28A0092B-C50C-407E-A947-70E740481C1C}">
                           <a14:useLocalDpi xmlns:a14="http://schemas.microsoft.com/office/drawing/2010/main" val="0"/>
@@ -20793,7 +22161,7 @@
                     <pic:cNvPicPr/>
                   </pic:nvPicPr>
                   <pic:blipFill>
-                    <a:blip r:embed="rId78" cstate="print">
+                    <a:blip r:embed="rId75" cstate="print">
                       <a:extLst>
                         <a:ext uri="{28A0092B-C50C-407E-A947-70E740481C1C}">
                           <a14:useLocalDpi xmlns:a14="http://schemas.microsoft.com/office/drawing/2010/main" val="0"/>
@@ -20822,7 +22190,23 @@
     </w:p>
     <w:p>
       <w:r>
-        <w:t>Figure 6. Site-specific AICc regularisation selection for Lower Anayari and Talensi. The minimum occurs at lambda = 0.0483 in both panels. This value is a transparent choice for the analysed datasets, not a universal optimum for other aquifers, ion panels or reaction dictionaries.</w:t>
+        <w:t xml:space="preserve">Figure 6. Site-specific </w:t>
+      </w:r>
+      <w:proofErr w:type="spellStart"/>
+      <w:r>
+        <w:t>AICc</w:t>
+      </w:r>
+      <w:proofErr w:type="spellEnd"/>
+      <w:r>
+        <w:t xml:space="preserve"> regularisation selection for Lower Anayari and </w:t>
+      </w:r>
+      <w:proofErr w:type="spellStart"/>
+      <w:r>
+        <w:t>Talensi</w:t>
+      </w:r>
+      <w:proofErr w:type="spellEnd"/>
+      <w:r>
+        <w:t>. The minimum occurs at lambda = 0.0483 in both panels. This value is a transparent choice for the analysed datasets, not a universal optimum for other aquifers, ion panels or reaction dictionaries.</w:t>
       </w:r>
     </w:p>
     <w:p/>
@@ -20849,7 +22233,7 @@
                     <pic:cNvPicPr/>
                   </pic:nvPicPr>
                   <pic:blipFill>
-                    <a:blip r:embed="rId79" cstate="print">
+                    <a:blip r:embed="rId76" cstate="print">
                       <a:extLst>
                         <a:ext uri="{28A0092B-C50C-407E-A947-70E740481C1C}">
                           <a14:useLocalDpi xmlns:a14="http://schemas.microsoft.com/office/drawing/2010/main" val="0"/>
@@ -20878,7 +22262,15 @@
     </w:p>
     <w:p>
       <w:r>
-        <w:t>Figure 7. Detailed process-stability matrix (PSI) for Lower Anayari and Talensi. Values express identification probability under the analysed Monte Carlo perturbations. The contrasts between cation exchange, nitrate cycling, gypsum and aerobic pyrite oxidation are stability patterns requiring independent corroboration; the legacy filename should not be interpreted as a guarantee.</w:t>
+        <w:t xml:space="preserve">Figure 7. Detailed process-stability matrix (PSI) for Lower Anayari and </w:t>
+      </w:r>
+      <w:proofErr w:type="spellStart"/>
+      <w:r>
+        <w:t>Talensi</w:t>
+      </w:r>
+      <w:proofErr w:type="spellEnd"/>
+      <w:r>
+        <w:t>. Values express identification probability under the analysed Monte Carlo perturbations. The contrasts between cation exchange, nitrate cycling, gypsum and aerobic pyrite oxidation are stability patterns requiring independent corroboration; the legacy filename should not be interpreted as a guarantee.</w:t>
       </w:r>
     </w:p>
     <w:sectPr>
@@ -20893,7 +22285,7 @@
 </file>
 
 <file path=word/endnotes.xml><?xml version="1.0" encoding="utf-8"?>
-<w:endnotes xmlns:wpc="http://schemas.microsoft.com/office/word/2010/wordprocessingCanvas" xmlns:cx="http://schemas.microsoft.com/office/drawing/2014/chartex" xmlns:cx1="http://schemas.microsoft.com/office/drawing/2015/9/8/chartex" xmlns:cx2="http://schemas.microsoft.com/office/drawing/2015/10/21/chartex" xmlns:cx3="http://schemas.microsoft.com/office/drawing/2016/5/9/chartex" xmlns:cx4="http://schemas.microsoft.com/office/drawing/2016/5/10/chartex" xmlns:cx5="http://schemas.microsoft.com/office/drawing/2016/5/11/chartex" xmlns:cx6="http://schemas.microsoft.com/office/drawing/2016/5/12/chartex" xmlns:cx7="http://schemas.microsoft.com/office/drawing/2016/5/13/chartex" xmlns:cx8="http://schemas.microsoft.com/office/drawing/2016/5/14/chartex" xmlns:mc="http://schemas.openxmlformats.org/markup-compatibility/2006" xmlns:aink="http://schemas.microsoft.com/office/drawing/2016/ink" xmlns:am3d="http://schemas.microsoft.com/office/drawing/2017/model3d" xmlns:o="urn:schemas-microsoft-com:office:office" xmlns:oel="http://schemas.microsoft.com/office/2019/extlst" xmlns:r="http://schemas.openxmlformats.org/officeDocument/2006/relationships" xmlns:m="http://schemas.openxmlformats.org/officeDocument/2006/math" xmlns:v="urn:schemas-microsoft-com:vml" xmlns:wp14="http://schemas.microsoft.com/office/word/2010/wordprocessingDrawing" xmlns:wp="http://schemas.openxmlformats.org/drawingml/2006/wordprocessingDrawing" xmlns:w10="urn:schemas-microsoft-com:office:word" xmlns:w="http://schemas.openxmlformats.org/wordprocessingml/2006/main" xmlns:w14="http://schemas.microsoft.com/office/word/2010/wordml" xmlns:w15="http://schemas.microsoft.com/office/word/2012/wordml" xmlns:w16cex="http://schemas.microsoft.com/office/word/2018/wordml/cex" xmlns:w16cid="http://schemas.microsoft.com/office/word/2016/wordml/cid" xmlns:w16="http://schemas.microsoft.com/office/word/2018/wordml" xmlns:w16du="http://schemas.microsoft.com/office/word/2023/wordml/word16du" xmlns:w16sdtdh="http://schemas.microsoft.com/office/word/2020/wordml/sdtdatahash" xmlns:w16sdtfl="http://schemas.microsoft.com/office/word/2024/wordml/sdtformatlock" xmlns:w16se="http://schemas.microsoft.com/office/word/2015/wordml/symex" xmlns:wpg="http://schemas.microsoft.com/office/word/2010/wordprocessingGroup" xmlns:wpi="http://schemas.microsoft.com/office/word/2010/wordprocessingInk" xmlns:wne="http://schemas.microsoft.com/office/word/2006/wordml" xmlns:wps="http://schemas.microsoft.com/office/word/2010/wordprocessingShape" mc:Ignorable="w14 w15 w16se w16cid w16 w16cex w16sdtdh w16sdtfl w16du wp14">
+<w:endnotes xmlns:wpc="http://schemas.microsoft.com/office/word/2010/wordprocessingCanvas" xmlns:cx="http://schemas.microsoft.com/office/drawing/2014/chartex" xmlns:cx1="http://schemas.microsoft.com/office/drawing/2015/9/8/chartex" xmlns:cx2="http://schemas.microsoft.com/office/drawing/2015/10/21/chartex" xmlns:cx3="http://schemas.microsoft.com/office/drawing/2016/5/9/chartex" xmlns:cx4="http://schemas.microsoft.com/office/drawing/2016/5/10/chartex" xmlns:cx5="http://schemas.microsoft.com/office/drawing/2016/5/11/chartex" xmlns:cx6="http://schemas.microsoft.com/office/drawing/2016/5/12/chartex" xmlns:cx7="http://schemas.microsoft.com/office/drawing/2016/5/13/chartex" xmlns:cx8="http://schemas.microsoft.com/office/drawing/2016/5/14/chartex" xmlns:mc="http://schemas.openxmlformats.org/markup-compatibility/2006" xmlns:aink="http://schemas.microsoft.com/office/drawing/2016/ink" xmlns:am3d="http://schemas.microsoft.com/office/drawing/2017/model3d" xmlns:o="urn:schemas-microsoft-com:office:office" xmlns:oel="http://schemas.microsoft.com/office/2019/extlst" xmlns:r="http://schemas.openxmlformats.org/officeDocument/2006/relationships" xmlns:m="http://schemas.openxmlformats.org/officeDocument/2006/math" xmlns:v="urn:schemas-microsoft-com:vml" xmlns:wp14="http://schemas.microsoft.com/office/word/2010/wordprocessingDrawing" xmlns:wp="http://schemas.openxmlformats.org/drawingml/2006/wordprocessingDrawing" xmlns:w10="urn:schemas-microsoft-com:office:word" xmlns:w="http://schemas.openxmlformats.org/wordprocessingml/2006/main" xmlns:w14="http://schemas.microsoft.com/office/word/2010/wordml" xmlns:w15="http://schemas.microsoft.com/office/word/2012/wordml" xmlns:w16cei="http://schemas.microsoft.com/office/word/2026/wordml/cei" xmlns:w16cex="http://schemas.microsoft.com/office/word/2018/wordml/cex" xmlns:w16cid="http://schemas.microsoft.com/office/word/2016/wordml/cid" xmlns:w16="http://schemas.microsoft.com/office/word/2018/wordml" xmlns:w16du="http://schemas.microsoft.com/office/word/2023/wordml/word16du" xmlns:w16sdtdh="http://schemas.microsoft.com/office/word/2020/wordml/sdtdatahash" xmlns:w16sdtfl="http://schemas.microsoft.com/office/word/2024/wordml/sdtformatlock" xmlns:w16se="http://schemas.microsoft.com/office/word/2015/wordml/symex" xmlns:wpg="http://schemas.microsoft.com/office/word/2010/wordprocessingGroup" xmlns:wpi="http://schemas.microsoft.com/office/word/2010/wordprocessingInk" xmlns:wne="http://schemas.microsoft.com/office/word/2006/wordml" xmlns:wps="http://schemas.microsoft.com/office/word/2010/wordprocessingShape" mc:Ignorable="w14 w15 w16se w16cid w16 w16cex w16sdtdh w16sdtfl w16du wp14">
   <w:endnote w:type="separator" w:id="-1">
     <w:p>
       <w:pPr>
@@ -20918,7 +22310,7 @@
 </file>
 
 <file path=word/footer1.xml><?xml version="1.0" encoding="utf-8"?>
-<w:ftr xmlns:wpc="http://schemas.microsoft.com/office/word/2010/wordprocessingCanvas" xmlns:cx="http://schemas.microsoft.com/office/drawing/2014/chartex" xmlns:cx1="http://schemas.microsoft.com/office/drawing/2015/9/8/chartex" xmlns:cx2="http://schemas.microsoft.com/office/drawing/2015/10/21/chartex" xmlns:cx3="http://schemas.microsoft.com/office/drawing/2016/5/9/chartex" xmlns:cx4="http://schemas.microsoft.com/office/drawing/2016/5/10/chartex" xmlns:cx5="http://schemas.microsoft.com/office/drawing/2016/5/11/chartex" xmlns:cx6="http://schemas.microsoft.com/office/drawing/2016/5/12/chartex" xmlns:cx7="http://schemas.microsoft.com/office/drawing/2016/5/13/chartex" xmlns:cx8="http://schemas.microsoft.com/office/drawing/2016/5/14/chartex" xmlns:mc="http://schemas.openxmlformats.org/markup-compatibility/2006" xmlns:aink="http://schemas.microsoft.com/office/drawing/2016/ink" xmlns:am3d="http://schemas.microsoft.com/office/drawing/2017/model3d" xmlns:o="urn:schemas-microsoft-com:office:office" xmlns:oel="http://schemas.microsoft.com/office/2019/extlst" xmlns:r="http://schemas.openxmlformats.org/officeDocument/2006/relationships" xmlns:m="http://schemas.openxmlformats.org/officeDocument/2006/math" xmlns:v="urn:schemas-microsoft-com:vml" xmlns:wp14="http://schemas.microsoft.com/office/word/2010/wordprocessingDrawing" xmlns:wp="http://schemas.openxmlformats.org/drawingml/2006/wordprocessingDrawing" xmlns:w10="urn:schemas-microsoft-com:office:word" xmlns:w="http://schemas.openxmlformats.org/wordprocessingml/2006/main" xmlns:w14="http://schemas.microsoft.com/office/word/2010/wordml" xmlns:w15="http://schemas.microsoft.com/office/word/2012/wordml" xmlns:w16cex="http://schemas.microsoft.com/office/word/2018/wordml/cex" xmlns:w16cid="http://schemas.microsoft.com/office/word/2016/wordml/cid" xmlns:w16="http://schemas.microsoft.com/office/word/2018/wordml" xmlns:w16du="http://schemas.microsoft.com/office/word/2023/wordml/word16du" xmlns:w16sdtdh="http://schemas.microsoft.com/office/word/2020/wordml/sdtdatahash" xmlns:w16sdtfl="http://schemas.microsoft.com/office/word/2024/wordml/sdtformatlock" xmlns:w16se="http://schemas.microsoft.com/office/word/2015/wordml/symex" xmlns:wpg="http://schemas.microsoft.com/office/word/2010/wordprocessingGroup" xmlns:wpi="http://schemas.microsoft.com/office/word/2010/wordprocessingInk" xmlns:wne="http://schemas.microsoft.com/office/word/2006/wordml" xmlns:wps="http://schemas.microsoft.com/office/word/2010/wordprocessingShape" mc:Ignorable="w14 w15 w16se w16cid w16 w16cex w16sdtdh w16sdtfl w16du wp14">
+<w:ftr xmlns:wpc="http://schemas.microsoft.com/office/word/2010/wordprocessingCanvas" xmlns:cx="http://schemas.microsoft.com/office/drawing/2014/chartex" xmlns:cx1="http://schemas.microsoft.com/office/drawing/2015/9/8/chartex" xmlns:cx2="http://schemas.microsoft.com/office/drawing/2015/10/21/chartex" xmlns:cx3="http://schemas.microsoft.com/office/drawing/2016/5/9/chartex" xmlns:cx4="http://schemas.microsoft.com/office/drawing/2016/5/10/chartex" xmlns:cx5="http://schemas.microsoft.com/office/drawing/2016/5/11/chartex" xmlns:cx6="http://schemas.microsoft.com/office/drawing/2016/5/12/chartex" xmlns:cx7="http://schemas.microsoft.com/office/drawing/2016/5/13/chartex" xmlns:cx8="http://schemas.microsoft.com/office/drawing/2016/5/14/chartex" xmlns:mc="http://schemas.openxmlformats.org/markup-compatibility/2006" xmlns:aink="http://schemas.microsoft.com/office/drawing/2016/ink" xmlns:am3d="http://schemas.microsoft.com/office/drawing/2017/model3d" xmlns:o="urn:schemas-microsoft-com:office:office" xmlns:oel="http://schemas.microsoft.com/office/2019/extlst" xmlns:r="http://schemas.openxmlformats.org/officeDocument/2006/relationships" xmlns:m="http://schemas.openxmlformats.org/officeDocument/2006/math" xmlns:v="urn:schemas-microsoft-com:vml" xmlns:wp14="http://schemas.microsoft.com/office/word/2010/wordprocessingDrawing" xmlns:wp="http://schemas.openxmlformats.org/drawingml/2006/wordprocessingDrawing" xmlns:w10="urn:schemas-microsoft-com:office:word" xmlns:w="http://schemas.openxmlformats.org/wordprocessingml/2006/main" xmlns:w14="http://schemas.microsoft.com/office/word/2010/wordml" xmlns:w15="http://schemas.microsoft.com/office/word/2012/wordml" xmlns:w16cei="http://schemas.microsoft.com/office/word/2026/wordml/cei" xmlns:w16cex="http://schemas.microsoft.com/office/word/2018/wordml/cex" xmlns:w16cid="http://schemas.microsoft.com/office/word/2016/wordml/cid" xmlns:w16="http://schemas.microsoft.com/office/word/2018/wordml" xmlns:w16du="http://schemas.microsoft.com/office/word/2023/wordml/word16du" xmlns:w16sdtdh="http://schemas.microsoft.com/office/word/2020/wordml/sdtdatahash" xmlns:w16sdtfl="http://schemas.microsoft.com/office/word/2024/wordml/sdtformatlock" xmlns:w16se="http://schemas.microsoft.com/office/word/2015/wordml/symex" xmlns:wpg="http://schemas.microsoft.com/office/word/2010/wordprocessingGroup" xmlns:wpi="http://schemas.microsoft.com/office/word/2010/wordprocessingInk" xmlns:wne="http://schemas.microsoft.com/office/word/2006/wordml" xmlns:wps="http://schemas.microsoft.com/office/word/2010/wordprocessingShape" mc:Ignorable="w14 w15 w16se w16cid w16 w16cex w16sdtdh w16sdtfl w16du wp14">
   <w:sdt>
     <w:sdtPr>
       <w:id w:val="707150234"/>
@@ -20971,7 +22363,7 @@
 </file>
 
 <file path=word/footnotes.xml><?xml version="1.0" encoding="utf-8"?>
-<w:footnotes xmlns:wpc="http://schemas.microsoft.com/office/word/2010/wordprocessingCanvas" xmlns:cx="http://schemas.microsoft.com/office/drawing/2014/chartex" xmlns:cx1="http://schemas.microsoft.com/office/drawing/2015/9/8/chartex" xmlns:cx2="http://schemas.microsoft.com/office/drawing/2015/10/21/chartex" xmlns:cx3="http://schemas.microsoft.com/office/drawing/2016/5/9/chartex" xmlns:cx4="http://schemas.microsoft.com/office/drawing/2016/5/10/chartex" xmlns:cx5="http://schemas.microsoft.com/office/drawing/2016/5/11/chartex" xmlns:cx6="http://schemas.microsoft.com/office/drawing/2016/5/12/chartex" xmlns:cx7="http://schemas.microsoft.com/office/drawing/2016/5/13/chartex" xmlns:cx8="http://schemas.microsoft.com/office/drawing/2016/5/14/chartex" xmlns:mc="http://schemas.openxmlformats.org/markup-compatibility/2006" xmlns:aink="http://schemas.microsoft.com/office/drawing/2016/ink" xmlns:am3d="http://schemas.microsoft.com/office/drawing/2017/model3d" xmlns:o="urn:schemas-microsoft-com:office:office" xmlns:oel="http://schemas.microsoft.com/office/2019/extlst" xmlns:r="http://schemas.openxmlformats.org/officeDocument/2006/relationships" xmlns:m="http://schemas.openxmlformats.org/officeDocument/2006/math" xmlns:v="urn:schemas-microsoft-com:vml" xmlns:wp14="http://schemas.microsoft.com/office/word/2010/wordprocessingDrawing" xmlns:wp="http://schemas.openxmlformats.org/drawingml/2006/wordprocessingDrawing" xmlns:w10="urn:schemas-microsoft-com:office:word" xmlns:w="http://schemas.openxmlformats.org/wordprocessingml/2006/main" xmlns:w14="http://schemas.microsoft.com/office/word/2010/wordml" xmlns:w15="http://schemas.microsoft.com/office/word/2012/wordml" xmlns:w16cex="http://schemas.microsoft.com/office/word/2018/wordml/cex" xmlns:w16cid="http://schemas.microsoft.com/office/word/2016/wordml/cid" xmlns:w16="http://schemas.microsoft.com/office/word/2018/wordml" xmlns:w16du="http://schemas.microsoft.com/office/word/2023/wordml/word16du" xmlns:w16sdtdh="http://schemas.microsoft.com/office/word/2020/wordml/sdtdatahash" xmlns:w16sdtfl="http://schemas.microsoft.com/office/word/2024/wordml/sdtformatlock" xmlns:w16se="http://schemas.microsoft.com/office/word/2015/wordml/symex" xmlns:wpg="http://schemas.microsoft.com/office/word/2010/wordprocessingGroup" xmlns:wpi="http://schemas.microsoft.com/office/word/2010/wordprocessingInk" xmlns:wne="http://schemas.microsoft.com/office/word/2006/wordml" xmlns:wps="http://schemas.microsoft.com/office/word/2010/wordprocessingShape" mc:Ignorable="w14 w15 w16se w16cid w16 w16cex w16sdtdh w16sdtfl w16du wp14">
+<w:footnotes xmlns:wpc="http://schemas.microsoft.com/office/word/2010/wordprocessingCanvas" xmlns:cx="http://schemas.microsoft.com/office/drawing/2014/chartex" xmlns:cx1="http://schemas.microsoft.com/office/drawing/2015/9/8/chartex" xmlns:cx2="http://schemas.microsoft.com/office/drawing/2015/10/21/chartex" xmlns:cx3="http://schemas.microsoft.com/office/drawing/2016/5/9/chartex" xmlns:cx4="http://schemas.microsoft.com/office/drawing/2016/5/10/chartex" xmlns:cx5="http://schemas.microsoft.com/office/drawing/2016/5/11/chartex" xmlns:cx6="http://schemas.microsoft.com/office/drawing/2016/5/12/chartex" xmlns:cx7="http://schemas.microsoft.com/office/drawing/2016/5/13/chartex" xmlns:cx8="http://schemas.microsoft.com/office/drawing/2016/5/14/chartex" xmlns:mc="http://schemas.openxmlformats.org/markup-compatibility/2006" xmlns:aink="http://schemas.microsoft.com/office/drawing/2016/ink" xmlns:am3d="http://schemas.microsoft.com/office/drawing/2017/model3d" xmlns:o="urn:schemas-microsoft-com:office:office" xmlns:oel="http://schemas.microsoft.com/office/2019/extlst" xmlns:r="http://schemas.openxmlformats.org/officeDocument/2006/relationships" xmlns:m="http://schemas.openxmlformats.org/officeDocument/2006/math" xmlns:v="urn:schemas-microsoft-com:vml" xmlns:wp14="http://schemas.microsoft.com/office/word/2010/wordprocessingDrawing" xmlns:wp="http://schemas.openxmlformats.org/drawingml/2006/wordprocessingDrawing" xmlns:w10="urn:schemas-microsoft-com:office:word" xmlns:w="http://schemas.openxmlformats.org/wordprocessingml/2006/main" xmlns:w14="http://schemas.microsoft.com/office/word/2010/wordml" xmlns:w15="http://schemas.microsoft.com/office/word/2012/wordml" xmlns:w16cei="http://schemas.microsoft.com/office/word/2026/wordml/cei" xmlns:w16cex="http://schemas.microsoft.com/office/word/2018/wordml/cex" xmlns:w16cid="http://schemas.microsoft.com/office/word/2016/wordml/cid" xmlns:w16="http://schemas.microsoft.com/office/word/2018/wordml" xmlns:w16du="http://schemas.microsoft.com/office/word/2023/wordml/word16du" xmlns:w16sdtdh="http://schemas.microsoft.com/office/word/2020/wordml/sdtdatahash" xmlns:w16sdtfl="http://schemas.microsoft.com/office/word/2024/wordml/sdtformatlock" xmlns:w16se="http://schemas.microsoft.com/office/word/2015/wordml/symex" xmlns:wpg="http://schemas.microsoft.com/office/word/2010/wordprocessingGroup" xmlns:wpi="http://schemas.microsoft.com/office/word/2010/wordprocessingInk" xmlns:wne="http://schemas.microsoft.com/office/word/2006/wordml" xmlns:wps="http://schemas.microsoft.com/office/word/2010/wordprocessingShape" mc:Ignorable="w14 w15 w16se w16cid w16 w16cex w16sdtdh w16sdtfl w16du wp14">
   <w:footnote w:type="separator" w:id="-1">
     <w:p>
       <w:pPr>
@@ -20996,7 +22388,7 @@
 </file>
 
 <file path=word/numbering.xml><?xml version="1.0" encoding="utf-8"?>
-<w:numbering xmlns:wpc="http://schemas.microsoft.com/office/word/2010/wordprocessingCanvas" xmlns:cx="http://schemas.microsoft.com/office/drawing/2014/chartex" xmlns:cx1="http://schemas.microsoft.com/office/drawing/2015/9/8/chartex" xmlns:cx2="http://schemas.microsoft.com/office/drawing/2015/10/21/chartex" xmlns:cx3="http://schemas.microsoft.com/office/drawing/2016/5/9/chartex" xmlns:cx4="http://schemas.microsoft.com/office/drawing/2016/5/10/chartex" xmlns:cx5="http://schemas.microsoft.com/office/drawing/2016/5/11/chartex" xmlns:cx6="http://schemas.microsoft.com/office/drawing/2016/5/12/chartex" xmlns:cx7="http://schemas.microsoft.com/office/drawing/2016/5/13/chartex" xmlns:cx8="http://schemas.microsoft.com/office/drawing/2016/5/14/chartex" xmlns:mc="http://schemas.openxmlformats.org/markup-compatibility/2006" xmlns:aink="http://schemas.microsoft.com/office/drawing/2016/ink" xmlns:am3d="http://schemas.microsoft.com/office/drawing/2017/model3d" xmlns:o="urn:schemas-microsoft-com:office:office" xmlns:oel="http://schemas.microsoft.com/office/2019/extlst" xmlns:r="http://schemas.openxmlformats.org/officeDocument/2006/relationships" xmlns:m="http://schemas.openxmlformats.org/officeDocument/2006/math" xmlns:v="urn:schemas-microsoft-com:vml" xmlns:wp14="http://schemas.microsoft.com/office/word/2010/wordprocessingDrawing" xmlns:wp="http://schemas.openxmlformats.org/drawingml/2006/wordprocessingDrawing" xmlns:w10="urn:schemas-microsoft-com:office:word" xmlns:w="http://schemas.openxmlformats.org/wordprocessingml/2006/main" xmlns:w14="http://schemas.microsoft.com/office/word/2010/wordml" xmlns:w15="http://schemas.microsoft.com/office/word/2012/wordml" xmlns:w16cex="http://schemas.microsoft.com/office/word/2018/wordml/cex" xmlns:w16cid="http://schemas.microsoft.com/office/word/2016/wordml/cid" xmlns:w16="http://schemas.microsoft.com/office/word/2018/wordml" xmlns:w16du="http://schemas.microsoft.com/office/word/2023/wordml/word16du" xmlns:w16sdtdh="http://schemas.microsoft.com/office/word/2020/wordml/sdtdatahash" xmlns:w16sdtfl="http://schemas.microsoft.com/office/word/2024/wordml/sdtformatlock" xmlns:w16se="http://schemas.microsoft.com/office/word/2015/wordml/symex" xmlns:wpg="http://schemas.microsoft.com/office/word/2010/wordprocessingGroup" xmlns:wpi="http://schemas.microsoft.com/office/word/2010/wordprocessingInk" xmlns:wne="http://schemas.microsoft.com/office/word/2006/wordml" xmlns:wps="http://schemas.microsoft.com/office/word/2010/wordprocessingShape" mc:Ignorable="w14 w15 w16se w16cid w16 w16cex w16sdtdh w16sdtfl w16du wp14">
+<w:numbering xmlns:wpc="http://schemas.microsoft.com/office/word/2010/wordprocessingCanvas" xmlns:cx="http://schemas.microsoft.com/office/drawing/2014/chartex" xmlns:cx1="http://schemas.microsoft.com/office/drawing/2015/9/8/chartex" xmlns:cx2="http://schemas.microsoft.com/office/drawing/2015/10/21/chartex" xmlns:cx3="http://schemas.microsoft.com/office/drawing/2016/5/9/chartex" xmlns:cx4="http://schemas.microsoft.com/office/drawing/2016/5/10/chartex" xmlns:cx5="http://schemas.microsoft.com/office/drawing/2016/5/11/chartex" xmlns:cx6="http://schemas.microsoft.com/office/drawing/2016/5/12/chartex" xmlns:cx7="http://schemas.microsoft.com/office/drawing/2016/5/13/chartex" xmlns:cx8="http://schemas.microsoft.com/office/drawing/2016/5/14/chartex" xmlns:mc="http://schemas.openxmlformats.org/markup-compatibility/2006" xmlns:aink="http://schemas.microsoft.com/office/drawing/2016/ink" xmlns:am3d="http://schemas.microsoft.com/office/drawing/2017/model3d" xmlns:o="urn:schemas-microsoft-com:office:office" xmlns:oel="http://schemas.microsoft.com/office/2019/extlst" xmlns:r="http://schemas.openxmlformats.org/officeDocument/2006/relationships" xmlns:m="http://schemas.openxmlformats.org/officeDocument/2006/math" xmlns:v="urn:schemas-microsoft-com:vml" xmlns:wp14="http://schemas.microsoft.com/office/word/2010/wordprocessingDrawing" xmlns:wp="http://schemas.openxmlformats.org/drawingml/2006/wordprocessingDrawing" xmlns:w10="urn:schemas-microsoft-com:office:word" xmlns:w="http://schemas.openxmlformats.org/wordprocessingml/2006/main" xmlns:w14="http://schemas.microsoft.com/office/word/2010/wordml" xmlns:w15="http://schemas.microsoft.com/office/word/2012/wordml" xmlns:w16cei="http://schemas.microsoft.com/office/word/2026/wordml/cei" xmlns:w16cex="http://schemas.microsoft.com/office/word/2018/wordml/cex" xmlns:w16cid="http://schemas.microsoft.com/office/word/2016/wordml/cid" xmlns:w16="http://schemas.microsoft.com/office/word/2018/wordml" xmlns:w16du="http://schemas.microsoft.com/office/word/2023/wordml/word16du" xmlns:w16sdtdh="http://schemas.microsoft.com/office/word/2020/wordml/sdtdatahash" xmlns:w16sdtfl="http://schemas.microsoft.com/office/word/2024/wordml/sdtformatlock" xmlns:w16se="http://schemas.microsoft.com/office/word/2015/wordml/symex" xmlns:wpg="http://schemas.microsoft.com/office/word/2010/wordprocessingGroup" xmlns:wpi="http://schemas.microsoft.com/office/word/2010/wordprocessingInk" xmlns:wne="http://schemas.microsoft.com/office/word/2006/wordml" xmlns:wps="http://schemas.microsoft.com/office/word/2010/wordprocessingShape" mc:Ignorable="w14 w15 w16se w16cid w16 w16cex w16sdtdh w16sdtfl w16du wp14">
   <w:abstractNum w:abstractNumId="0" w15:restartNumberingAfterBreak="0">
     <w:nsid w:val="308A503E"/>
     <w:multiLevelType w:val="multilevel"/>

</xml_diff>